<commit_message>
Update royal leaders layout: Place King Salman in the center card across all reports and presentations
</commit_message>
<xml_diff>
--- a/التقرير_الاحترافي_المطور/تقرير_جمعية_طبيبي_النصف_سنوي_٢٠٢٦_النسخة_التنفيذية.docx
+++ b/التقرير_الاحترافي_المطور/تقرير_جمعية_طبيبي_النصف_سنوي_٢٠٢٦_النسخة_التنفيذية.docx
@@ -2099,8 +2099,104 @@
             <w:r>
               <w:drawing>
                 <wp:inline xmlns:a="http://schemas.openxmlformats.org/drawingml/2006/main" xmlns:pic="http://schemas.openxmlformats.org/drawingml/2006/picture">
+                  <wp:extent cx="1280160" cy="1280160"/>
+                  <wp:docPr id="1" name="Picture 1"/>
+                  <wp:cNvGraphicFramePr>
+                    <a:graphicFrameLocks noChangeAspect="1"/>
+                  </wp:cNvGraphicFramePr>
+                  <a:graphic>
+                    <a:graphicData uri="http://schemas.openxmlformats.org/drawingml/2006/picture">
+                      <pic:pic>
+                        <pic:nvPicPr>
+                          <pic:cNvPr id="0" name="crown_prince.jpg"/>
+                          <pic:cNvPicPr/>
+                        </pic:nvPicPr>
+                        <pic:blipFill>
+                          <a:blip r:embed="rId9"/>
+                          <a:stretch>
+                            <a:fillRect/>
+                          </a:stretch>
+                        </pic:blipFill>
+                        <pic:spPr>
+                          <a:xfrm>
+                            <a:off x="0" y="0"/>
+                            <a:ext cx="1280160" cy="1280160"/>
+                          </a:xfrm>
+                          <a:prstGeom prst="rect"/>
+                        </pic:spPr>
+                      </pic:pic>
+                    </a:graphicData>
+                  </a:graphic>
+                </wp:inline>
+              </w:drawing>
+            </w:r>
+          </w:p>
+          <w:p>
+            <w:pPr>
+              <w:jc w:val="center"/>
+            </w:pPr>
+            <w:r>
+              <w:rPr>
+                <w:rFonts w:ascii="Cairo" w:hAnsi="Cairo"/>
+                <w:b/>
+                <w:i w:val="0"/>
+                <w:color w:val="541228"/>
+                <w:sz w:val="20"/>
+                <w:rtl/>
+                <w:rFonts w:ascii="Cairo" w:hAnsi="Cairo" w:cs="Cairo"/>
+              </w:rPr>
+              <w:br/>
+              <w:t>صاحب السمو الملكي</w:t>
+              <w:br/>
+              <w:t>الأمير محمد بن سلمان بن عبدالعزيز</w:t>
+              <w:br/>
+            </w:r>
+          </w:p>
+          <w:p>
+            <w:pPr>
+              <w:jc w:val="right"/>
+              <w:bidi/>
+            </w:pPr>
+            <w:r>
+              <w:rPr>
+                <w:rFonts w:ascii="Cairo" w:hAnsi="Cairo"/>
+                <w:b w:val="0"/>
+                <w:i/>
+                <w:color w:val="242220"/>
+                <w:sz w:val="18"/>
+                <w:rtl/>
+                <w:rFonts w:ascii="Cairo" w:hAnsi="Cairo" w:cs="Cairo"/>
+              </w:rPr>
+              <w:t>«نهدف للوصول إلى قطاع غير ربحي مهم، مبادر وداعم ومؤثر في التعليم والصحة والثقافة والمجالات البحثية، وسنعتمد عليه بشكل رئيسي.»</w:t>
+            </w:r>
+          </w:p>
+        </w:tc>
+        <w:tc>
+          <w:tcPr>
+            <w:tcW w:type="dxa" w:w="3456"/>
+            <w:shd w:val="clear" w:color="auto" w:fill="F9F7F2"/>
+            <w:tcMar>
+              <w:top w:w="140" w:type="dxa"/>
+              <w:bottom w:w="140" w:type="dxa"/>
+              <w:left w:w="120" w:type="dxa"/>
+              <w:right w:w="120" w:type="dxa"/>
+            </w:tcMar>
+            <w:tcBorders>
+              <w:top w:val="single" w:sz="6" w:space="0" w:color="C9A96E"/>
+              <w:left w:val="single" w:sz="6" w:space="0" w:color="C9A96E"/>
+              <w:bottom w:val="single" w:sz="6" w:space="0" w:color="C9A96E"/>
+              <w:right w:val="single" w:sz="6" w:space="0" w:color="C9A96E"/>
+            </w:tcBorders>
+          </w:tcPr>
+          <w:p>
+            <w:pPr>
+              <w:jc w:val="center"/>
+            </w:pPr>
+            <w:r>
+              <w:drawing>
+                <wp:inline xmlns:a="http://schemas.openxmlformats.org/drawingml/2006/main" xmlns:pic="http://schemas.openxmlformats.org/drawingml/2006/picture">
                   <wp:extent cx="1280160" cy="1585198"/>
-                  <wp:docPr id="1" name="Picture 1"/>
+                  <wp:docPr id="2" name="Picture 2"/>
                   <wp:cNvGraphicFramePr>
                     <a:graphicFrameLocks noChangeAspect="1"/>
                   </wp:cNvGraphicFramePr>
@@ -2112,7 +2208,7 @@
                           <pic:cNvPicPr/>
                         </pic:nvPicPr>
                         <pic:blipFill>
-                          <a:blip r:embed="rId9"/>
+                          <a:blip r:embed="rId10"/>
                           <a:stretch>
                             <a:fillRect/>
                           </a:stretch>
@@ -2168,102 +2264,6 @@
                 <w:rFonts w:ascii="Cairo" w:hAnsi="Cairo" w:cs="Cairo"/>
               </w:rPr>
               <w:t>«ما يميز هذه البلاد هو حرص قادتها على الخير والتشجيع عليه، وما نراه من مؤسسات خيرية في مختلف المجالات… إلا جانبًا من الجوانب المشرقة لبلادنا.»</w:t>
-            </w:r>
-          </w:p>
-        </w:tc>
-        <w:tc>
-          <w:tcPr>
-            <w:tcW w:type="dxa" w:w="3456"/>
-            <w:shd w:val="clear" w:color="auto" w:fill="F9F7F2"/>
-            <w:tcMar>
-              <w:top w:w="140" w:type="dxa"/>
-              <w:bottom w:w="140" w:type="dxa"/>
-              <w:left w:w="120" w:type="dxa"/>
-              <w:right w:w="120" w:type="dxa"/>
-            </w:tcMar>
-            <w:tcBorders>
-              <w:top w:val="single" w:sz="6" w:space="0" w:color="C9A96E"/>
-              <w:left w:val="single" w:sz="6" w:space="0" w:color="C9A96E"/>
-              <w:bottom w:val="single" w:sz="6" w:space="0" w:color="C9A96E"/>
-              <w:right w:val="single" w:sz="6" w:space="0" w:color="C9A96E"/>
-            </w:tcBorders>
-          </w:tcPr>
-          <w:p>
-            <w:pPr>
-              <w:jc w:val="center"/>
-            </w:pPr>
-            <w:r>
-              <w:drawing>
-                <wp:inline xmlns:a="http://schemas.openxmlformats.org/drawingml/2006/main" xmlns:pic="http://schemas.openxmlformats.org/drawingml/2006/picture">
-                  <wp:extent cx="1280160" cy="1280160"/>
-                  <wp:docPr id="2" name="Picture 2"/>
-                  <wp:cNvGraphicFramePr>
-                    <a:graphicFrameLocks noChangeAspect="1"/>
-                  </wp:cNvGraphicFramePr>
-                  <a:graphic>
-                    <a:graphicData uri="http://schemas.openxmlformats.org/drawingml/2006/picture">
-                      <pic:pic>
-                        <pic:nvPicPr>
-                          <pic:cNvPr id="0" name="crown_prince.jpg"/>
-                          <pic:cNvPicPr/>
-                        </pic:nvPicPr>
-                        <pic:blipFill>
-                          <a:blip r:embed="rId10"/>
-                          <a:stretch>
-                            <a:fillRect/>
-                          </a:stretch>
-                        </pic:blipFill>
-                        <pic:spPr>
-                          <a:xfrm>
-                            <a:off x="0" y="0"/>
-                            <a:ext cx="1280160" cy="1280160"/>
-                          </a:xfrm>
-                          <a:prstGeom prst="rect"/>
-                        </pic:spPr>
-                      </pic:pic>
-                    </a:graphicData>
-                  </a:graphic>
-                </wp:inline>
-              </w:drawing>
-            </w:r>
-          </w:p>
-          <w:p>
-            <w:pPr>
-              <w:jc w:val="center"/>
-            </w:pPr>
-            <w:r>
-              <w:rPr>
-                <w:rFonts w:ascii="Cairo" w:hAnsi="Cairo"/>
-                <w:b/>
-                <w:i w:val="0"/>
-                <w:color w:val="541228"/>
-                <w:sz w:val="20"/>
-                <w:rtl/>
-                <w:rFonts w:ascii="Cairo" w:hAnsi="Cairo" w:cs="Cairo"/>
-              </w:rPr>
-              <w:br/>
-              <w:t>صاحب السمو الملكي</w:t>
-              <w:br/>
-              <w:t>الأمير محمد بن سلمان بن عبدالعزيز</w:t>
-              <w:br/>
-            </w:r>
-          </w:p>
-          <w:p>
-            <w:pPr>
-              <w:jc w:val="right"/>
-              <w:bidi/>
-            </w:pPr>
-            <w:r>
-              <w:rPr>
-                <w:rFonts w:ascii="Cairo" w:hAnsi="Cairo"/>
-                <w:b w:val="0"/>
-                <w:i/>
-                <w:color w:val="242220"/>
-                <w:sz w:val="18"/>
-                <w:rtl/>
-                <w:rFonts w:ascii="Cairo" w:hAnsi="Cairo" w:cs="Cairo"/>
-              </w:rPr>
-              <w:t>«نهدف للوصول إلى قطاع غير ربحي مهم، مبادر وداعم ومؤثر في التعليم والصحة والثقافة والمجالات البحثية، وسنعتمد عليه بشكل رئيسي.»</w:t>
             </w:r>
           </w:p>
         </w:tc>

</xml_diff>

<commit_message>
Remove Appendix 2 (member receivables) and renumber fixed assets appendix across all reports
</commit_message>
<xml_diff>
--- a/التقرير_الاحترافي_المطور/تقرير_جمعية_طبيبي_النصف_سنوي_٢٠٢٦_النسخة_التنفيذية.docx
+++ b/التقرير_الاحترافي_المطور/تقرير_جمعية_طبيبي_النصف_سنوي_٢٠٢٦_النسخة_التنفيذية.docx
@@ -1840,7 +1840,7 @@
                 <w:rtl/>
                 <w:rFonts w:ascii="Cairo" w:hAnsi="Cairo" w:cs="Cairo"/>
               </w:rPr>
-              <w:t>ملحق الذمم والأصول الثابتة</w:t>
+              <w:t>ملحق الأصول والتجهيزات</w:t>
             </w:r>
           </w:p>
         </w:tc>
@@ -1871,7 +1871,7 @@
                 <w:rtl/>
                 <w:rFonts w:ascii="Cairo" w:hAnsi="Cairo" w:cs="Cairo"/>
               </w:rPr>
-              <w:t>الملحق (٢): ذمم العضوية | الملحق (٣): الأصول الثابتة المشتراة</w:t>
+              <w:t>الملحق (٢): بيان الأصول والتجهيزات الثابتة المشتراة لعام ٢٠٢٦م</w:t>
             </w:r>
           </w:p>
         </w:tc>
@@ -17585,562 +17585,7 @@
           <w:rtl/>
           <w:rFonts w:ascii="Cairo" w:hAnsi="Cairo" w:cs="Cairo"/>
         </w:rPr>
-        <w:t>الملحق (٢): الذمم المدينة لاشتراكات العضوية (١٢,٠٠٠ ريال)</w:t>
-      </w:r>
-    </w:p>
-    <w:tbl>
-      <w:tblPr>
-        <w:tblW w:type="auto" w:w="0"/>
-        <w:jc w:val="center"/>
-        <w:tblLook w:firstColumn="1" w:firstRow="1" w:lastColumn="0" w:lastRow="0" w:noHBand="0" w:noVBand="1" w:val="04A0"/>
-        <w:tblBorders>
-          <w:top w:val="single" w:sz="4" w:space="0" w:color="E0DDD5"/>
-          <w:bottom w:val="single" w:sz="4" w:space="0" w:color="E0DDD5"/>
-          <w:insideH w:val="single" w:sz="4" w:space="0" w:color="EFECE6"/>
-          <w:left w:val="none"/>
-          <w:right w:val="none"/>
-          <w:insideV w:val="none"/>
-        </w:tblBorders>
-      </w:tblPr>
-      <w:tblGrid>
-        <w:gridCol w:w="4896"/>
-        <w:gridCol w:w="4896"/>
-      </w:tblGrid>
-      <w:tr>
-        <w:tc>
-          <w:tcPr>
-            <w:tcW w:type="dxa" w:w="5184"/>
-            <w:shd w:val="clear" w:color="auto" w:fill="541228"/>
-            <w:tcMar>
-              <w:top w:w="130" w:type="dxa"/>
-              <w:bottom w:w="130" w:type="dxa"/>
-              <w:left w:w="150" w:type="dxa"/>
-              <w:right w:w="150" w:type="dxa"/>
-            </w:tcMar>
-          </w:tcPr>
-          <w:p>
-            <w:pPr>
-              <w:jc w:val="right"/>
-              <w:bidi/>
-            </w:pPr>
-            <w:r/>
-            <w:r>
-              <w:rPr>
-                <w:rFonts w:ascii="Cairo" w:hAnsi="Cairo"/>
-                <w:b/>
-                <w:i w:val="0"/>
-                <w:color w:val="FFFFFF"/>
-                <w:sz w:val="20"/>
-                <w:rtl/>
-                <w:rFonts w:ascii="Cairo" w:hAnsi="Cairo" w:cs="Cairo"/>
-              </w:rPr>
-              <w:t>أعضاء اشتراك ٢٠٢٦م غير مسدد (١,٠٠٠ ر.س)</w:t>
-            </w:r>
-          </w:p>
-        </w:tc>
-        <w:tc>
-          <w:tcPr>
-            <w:tcW w:type="dxa" w:w="5184"/>
-            <w:shd w:val="clear" w:color="auto" w:fill="541228"/>
-            <w:tcMar>
-              <w:top w:w="130" w:type="dxa"/>
-              <w:bottom w:w="130" w:type="dxa"/>
-              <w:left w:w="150" w:type="dxa"/>
-              <w:right w:w="150" w:type="dxa"/>
-            </w:tcMar>
-          </w:tcPr>
-          <w:p>
-            <w:pPr>
-              <w:jc w:val="right"/>
-              <w:bidi/>
-            </w:pPr>
-            <w:r/>
-            <w:r>
-              <w:rPr>
-                <w:rFonts w:ascii="Cairo" w:hAnsi="Cairo"/>
-                <w:b/>
-                <w:i w:val="0"/>
-                <w:color w:val="FFFFFF"/>
-                <w:sz w:val="20"/>
-                <w:rtl/>
-                <w:rFonts w:ascii="Cairo" w:hAnsi="Cairo" w:cs="Cairo"/>
-              </w:rPr>
-              <w:t>أعضاء اشتراك ٢٠٢٥م غير مسدد (١,٠٠٠ ر.س)</w:t>
-            </w:r>
-          </w:p>
-        </w:tc>
-      </w:tr>
-      <w:tr>
-        <w:tc>
-          <w:tcPr>
-            <w:tcW w:type="dxa" w:w="5184"/>
-            <w:shd w:val="clear" w:color="auto" w:fill="FFFFFF"/>
-            <w:tcMar>
-              <w:top w:w="110" w:type="dxa"/>
-              <w:bottom w:w="110" w:type="dxa"/>
-              <w:left w:w="130" w:type="dxa"/>
-              <w:right w:w="130" w:type="dxa"/>
-            </w:tcMar>
-          </w:tcPr>
-          <w:p>
-            <w:pPr>
-              <w:jc w:val="right"/>
-              <w:bidi/>
-            </w:pPr>
-            <w:r/>
-            <w:r>
-              <w:rPr>
-                <w:rFonts w:ascii="Cairo" w:hAnsi="Cairo"/>
-                <w:b/>
-                <w:i w:val="0"/>
-                <w:color w:val="242220"/>
-                <w:sz w:val="19"/>
-                <w:rtl/>
-                <w:rFonts w:ascii="Cairo" w:hAnsi="Cairo" w:cs="Cairo"/>
-              </w:rPr>
-              <w:t>عبدالرحمن بن نبيل حمودة</w:t>
-            </w:r>
-          </w:p>
-        </w:tc>
-        <w:tc>
-          <w:tcPr>
-            <w:tcW w:type="dxa" w:w="5184"/>
-            <w:shd w:val="clear" w:color="auto" w:fill="FFFFFF"/>
-            <w:tcMar>
-              <w:top w:w="110" w:type="dxa"/>
-              <w:bottom w:w="110" w:type="dxa"/>
-              <w:left w:w="130" w:type="dxa"/>
-              <w:right w:w="130" w:type="dxa"/>
-            </w:tcMar>
-          </w:tcPr>
-          <w:p>
-            <w:pPr>
-              <w:jc w:val="right"/>
-              <w:bidi/>
-            </w:pPr>
-            <w:r/>
-            <w:r>
-              <w:rPr>
-                <w:rFonts w:ascii="Cairo" w:hAnsi="Cairo"/>
-                <w:b w:val="0"/>
-                <w:i w:val="0"/>
-                <w:color w:val="242220"/>
-                <w:sz w:val="19"/>
-                <w:rtl/>
-                <w:rFonts w:ascii="Cairo" w:hAnsi="Cairo" w:cs="Cairo"/>
-              </w:rPr>
-              <w:t>أحمد بن صالح المزيني</w:t>
-            </w:r>
-          </w:p>
-        </w:tc>
-      </w:tr>
-      <w:tr>
-        <w:tc>
-          <w:tcPr>
-            <w:tcW w:type="dxa" w:w="5184"/>
-            <w:shd w:val="clear" w:color="auto" w:fill="F8F6F0"/>
-            <w:tcMar>
-              <w:top w:w="110" w:type="dxa"/>
-              <w:bottom w:w="110" w:type="dxa"/>
-              <w:left w:w="130" w:type="dxa"/>
-              <w:right w:w="130" w:type="dxa"/>
-            </w:tcMar>
-          </w:tcPr>
-          <w:p>
-            <w:pPr>
-              <w:jc w:val="right"/>
-              <w:bidi/>
-            </w:pPr>
-            <w:r/>
-            <w:r>
-              <w:rPr>
-                <w:rFonts w:ascii="Cairo" w:hAnsi="Cairo"/>
-                <w:b/>
-                <w:i w:val="0"/>
-                <w:color w:val="242220"/>
-                <w:sz w:val="19"/>
-                <w:rtl/>
-                <w:rFonts w:ascii="Cairo" w:hAnsi="Cairo" w:cs="Cairo"/>
-              </w:rPr>
-              <w:t>محمد بن مسلم الجهني</w:t>
-            </w:r>
-          </w:p>
-        </w:tc>
-        <w:tc>
-          <w:tcPr>
-            <w:tcW w:type="dxa" w:w="5184"/>
-            <w:shd w:val="clear" w:color="auto" w:fill="F8F6F0"/>
-            <w:tcMar>
-              <w:top w:w="110" w:type="dxa"/>
-              <w:bottom w:w="110" w:type="dxa"/>
-              <w:left w:w="130" w:type="dxa"/>
-              <w:right w:w="130" w:type="dxa"/>
-            </w:tcMar>
-          </w:tcPr>
-          <w:p>
-            <w:pPr>
-              <w:jc w:val="right"/>
-              <w:bidi/>
-            </w:pPr>
-            <w:r/>
-            <w:r>
-              <w:rPr>
-                <w:rFonts w:ascii="Cairo" w:hAnsi="Cairo"/>
-                <w:b w:val="0"/>
-                <w:i w:val="0"/>
-                <w:color w:val="242220"/>
-                <w:sz w:val="19"/>
-                <w:rtl/>
-                <w:rFonts w:ascii="Cairo" w:hAnsi="Cairo" w:cs="Cairo"/>
-              </w:rPr>
-              <w:t>خالد بن محمد غليلة</w:t>
-            </w:r>
-          </w:p>
-        </w:tc>
-      </w:tr>
-      <w:tr>
-        <w:tc>
-          <w:tcPr>
-            <w:tcW w:type="dxa" w:w="5184"/>
-            <w:shd w:val="clear" w:color="auto" w:fill="FFFFFF"/>
-            <w:tcMar>
-              <w:top w:w="110" w:type="dxa"/>
-              <w:bottom w:w="110" w:type="dxa"/>
-              <w:left w:w="130" w:type="dxa"/>
-              <w:right w:w="130" w:type="dxa"/>
-            </w:tcMar>
-          </w:tcPr>
-          <w:p>
-            <w:pPr>
-              <w:jc w:val="right"/>
-              <w:bidi/>
-            </w:pPr>
-            <w:r/>
-            <w:r>
-              <w:rPr>
-                <w:rFonts w:ascii="Cairo" w:hAnsi="Cairo"/>
-                <w:b/>
-                <w:i w:val="0"/>
-                <w:color w:val="242220"/>
-                <w:sz w:val="19"/>
-                <w:rtl/>
-                <w:rFonts w:ascii="Cairo" w:hAnsi="Cairo" w:cs="Cairo"/>
-              </w:rPr>
-              <w:t>عبدالغني بن مروان أحمد</w:t>
-            </w:r>
-          </w:p>
-        </w:tc>
-        <w:tc>
-          <w:tcPr>
-            <w:tcW w:type="dxa" w:w="5184"/>
-            <w:shd w:val="clear" w:color="auto" w:fill="FFFFFF"/>
-            <w:tcMar>
-              <w:top w:w="110" w:type="dxa"/>
-              <w:bottom w:w="110" w:type="dxa"/>
-              <w:left w:w="130" w:type="dxa"/>
-              <w:right w:w="130" w:type="dxa"/>
-            </w:tcMar>
-          </w:tcPr>
-          <w:p>
-            <w:pPr>
-              <w:jc w:val="right"/>
-              <w:bidi/>
-            </w:pPr>
-            <w:r/>
-            <w:r>
-              <w:rPr>
-                <w:rFonts w:ascii="Cairo" w:hAnsi="Cairo"/>
-                <w:b w:val="0"/>
-                <w:i w:val="0"/>
-                <w:color w:val="242220"/>
-                <w:sz w:val="19"/>
-                <w:rtl/>
-                <w:rFonts w:ascii="Cairo" w:hAnsi="Cairo" w:cs="Cairo"/>
-              </w:rPr>
-              <w:t>رهيد بنت وائل راجح</w:t>
-            </w:r>
-          </w:p>
-        </w:tc>
-      </w:tr>
-      <w:tr>
-        <w:tc>
-          <w:tcPr>
-            <w:tcW w:type="dxa" w:w="5184"/>
-            <w:shd w:val="clear" w:color="auto" w:fill="F8F6F0"/>
-            <w:tcMar>
-              <w:top w:w="110" w:type="dxa"/>
-              <w:bottom w:w="110" w:type="dxa"/>
-              <w:left w:w="130" w:type="dxa"/>
-              <w:right w:w="130" w:type="dxa"/>
-            </w:tcMar>
-          </w:tcPr>
-          <w:p>
-            <w:pPr>
-              <w:jc w:val="right"/>
-              <w:bidi/>
-            </w:pPr>
-            <w:r/>
-            <w:r>
-              <w:rPr>
-                <w:rFonts w:ascii="Cairo" w:hAnsi="Cairo"/>
-                <w:b/>
-                <w:i w:val="0"/>
-                <w:color w:val="242220"/>
-                <w:sz w:val="19"/>
-                <w:rtl/>
-                <w:rFonts w:ascii="Cairo" w:hAnsi="Cairo" w:cs="Cairo"/>
-              </w:rPr>
-              <w:t>منذر بن سعيد غنيم</w:t>
-            </w:r>
-          </w:p>
-        </w:tc>
-        <w:tc>
-          <w:tcPr>
-            <w:tcW w:type="dxa" w:w="5184"/>
-            <w:shd w:val="clear" w:color="auto" w:fill="F8F6F0"/>
-            <w:tcMar>
-              <w:top w:w="110" w:type="dxa"/>
-              <w:bottom w:w="110" w:type="dxa"/>
-              <w:left w:w="130" w:type="dxa"/>
-              <w:right w:w="130" w:type="dxa"/>
-            </w:tcMar>
-          </w:tcPr>
-          <w:p>
-            <w:pPr>
-              <w:jc w:val="right"/>
-              <w:bidi/>
-            </w:pPr>
-            <w:r/>
-            <w:r>
-              <w:rPr>
-                <w:rFonts w:ascii="Cairo" w:hAnsi="Cairo"/>
-                <w:b w:val="0"/>
-                <w:i w:val="0"/>
-                <w:color w:val="242220"/>
-                <w:sz w:val="19"/>
-                <w:rtl/>
-                <w:rFonts w:ascii="Cairo" w:hAnsi="Cairo" w:cs="Cairo"/>
-              </w:rPr>
-              <w:t>عمار بن توفيق الحربي</w:t>
-            </w:r>
-          </w:p>
-        </w:tc>
-      </w:tr>
-      <w:tr>
-        <w:tc>
-          <w:tcPr>
-            <w:tcW w:type="dxa" w:w="5184"/>
-            <w:shd w:val="clear" w:color="auto" w:fill="FFFFFF"/>
-            <w:tcMar>
-              <w:top w:w="110" w:type="dxa"/>
-              <w:bottom w:w="110" w:type="dxa"/>
-              <w:left w:w="130" w:type="dxa"/>
-              <w:right w:w="130" w:type="dxa"/>
-            </w:tcMar>
-          </w:tcPr>
-          <w:p>
-            <w:pPr>
-              <w:jc w:val="right"/>
-              <w:bidi/>
-            </w:pPr>
-            <w:r/>
-            <w:r>
-              <w:rPr>
-                <w:rFonts w:ascii="Cairo" w:hAnsi="Cairo"/>
-                <w:b/>
-                <w:i w:val="0"/>
-                <w:color w:val="242220"/>
-                <w:sz w:val="19"/>
-                <w:rtl/>
-                <w:rFonts w:ascii="Cairo" w:hAnsi="Cairo" w:cs="Cairo"/>
-              </w:rPr>
-              <w:t>محمد بن مروان أحمد</w:t>
-            </w:r>
-          </w:p>
-        </w:tc>
-        <w:tc>
-          <w:tcPr>
-            <w:tcW w:type="dxa" w:w="5184"/>
-            <w:shd w:val="clear" w:color="auto" w:fill="FFFFFF"/>
-            <w:tcMar>
-              <w:top w:w="110" w:type="dxa"/>
-              <w:bottom w:w="110" w:type="dxa"/>
-              <w:left w:w="130" w:type="dxa"/>
-              <w:right w:w="130" w:type="dxa"/>
-            </w:tcMar>
-          </w:tcPr>
-          <w:p>
-            <w:pPr>
-              <w:jc w:val="right"/>
-              <w:bidi/>
-            </w:pPr>
-            <w:r/>
-            <w:r>
-              <w:rPr>
-                <w:rFonts w:ascii="Cairo" w:hAnsi="Cairo"/>
-                <w:b w:val="0"/>
-                <w:i w:val="0"/>
-                <w:color w:val="242220"/>
-                <w:sz w:val="19"/>
-                <w:rtl/>
-                <w:rFonts w:ascii="Cairo" w:hAnsi="Cairo" w:cs="Cairo"/>
-              </w:rPr>
-              <w:t>خالد بن عواض العوفي</w:t>
-            </w:r>
-          </w:p>
-        </w:tc>
-      </w:tr>
-      <w:tr>
-        <w:tc>
-          <w:tcPr>
-            <w:tcW w:type="dxa" w:w="5184"/>
-            <w:shd w:val="clear" w:color="auto" w:fill="F8F6F0"/>
-            <w:tcMar>
-              <w:top w:w="110" w:type="dxa"/>
-              <w:bottom w:w="110" w:type="dxa"/>
-              <w:left w:w="130" w:type="dxa"/>
-              <w:right w:w="130" w:type="dxa"/>
-            </w:tcMar>
-          </w:tcPr>
-          <w:p>
-            <w:pPr>
-              <w:jc w:val="right"/>
-              <w:bidi/>
-            </w:pPr>
-            <w:r/>
-            <w:r>
-              <w:rPr>
-                <w:rFonts w:ascii="Cairo" w:hAnsi="Cairo"/>
-                <w:b/>
-                <w:i w:val="0"/>
-                <w:color w:val="242220"/>
-                <w:sz w:val="19"/>
-                <w:rtl/>
-                <w:rFonts w:ascii="Cairo" w:hAnsi="Cairo" w:cs="Cairo"/>
-              </w:rPr>
-              <w:t>ريان بن محمد القاداني</w:t>
-            </w:r>
-          </w:p>
-        </w:tc>
-        <w:tc>
-          <w:tcPr>
-            <w:tcW w:type="dxa" w:w="5184"/>
-            <w:shd w:val="clear" w:color="auto" w:fill="F8F6F0"/>
-            <w:tcMar>
-              <w:top w:w="110" w:type="dxa"/>
-              <w:bottom w:w="110" w:type="dxa"/>
-              <w:left w:w="130" w:type="dxa"/>
-              <w:right w:w="130" w:type="dxa"/>
-            </w:tcMar>
-          </w:tcPr>
-          <w:p>
-            <w:pPr>
-              <w:jc w:val="right"/>
-              <w:bidi/>
-            </w:pPr>
-            <w:r/>
-            <w:r>
-              <w:rPr>
-                <w:rFonts w:ascii="Cairo" w:hAnsi="Cairo"/>
-                <w:b w:val="0"/>
-                <w:i w:val="0"/>
-                <w:color w:val="242220"/>
-                <w:sz w:val="19"/>
-                <w:rtl/>
-                <w:rFonts w:ascii="Cairo" w:hAnsi="Cairo" w:cs="Cairo"/>
-              </w:rPr>
-              <w:t>عبدالمحسن بن معيض الحربي</w:t>
-            </w:r>
-          </w:p>
-        </w:tc>
-      </w:tr>
-      <w:tr>
-        <w:tc>
-          <w:tcPr>
-            <w:tcW w:type="dxa" w:w="5184"/>
-            <w:shd w:val="clear" w:color="auto" w:fill="F2ECE1"/>
-            <w:tcMar>
-              <w:top w:w="110" w:type="dxa"/>
-              <w:bottom w:w="110" w:type="dxa"/>
-              <w:left w:w="130" w:type="dxa"/>
-              <w:right w:w="130" w:type="dxa"/>
-            </w:tcMar>
-          </w:tcPr>
-          <w:p>
-            <w:pPr>
-              <w:jc w:val="right"/>
-              <w:bidi/>
-            </w:pPr>
-            <w:r/>
-            <w:r>
-              <w:rPr>
-                <w:rFonts w:ascii="Cairo" w:hAnsi="Cairo"/>
-                <w:b/>
-                <w:i w:val="0"/>
-                <w:color w:val="541228"/>
-                <w:sz w:val="19"/>
-                <w:rtl/>
-                <w:rFonts w:ascii="Cairo" w:hAnsi="Cairo" w:cs="Cairo"/>
-              </w:rPr>
-              <w:t>إجمالي ذمم ٢٠٢٦م: ٦,٠٠٠ ريال</w:t>
-            </w:r>
-          </w:p>
-        </w:tc>
-        <w:tc>
-          <w:tcPr>
-            <w:tcW w:type="dxa" w:w="5184"/>
-            <w:shd w:val="clear" w:color="auto" w:fill="F2ECE1"/>
-            <w:tcMar>
-              <w:top w:w="110" w:type="dxa"/>
-              <w:bottom w:w="110" w:type="dxa"/>
-              <w:left w:w="130" w:type="dxa"/>
-              <w:right w:w="130" w:type="dxa"/>
-            </w:tcMar>
-          </w:tcPr>
-          <w:p>
-            <w:pPr>
-              <w:jc w:val="right"/>
-              <w:bidi/>
-            </w:pPr>
-            <w:r/>
-            <w:r>
-              <w:rPr>
-                <w:rFonts w:ascii="Cairo" w:hAnsi="Cairo"/>
-                <w:b/>
-                <w:i w:val="0"/>
-                <w:color w:val="541228"/>
-                <w:sz w:val="19"/>
-                <w:rtl/>
-                <w:rFonts w:ascii="Cairo" w:hAnsi="Cairo" w:cs="Cairo"/>
-              </w:rPr>
-              <w:t>إجمالي ذمم ٢٠٢٥م: ٦,٠٠٠ ريال</w:t>
-            </w:r>
-          </w:p>
-        </w:tc>
-      </w:tr>
-    </w:tbl>
-    <w:p>
-      <w:pPr>
-        <w:spacing w:after="120"/>
-      </w:pPr>
-    </w:p>
-    <w:p>
-      <w:pPr>
-        <w:spacing w:before="280" w:after="120"/>
-        <w:jc w:val="right"/>
-        <w:bidi/>
-      </w:pPr>
-      <w:r>
-        <w:rPr>
-          <w:rFonts w:ascii="Cairo" w:hAnsi="Cairo"/>
-          <w:b/>
-          <w:i w:val="0"/>
-          <w:color w:val="541228"/>
-          <w:sz w:val="26"/>
-          <w:rtl/>
-          <w:rFonts w:ascii="Cairo" w:hAnsi="Cairo" w:cs="Cairo"/>
-        </w:rPr>
-        <w:t>الملحق (٣): بيان الأصول الثابتة المشتراة لعام ٢٠٢٦م (١٥,٦٢٠.٨٠ ريال)</w:t>
+        <w:t>الملحق (٢): بيان الأصول والتجهيزات الثابتة المشتراة لعام ٢٠٢٦م (١٥,٦٢٠.٨٠ ريال)</w:t>
       </w:r>
     </w:p>
     <w:tbl>

</xml_diff>

<commit_message>
Update footer background with royal Burgundy gradient and gold accent
</commit_message>
<xml_diff>
--- a/التقرير_الاحترافي_المطور/تقرير_جمعية_طبيبي_النصف_سنوي_٢٠٢٦_النسخة_التنفيذية.docx
+++ b/التقرير_الاحترافي_المطور/تقرير_جمعية_طبيبي_النصف_سنوي_٢٠٢٦_النسخة_التنفيذية.docx
@@ -156,16 +156,7 @@
           <w:sz w:val="21"/>
           <w:rtl/>
         </w:rPr>
-        <w:t xml:space="preserve">إعداد </w:t>
-      </w:r>
-      <w:r>
-        <w:rPr>
-          <w:rFonts w:ascii="Cairo" w:hAnsi="Cairo" w:cs="Cairo"/>
-          <w:color w:val="242220"/>
-          <w:sz w:val="21"/>
-          <w:rtl/>
-        </w:rPr>
-        <w:t>والإشراف التنفيذي:</w:t>
+        <w:t>إعداد والإشراف التنفيذي:</w:t>
       </w:r>
       <w:r>
         <w:rPr>
@@ -297,7 +288,7 @@
               <w:bidi/>
               <w:jc w:val="right"/>
               <w:rPr>
-                <w:rFonts w:ascii="Cairo" w:hAnsi="Cairo" w:cs="Cairo"/>
+                <w:rFonts w:ascii="Cairo" w:hAnsi="Cairo" w:cs="Cairo" w:hint="eastAsia"/>
                 <w:b/>
                 <w:color w:val="FFFFFF"/>
                 <w:sz w:val="20"/>
@@ -413,7 +404,7 @@
               <w:bidi/>
               <w:jc w:val="right"/>
               <w:rPr>
-                <w:rFonts w:ascii="Cairo" w:hAnsi="Cairo" w:cs="Cairo"/>
+                <w:rFonts w:ascii="Cairo" w:hAnsi="Cairo" w:cs="Cairo" w:hint="eastAsia"/>
                 <w:color w:val="242220"/>
                 <w:sz w:val="19"/>
                 <w:rtl/>
@@ -527,7 +518,7 @@
               <w:bidi/>
               <w:jc w:val="right"/>
               <w:rPr>
-                <w:rFonts w:ascii="Cairo" w:hAnsi="Cairo" w:cs="Cairo"/>
+                <w:rFonts w:ascii="Cairo" w:hAnsi="Cairo" w:cs="Cairo" w:hint="eastAsia"/>
                 <w:color w:val="242220"/>
                 <w:sz w:val="19"/>
                 <w:rtl/>
@@ -641,7 +632,7 @@
               <w:bidi/>
               <w:jc w:val="right"/>
               <w:rPr>
-                <w:rFonts w:ascii="Cairo" w:hAnsi="Cairo" w:cs="Cairo"/>
+                <w:rFonts w:ascii="Cairo" w:hAnsi="Cairo" w:cs="Cairo" w:hint="eastAsia"/>
                 <w:color w:val="242220"/>
                 <w:sz w:val="19"/>
                 <w:rtl/>
@@ -755,7 +746,7 @@
               <w:bidi/>
               <w:jc w:val="right"/>
               <w:rPr>
-                <w:rFonts w:ascii="Cairo" w:hAnsi="Cairo" w:cs="Cairo"/>
+                <w:rFonts w:ascii="Cairo" w:hAnsi="Cairo" w:cs="Cairo" w:hint="eastAsia"/>
                 <w:color w:val="242220"/>
                 <w:sz w:val="19"/>
                 <w:rtl/>
@@ -869,7 +860,7 @@
               <w:bidi/>
               <w:jc w:val="right"/>
               <w:rPr>
-                <w:rFonts w:ascii="Cairo" w:hAnsi="Cairo" w:cs="Cairo"/>
+                <w:rFonts w:ascii="Cairo" w:hAnsi="Cairo" w:cs="Cairo" w:hint="eastAsia"/>
                 <w:color w:val="242220"/>
                 <w:sz w:val="19"/>
                 <w:rtl/>
@@ -983,7 +974,7 @@
               <w:bidi/>
               <w:jc w:val="right"/>
               <w:rPr>
-                <w:rFonts w:ascii="Cairo" w:hAnsi="Cairo" w:cs="Cairo"/>
+                <w:rFonts w:ascii="Cairo" w:hAnsi="Cairo" w:cs="Cairo" w:hint="eastAsia"/>
                 <w:color w:val="242220"/>
                 <w:sz w:val="19"/>
                 <w:rtl/>
@@ -1097,7 +1088,7 @@
               <w:bidi/>
               <w:jc w:val="right"/>
               <w:rPr>
-                <w:rFonts w:ascii="Cairo" w:hAnsi="Cairo" w:cs="Cairo"/>
+                <w:rFonts w:ascii="Cairo" w:hAnsi="Cairo" w:cs="Cairo" w:hint="eastAsia"/>
                 <w:color w:val="242220"/>
                 <w:sz w:val="19"/>
                 <w:rtl/>
@@ -1211,7 +1202,7 @@
               <w:bidi/>
               <w:jc w:val="right"/>
               <w:rPr>
-                <w:rFonts w:ascii="Cairo" w:hAnsi="Cairo" w:cs="Cairo"/>
+                <w:rFonts w:ascii="Cairo" w:hAnsi="Cairo" w:cs="Cairo" w:hint="eastAsia"/>
                 <w:color w:val="242220"/>
                 <w:sz w:val="19"/>
                 <w:rtl/>
@@ -1325,7 +1316,7 @@
               <w:bidi/>
               <w:jc w:val="right"/>
               <w:rPr>
-                <w:rFonts w:ascii="Cairo" w:hAnsi="Cairo" w:cs="Cairo"/>
+                <w:rFonts w:ascii="Cairo" w:hAnsi="Cairo" w:cs="Cairo" w:hint="eastAsia"/>
                 <w:color w:val="242220"/>
                 <w:sz w:val="19"/>
                 <w:rtl/>
@@ -1439,7 +1430,7 @@
               <w:bidi/>
               <w:jc w:val="right"/>
               <w:rPr>
-                <w:rFonts w:ascii="Cairo" w:hAnsi="Cairo" w:cs="Cairo"/>
+                <w:rFonts w:ascii="Cairo" w:hAnsi="Cairo" w:cs="Cairo" w:hint="eastAsia"/>
                 <w:color w:val="242220"/>
                 <w:sz w:val="19"/>
                 <w:rtl/>
@@ -1553,7 +1544,7 @@
               <w:bidi/>
               <w:jc w:val="right"/>
               <w:rPr>
-                <w:rFonts w:ascii="Cairo" w:hAnsi="Cairo" w:cs="Cairo"/>
+                <w:rFonts w:ascii="Cairo" w:hAnsi="Cairo" w:cs="Cairo" w:hint="eastAsia"/>
                 <w:color w:val="242220"/>
                 <w:sz w:val="19"/>
                 <w:rtl/>
@@ -1667,7 +1658,7 @@
               <w:bidi/>
               <w:jc w:val="right"/>
               <w:rPr>
-                <w:rFonts w:ascii="Cairo" w:hAnsi="Cairo" w:cs="Cairo"/>
+                <w:rFonts w:ascii="Cairo" w:hAnsi="Cairo" w:cs="Cairo" w:hint="eastAsia"/>
                 <w:color w:val="242220"/>
                 <w:sz w:val="19"/>
                 <w:rtl/>
@@ -1781,7 +1772,7 @@
               <w:bidi/>
               <w:jc w:val="right"/>
               <w:rPr>
-                <w:rFonts w:ascii="Cairo" w:hAnsi="Cairo" w:cs="Cairo"/>
+                <w:rFonts w:ascii="Cairo" w:hAnsi="Cairo" w:cs="Cairo" w:hint="eastAsia"/>
                 <w:color w:val="242220"/>
                 <w:sz w:val="19"/>
                 <w:rtl/>
@@ -1895,7 +1886,7 @@
               <w:bidi/>
               <w:jc w:val="right"/>
               <w:rPr>
-                <w:rFonts w:ascii="Cairo" w:hAnsi="Cairo" w:cs="Cairo"/>
+                <w:rFonts w:ascii="Cairo" w:hAnsi="Cairo" w:cs="Cairo" w:hint="eastAsia"/>
                 <w:color w:val="242220"/>
                 <w:sz w:val="19"/>
                 <w:rtl/>
@@ -2059,17 +2050,7 @@
                 <w:rtl/>
               </w:rPr>
               <w:br/>
-              <w:t xml:space="preserve">صاحب </w:t>
-            </w:r>
-            <w:r>
-              <w:rPr>
-                <w:rFonts w:ascii="Cairo" w:hAnsi="Cairo" w:cs="Cairo"/>
-                <w:b/>
-                <w:color w:val="541228"/>
-                <w:sz w:val="20"/>
-                <w:rtl/>
-              </w:rPr>
-              <w:t>السمو الملكي</w:t>
+              <w:t>صاحب السمو الملكي</w:t>
             </w:r>
             <w:r>
               <w:rPr>
@@ -2222,17 +2203,7 @@
                 <w:sz w:val="18"/>
                 <w:rtl/>
               </w:rPr>
-              <w:t xml:space="preserve">«ما يميز هذه البلاد هو </w:t>
-            </w:r>
-            <w:r>
-              <w:rPr>
-                <w:rFonts w:ascii="Cairo" w:hAnsi="Cairo" w:cs="Cairo"/>
-                <w:i/>
-                <w:color w:val="242220"/>
-                <w:sz w:val="18"/>
-                <w:rtl/>
-              </w:rPr>
-              <w:t>حرص قادتها على الخير والتشجيع عليه، وما نراه من مؤسسات خيرية في مختلف المجالات… إلا جانبًا من الجوانب المشرقة لبلادنا.»</w:t>
+              <w:t>«ما يميز هذه البلاد هو حرص قادتها على الخير والتشجيع عليه، وما نراه من مؤسسات خيرية في مختلف المجالات… إلا جانبًا من الجوانب المشرقة لبلادنا.»</w:t>
             </w:r>
           </w:p>
         </w:tc>
@@ -2348,17 +2319,7 @@
                 <w:sz w:val="18"/>
                 <w:rtl/>
               </w:rPr>
-              <w:t xml:space="preserve">«نسعد بالإنجازات التي حققتها الجمعيات الأهلية على مستوى المنطقة </w:t>
-            </w:r>
-            <w:r>
-              <w:rPr>
-                <w:rFonts w:ascii="Cairo" w:hAnsi="Cairo" w:cs="Cairo"/>
-                <w:i/>
-                <w:color w:val="242220"/>
-                <w:sz w:val="18"/>
-                <w:rtl/>
-              </w:rPr>
-              <w:t>باعتبارها شريكًا استراتيجيًا للقطاعين العام والخاص في تحسين جودة الحياة وتعزيز الاستقرار الاجتماعي والاقتصادي.»</w:t>
+              <w:t>«نسعد بالإنجازات التي حققتها الجمعيات الأهلية على مستوى المنطقة باعتبارها شريكًا استراتيجيًا للقطاعين العام والخاص في تحسين جودة الحياة وتعزيز الاستقرار الاجتماعي والاقتصادي.»</w:t>
             </w:r>
           </w:p>
         </w:tc>
@@ -2410,15 +2371,7 @@
           <w:color w:val="242220"/>
           <w:rtl/>
         </w:rPr>
-        <w:t xml:space="preserve">يسرني أن أضع بين أيديكم </w:t>
-      </w:r>
-      <w:r>
-        <w:rPr>
-          <w:rFonts w:ascii="Cairo" w:hAnsi="Cairo" w:cs="Cairo"/>
-          <w:color w:val="242220"/>
-          <w:rtl/>
-        </w:rPr>
-        <w:t>التقرير النصف سنوي لجمعية طبيبي الأهلية، والذي يعكس ما تحقق خلال النصف الأول من عام ٢٠٢٦م من نمو مالي وتشغيلي، وتطور في البنية المؤسسية والحوكمة، وتوسع في الخدمات المقدمة للمستفيدين المرضى في طيبة الطيبة.</w:t>
+        <w:t>يسرني أن أضع بين أيديكم التقرير النصف سنوي لجمعية طبيبي الأهلية، والذي يعكس ما تحقق خلال النصف الأول من عام ٢٠٢٦م من نمو مالي وتشغيلي، وتطور في البنية المؤسسية والحوكمة، وتوسع في الخدمات المقدمة للمستفيدين المرضى في طيبة الطيبة.</w:t>
       </w:r>
     </w:p>
     <w:p>
@@ -2432,15 +2385,7 @@
           <w:color w:val="242220"/>
           <w:rtl/>
         </w:rPr>
-        <w:t>وما تحقق من إنجازات - بعد توفيق الله - هو ثمرة تكام</w:t>
-      </w:r>
-      <w:r>
-        <w:rPr>
-          <w:rFonts w:ascii="Cairo" w:hAnsi="Cairo" w:cs="Cairo"/>
-          <w:color w:val="242220"/>
-          <w:rtl/>
-        </w:rPr>
-        <w:t>ل جهود مجلس الإدارة والجمعية العمومية والإدارة التنفيذية والعاملين والمتطوعين، ودعم الشركاء والمانحين الأفاضل الذين نعتز بثقتهم وإسهامهم في رسالة الجمعية التنموية والإنسانية.</w:t>
+        <w:t>وما تحقق من إنجازات - بعد توفيق الله - هو ثمرة تكامل جهود مجلس الإدارة والجمعية العمومية والإدارة التنفيذية والعاملين والمتطوعين، ودعم الشركاء والمانحين الأفاضل الذين نعتز بثقتهم وإسهامهم في رسالة الجمعية التنموية والإنسانية.</w:t>
       </w:r>
     </w:p>
     <w:p>
@@ -2454,15 +2399,7 @@
           <w:color w:val="242220"/>
           <w:rtl/>
         </w:rPr>
-        <w:t xml:space="preserve">وننظر إلى هذا التقرير بوصفه أداة للتقييم والتطوير المستمر، لا مجرد عرض للمنجزات؛ </w:t>
-      </w:r>
-      <w:r>
-        <w:rPr>
-          <w:rFonts w:ascii="Cairo" w:hAnsi="Cairo" w:cs="Cairo"/>
-          <w:color w:val="242220"/>
-          <w:rtl/>
-        </w:rPr>
-        <w:t>بما يساعد على تحديد أولويات المرحلة القادمة، وتعزيز الاستدامة المالية، ورفع الأثر الصحي والاجتماعي المحقق للمستفيدين.</w:t>
+        <w:t>وننظر إلى هذا التقرير بوصفه أداة للتقييم والتطوير المستمر، لا مجرد عرض للمنجزات؛ بما يساعد على تحديد أولويات المرحلة القادمة، وتعزيز الاستدامة المالية، ورفع الأثر الصحي والاجتماعي المحقق للمستفيدين.</w:t>
       </w:r>
     </w:p>
     <w:p>
@@ -2516,15 +2453,7 @@
           <w:color w:val="242220"/>
           <w:rtl/>
         </w:rPr>
-        <w:t xml:space="preserve">يقود الجمعية مجلس إدارة مكون من (٩) أعضاء ذوي </w:t>
-      </w:r>
-      <w:r>
-        <w:rPr>
-          <w:rFonts w:ascii="Cairo" w:hAnsi="Cairo" w:cs="Cairo"/>
-          <w:color w:val="242220"/>
-          <w:rtl/>
-        </w:rPr>
-        <w:t>كفاءات طبية وإدارية واجتماعية، يشرفون على لجان الحوكمة واللجنة التنفيذية ولجنة المساعدات الطبية، لضمان أعلى معايير الشفافية والامتثال المؤسسي.</w:t>
+        <w:t>يقود الجمعية مجلس إدارة مكون من (٩) أعضاء ذوي كفاءات طبية وإدارية واجتماعية، يشرفون على لجان الحوكمة واللجنة التنفيذية ولجنة المساعدات الطبية، لضمان أعلى معايير الشفافية والامتثال المؤسسي.</w:t>
       </w:r>
     </w:p>
     <w:p>
@@ -2560,15 +2489,7 @@
           <w:color w:val="242220"/>
           <w:rtl/>
         </w:rPr>
-        <w:t>سجل النصف الأول من عام ٢٠٢٦م قفزة نوعية تمثلت في نمو الإيرادات بنس</w:t>
-      </w:r>
-      <w:r>
-        <w:rPr>
-          <w:rFonts w:ascii="Cairo" w:hAnsi="Cairo" w:cs="Cairo"/>
-          <w:color w:val="242220"/>
-          <w:rtl/>
-        </w:rPr>
-        <w:t>بة (+١٩٢٪) ونمو المساعدات الطبية بنسبة (+٩٤٣٪)، مع توطين كامل للكادر بنسبة (١٠٠٪).</w:t>
+        <w:t>سجل النصف الأول من عام ٢٠٢٦م قفزة نوعية تمثلت في نمو الإيرادات بنسبة (+١٩٢٪) ونمو المساعدات الطبية بنسبة (+٩٤٣٪)، مع توطين كامل للكادر بنسبة (١٠٠٪).</w:t>
       </w:r>
     </w:p>
     <w:tbl>
@@ -3760,16 +3681,7 @@
                 <w:sz w:val="19"/>
                 <w:rtl/>
               </w:rPr>
-              <w:t xml:space="preserve">٢٩,٨٠١ </w:t>
-            </w:r>
-            <w:r>
-              <w:rPr>
-                <w:rFonts w:ascii="Cairo" w:hAnsi="Cairo" w:cs="Cairo"/>
-                <w:color w:val="242220"/>
-                <w:sz w:val="19"/>
-                <w:rtl/>
-              </w:rPr>
-              <w:t>ريال</w:t>
+              <w:t>٢٩,٨٠١ ريال</w:t>
             </w:r>
           </w:p>
         </w:tc>
@@ -4177,16 +4089,7 @@
                 <w:sz w:val="19"/>
                 <w:rtl/>
               </w:rPr>
-              <w:t xml:space="preserve">٨ </w:t>
-            </w:r>
-            <w:r>
-              <w:rPr>
-                <w:rFonts w:ascii="Cairo" w:hAnsi="Cairo" w:cs="Cairo"/>
-                <w:color w:val="242220"/>
-                <w:sz w:val="19"/>
-                <w:rtl/>
-              </w:rPr>
-              <w:t>دورات</w:t>
+              <w:t>٨ دورات</w:t>
             </w:r>
           </w:p>
         </w:tc>
@@ -4551,17 +4454,7 @@
           <w:sz w:val="26"/>
           <w:rtl/>
         </w:rPr>
-        <w:t xml:space="preserve">١. </w:t>
-      </w:r>
-      <w:r>
-        <w:rPr>
-          <w:rFonts w:ascii="Cairo" w:hAnsi="Cairo" w:cs="Cairo"/>
-          <w:b/>
-          <w:color w:val="541228"/>
-          <w:sz w:val="26"/>
-          <w:rtl/>
-        </w:rPr>
-        <w:t>مقارنة مصادر الدخل (H1 2026 vs H1 2025)</w:t>
+        <w:t>١. مقارنة مصادر الدخل (H1 2026 vs H1 2025)</w:t>
       </w:r>
     </w:p>
     <w:tbl>
@@ -6721,11 +6614,6 @@
       </w:pPr>
     </w:p>
     <w:p>
-      <w:r>
-        <w:br w:type="page"/>
-      </w:r>
-    </w:p>
-    <w:p>
       <w:pPr>
         <w:bidi/>
         <w:spacing w:before="280" w:after="120"/>
@@ -6738,7 +6626,6 @@
           <w:sz w:val="26"/>
           <w:rtl/>
         </w:rPr>
-        <w:lastRenderedPageBreak/>
         <w:t>٣. البيان التفصيلي للمصروفات التشغيلية (١٦ بنداً)</w:t>
       </w:r>
     </w:p>
@@ -6896,17 +6783,7 @@
                 <w:sz w:val="20"/>
                 <w:rtl/>
               </w:rPr>
-              <w:t xml:space="preserve">نسبة </w:t>
-            </w:r>
-            <w:r>
-              <w:rPr>
-                <w:rFonts w:ascii="Cairo" w:hAnsi="Cairo" w:cs="Cairo"/>
-                <w:b/>
-                <w:color w:val="FFFFFF"/>
-                <w:sz w:val="20"/>
-                <w:rtl/>
-              </w:rPr>
-              <w:t>التغير</w:t>
+              <w:t>نسبة التغير</w:t>
             </w:r>
           </w:p>
         </w:tc>
@@ -8585,6 +8462,7 @@
                 <w:sz w:val="19"/>
                 <w:rtl/>
               </w:rPr>
+              <w:lastRenderedPageBreak/>
               <w:t>١١</w:t>
             </w:r>
           </w:p>
@@ -9557,7 +9435,6 @@
                 <w:sz w:val="19"/>
                 <w:rtl/>
               </w:rPr>
-              <w:lastRenderedPageBreak/>
               <w:t>—</w:t>
             </w:r>
           </w:p>
@@ -9717,17 +9594,7 @@
           <w:sz w:val="26"/>
           <w:rtl/>
         </w:rPr>
-        <w:t xml:space="preserve">٤. هيكل </w:t>
-      </w:r>
-      <w:r>
-        <w:rPr>
-          <w:rFonts w:ascii="Cairo" w:hAnsi="Cairo" w:cs="Cairo"/>
-          <w:b/>
-          <w:color w:val="541228"/>
-          <w:sz w:val="26"/>
-          <w:rtl/>
-        </w:rPr>
-        <w:t>المركز المالي والسيولة النقدية</w:t>
+        <w:t>٤. هيكل المركز المالي والسيولة النقدية</w:t>
       </w:r>
     </w:p>
     <w:p>
@@ -9778,15 +9645,7 @@
           <w:color w:val="242220"/>
           <w:rtl/>
         </w:rPr>
-        <w:t>• الأموال المقيدة لبرامج ومشاريع محددة: (٣٦٧,٠٩٣ ريا</w:t>
-      </w:r>
-      <w:r>
-        <w:rPr>
-          <w:rFonts w:ascii="Cairo" w:hAnsi="Cairo" w:cs="Cairo"/>
-          <w:color w:val="242220"/>
-          <w:rtl/>
-        </w:rPr>
-        <w:t>ل) وتمثل (٣٦.٧٪) من السيولة.</w:t>
+        <w:t>• الأموال المقيدة لبرامج ومشاريع محددة: (٣٦٧,٠٩٣ ريال) وتمثل (٣٦.٧٪) من السيولة.</w:t>
       </w:r>
     </w:p>
     <w:p>
@@ -9873,16 +9732,7 @@
                 <w:sz w:val="21"/>
                 <w:rtl/>
               </w:rPr>
-              <w:t>تمت تسوية وسداد كامل الالتزاما</w:t>
-            </w:r>
-            <w:r>
-              <w:rPr>
-                <w:rFonts w:ascii="Cairo" w:hAnsi="Cairo" w:cs="Cairo"/>
-                <w:i/>
-                <w:sz w:val="21"/>
-                <w:rtl/>
-              </w:rPr>
-              <w:t>ت المرحلة من عام ٢٠٢٥م بقيمة (١٨,٢١١ ريال) شملت إيجار المقر السابق (٥,٨٣٣ ريال)، أتعاب المحاسب القانوني (٤,٦٠٠ ريال)، إقفال الحسابات (٢,٠٠٠ ريال)، ومخصص نهاية الخدمة (٧٧٨ ريال)، مع بقاء التزام قدره (٥,٠٠٠ ريال) لمؤسسة مؤشرات النجاح عن استكمال ملف الحوكمة.</w:t>
+              <w:t>تمت تسوية وسداد كامل الالتزامات المرحلة من عام ٢٠٢٥م بقيمة (١٨,٢١١ ريال) شملت إيجار المقر السابق (٥,٨٣٣ ريال)، أتعاب المحاسب القانوني (٤,٦٠٠ ريال)، إقفال الحسابات (٢,٠٠٠ ريال)، ومخصص نهاية الخدمة (٧٧٨ ريال)، مع بقاء التزام قدره (٥,٠٠٠ ريال) لمؤسسة مؤشرات النجاح عن استكمال ملف الحوكمة.</w:t>
             </w:r>
           </w:p>
         </w:tc>
@@ -9892,11 +9742,6 @@
       <w:pPr>
         <w:spacing w:after="80"/>
       </w:pPr>
-    </w:p>
-    <w:p>
-      <w:r>
-        <w:br w:type="page"/>
-      </w:r>
     </w:p>
     <w:p>
       <w:pPr>
@@ -9911,7 +9756,6 @@
           <w:sz w:val="32"/>
           <w:rtl/>
         </w:rPr>
-        <w:lastRenderedPageBreak/>
         <w:t>البرامج والخدمات الطبية ورعاية المرضى</w:t>
       </w:r>
     </w:p>
@@ -10071,17 +9915,7 @@
                 <w:sz w:val="20"/>
                 <w:rtl/>
               </w:rPr>
-              <w:t xml:space="preserve">التشخيص </w:t>
-            </w:r>
-            <w:r>
-              <w:rPr>
-                <w:rFonts w:ascii="Cairo" w:hAnsi="Cairo" w:cs="Cairo"/>
-                <w:b/>
-                <w:color w:val="FFFFFF"/>
-                <w:sz w:val="20"/>
-                <w:rtl/>
-              </w:rPr>
-              <w:t>الطبي</w:t>
+              <w:t>التشخيص الطبي</w:t>
             </w:r>
           </w:p>
         </w:tc>
@@ -10140,6 +9974,7 @@
                 <w:sz w:val="19"/>
                 <w:rtl/>
               </w:rPr>
+              <w:lastRenderedPageBreak/>
               <w:t>١</w:t>
             </w:r>
           </w:p>
@@ -10490,16 +10325,7 @@
                 <w:sz w:val="19"/>
                 <w:rtl/>
               </w:rPr>
-              <w:t xml:space="preserve">تنويم ورعاية تحت </w:t>
-            </w:r>
-            <w:r>
-              <w:rPr>
-                <w:rFonts w:ascii="Cairo" w:hAnsi="Cairo" w:cs="Cairo"/>
-                <w:color w:val="242220"/>
-                <w:sz w:val="19"/>
-                <w:rtl/>
-              </w:rPr>
-              <w:t>الملاحظة الفائقة</w:t>
+              <w:t>تنويم ورعاية تحت الملاحظة الفائقة</w:t>
             </w:r>
           </w:p>
         </w:tc>
@@ -10991,16 +10817,7 @@
                 <w:sz w:val="19"/>
                 <w:rtl/>
               </w:rPr>
-              <w:t xml:space="preserve">محمد </w:t>
-            </w:r>
-            <w:r>
-              <w:rPr>
-                <w:rFonts w:ascii="Cairo" w:hAnsi="Cairo" w:cs="Cairo"/>
-                <w:color w:val="242220"/>
-                <w:sz w:val="19"/>
-                <w:rtl/>
-              </w:rPr>
-              <w:t>أحمد الشرفي</w:t>
+              <w:t>محمد أحمد الشرفي</w:t>
             </w:r>
           </w:p>
         </w:tc>
@@ -11430,17 +11247,7 @@
                 <w:sz w:val="19"/>
                 <w:rtl/>
               </w:rPr>
-              <w:t xml:space="preserve">انتهاء صلاحية </w:t>
-            </w:r>
-            <w:r>
-              <w:rPr>
-                <w:rFonts w:ascii="Cairo" w:hAnsi="Cairo" w:cs="Cairo"/>
-                <w:b/>
-                <w:color w:val="242220"/>
-                <w:sz w:val="19"/>
-                <w:rtl/>
-              </w:rPr>
-              <w:t>الإقامة</w:t>
+              <w:t>انتهاء صلاحية الإقامة</w:t>
             </w:r>
           </w:p>
         </w:tc>
@@ -11680,16 +11487,7 @@
                 <w:sz w:val="19"/>
                 <w:rtl/>
               </w:rPr>
-              <w:t xml:space="preserve">تفعيل </w:t>
-            </w:r>
-            <w:r>
-              <w:rPr>
-                <w:rFonts w:ascii="Cairo" w:hAnsi="Cairo" w:cs="Cairo"/>
-                <w:color w:val="242220"/>
-                <w:sz w:val="19"/>
-                <w:rtl/>
-              </w:rPr>
-              <w:t>الربط الإلكتروني لمنع ازدواجية الدعم</w:t>
+              <w:t>تفعيل الربط الإلكتروني لمنع ازدواجية الدعم</w:t>
             </w:r>
           </w:p>
         </w:tc>
@@ -11721,7 +11519,6 @@
                 <w:sz w:val="19"/>
                 <w:rtl/>
               </w:rPr>
-              <w:lastRenderedPageBreak/>
               <w:t>أخطاء بالتقرير الطبي / تشخيص</w:t>
             </w:r>
           </w:p>
@@ -11962,16 +11759,7 @@
                 <w:sz w:val="19"/>
                 <w:rtl/>
               </w:rPr>
-              <w:t xml:space="preserve">توجيه المريض </w:t>
-            </w:r>
-            <w:r>
-              <w:rPr>
-                <w:rFonts w:ascii="Cairo" w:hAnsi="Cairo" w:cs="Cairo"/>
-                <w:color w:val="242220"/>
-                <w:sz w:val="19"/>
-                <w:rtl/>
-              </w:rPr>
-              <w:t>للاستفادة من وثيقة التأمين المعتمدة</w:t>
+              <w:t>توجيه المريض للاستفادة من وثيقة التأمين المعتمدة</w:t>
             </w:r>
           </w:p>
         </w:tc>
@@ -12003,6 +11791,7 @@
                 <w:sz w:val="19"/>
                 <w:rtl/>
               </w:rPr>
+              <w:lastRenderedPageBreak/>
               <w:t>انتهاء تأشيرة الزيارة والسفر</w:t>
             </w:r>
           </w:p>
@@ -12243,16 +12032,7 @@
                 <w:sz w:val="19"/>
                 <w:rtl/>
               </w:rPr>
-              <w:t xml:space="preserve">متابعة تسليم التعميد وبدء الخطة </w:t>
-            </w:r>
-            <w:r>
-              <w:rPr>
-                <w:rFonts w:ascii="Cairo" w:hAnsi="Cairo" w:cs="Cairo"/>
-                <w:color w:val="242220"/>
-                <w:sz w:val="19"/>
-                <w:rtl/>
-              </w:rPr>
-              <w:t>العلاجية</w:t>
+              <w:t>متابعة تسليم التعميد وبدء الخطة العلاجية</w:t>
             </w:r>
           </w:p>
         </w:tc>
@@ -12334,15 +12114,7 @@
           <w:color w:val="242220"/>
           <w:rtl/>
         </w:rPr>
-        <w:t xml:space="preserve">• </w:t>
-      </w:r>
-      <w:r>
-        <w:rPr>
-          <w:rFonts w:ascii="Cairo" w:hAnsi="Cairo" w:cs="Cairo"/>
-          <w:color w:val="242220"/>
-          <w:rtl/>
-        </w:rPr>
-        <w:t>مدينة الملك سلمان الطبية: الرعاية التخصصية والتنويم والعناية الفائقة.</w:t>
+        <w:t>• مدينة الملك سلمان الطبية: الرعاية التخصصية والتنويم والعناية الفائقة.</w:t>
       </w:r>
     </w:p>
     <w:p>
@@ -12384,15 +12156,7 @@
           <w:color w:val="242220"/>
           <w:rtl/>
         </w:rPr>
-        <w:t>• شركة مداواة ورعاية الطبية &amp; جمعية جَ</w:t>
-      </w:r>
-      <w:r>
-        <w:rPr>
-          <w:rFonts w:ascii="Cairo" w:hAnsi="Cairo" w:cs="Cairo"/>
-          <w:color w:val="242220"/>
-          <w:rtl/>
-        </w:rPr>
-        <w:t>نَى لتأهيل الفتيات ذوات الإعاقة.</w:t>
+        <w:t>• شركة مداواة ورعاية الطبية &amp; جمعية جَنَى لتأهيل الفتيات ذوات الإعاقة.</w:t>
       </w:r>
     </w:p>
     <w:p>
@@ -12422,15 +12186,7 @@
           <w:color w:val="242220"/>
           <w:rtl/>
         </w:rPr>
-        <w:t xml:space="preserve">• الكادر الوظيفي الحالي: (٣) موظفين رسميين (المدير التنفيذي: أ. بيان المحمدي، المسؤول المالي والمشاريع: أ. غدير الحربي، السكرتير التنفيذي: أ. طراد سمان) + محاسب متعاون (أ. محمد الحسن) + </w:t>
-      </w:r>
-      <w:r>
-        <w:rPr>
-          <w:rFonts w:ascii="Cairo" w:hAnsi="Cairo" w:cs="Cairo"/>
-          <w:color w:val="242220"/>
-          <w:rtl/>
-        </w:rPr>
-        <w:t>مسؤول إعلام قيد الترسيم (أ. فيصل الجهني).</w:t>
+        <w:t>• الكادر الوظيفي الحالي: (٣) موظفين رسميين (المدير التنفيذي: أ. بيان المحمدي، المسؤول المالي والمشاريع: أ. غدير الحربي، السكرتير التنفيذي: أ. طراد سمان) + محاسب متعاون (أ. محمد الحسن) + مسؤول إعلام قيد الترسيم (أ. فيصل الجهني).</w:t>
       </w:r>
     </w:p>
     <w:p>
@@ -12472,15 +12228,7 @@
           <w:color w:val="242220"/>
           <w:rtl/>
         </w:rPr>
-        <w:t xml:space="preserve">• ترشيد النفقات: الانتقال لمقر جديد </w:t>
-      </w:r>
-      <w:r>
-        <w:rPr>
-          <w:rFonts w:ascii="Cairo" w:hAnsi="Cairo" w:cs="Cairo"/>
-          <w:color w:val="242220"/>
-          <w:rtl/>
-        </w:rPr>
-        <w:t>بإيجار (٤٥,٠٠٠ ريال) بدلاً من (٧٠,٠٠٠ ريال) بتوفير (٢٥,٠٠٠ ريال سنوياً).</w:t>
+        <w:t>• ترشيد النفقات: الانتقال لمقر جديد بإيجار (٤٥,٠٠٠ ريال) بدلاً من (٧٠,٠٠٠ ريال) بتوفير (٢٥,٠٠٠ ريال سنوياً).</w:t>
       </w:r>
     </w:p>
     <w:p>
@@ -12524,15 +12272,7 @@
           <w:color w:val="242220"/>
           <w:rtl/>
         </w:rPr>
-        <w:t>٢. ال</w:t>
-      </w:r>
-      <w:r>
-        <w:rPr>
-          <w:rFonts w:ascii="Cairo" w:hAnsi="Cairo" w:cs="Cairo"/>
-          <w:color w:val="242220"/>
-          <w:rtl/>
-        </w:rPr>
-        <w:t>مرحلة الثانية (الشهر الثاني): تنمية الموارد وإطلاق مبادرة «بطاقة طبيبي» للمزايا والخصومات الصحية للمستفيدين.</w:t>
+        <w:t>٢. المرحلة الثانية (الشهر الثاني): تنمية الموارد وإطلاق مبادرة «بطاقة طبيبي» للمزايا والخصومات الصحية للمستفيدين.</w:t>
       </w:r>
     </w:p>
     <w:p>
@@ -12568,17 +12308,7 @@
           <w:rtl/>
         </w:rPr>
         <w:lastRenderedPageBreak/>
-        <w:t>الملاحق الرسم</w:t>
-      </w:r>
-      <w:r>
-        <w:rPr>
-          <w:rFonts w:ascii="Cairo" w:hAnsi="Cairo" w:cs="Cairo"/>
-          <w:b/>
-          <w:color w:val="541228"/>
-          <w:sz w:val="32"/>
-          <w:rtl/>
-        </w:rPr>
-        <w:t>ية والتفصيلية</w:t>
+        <w:t>الملاحق الرسمية والتفصيلية</w:t>
       </w:r>
     </w:p>
     <w:p>
@@ -13080,16 +12810,7 @@
                 <w:sz w:val="19"/>
                 <w:rtl/>
               </w:rPr>
-              <w:t xml:space="preserve">وقف </w:t>
-            </w:r>
-            <w:r>
-              <w:rPr>
-                <w:rFonts w:ascii="Cairo" w:hAnsi="Cairo" w:cs="Cairo"/>
-                <w:color w:val="242220"/>
-                <w:sz w:val="19"/>
-                <w:rtl/>
-              </w:rPr>
-              <w:t>الشيخ نغيمش الأحمدي (رحمه الله)</w:t>
+              <w:t>وقف الشيخ نغيمش الأحمدي (رحمه الله)</w:t>
             </w:r>
           </w:p>
         </w:tc>
@@ -13575,16 +13296,7 @@
                 <w:sz w:val="19"/>
                 <w:rtl/>
               </w:rPr>
-              <w:t xml:space="preserve">دعم </w:t>
-            </w:r>
-            <w:r>
-              <w:rPr>
-                <w:rFonts w:ascii="Cairo" w:hAnsi="Cairo" w:cs="Cairo"/>
-                <w:color w:val="242220"/>
-                <w:sz w:val="19"/>
-                <w:rtl/>
-              </w:rPr>
-              <w:t>عام</w:t>
+              <w:t>دعم عام</w:t>
             </w:r>
           </w:p>
         </w:tc>
@@ -17411,11 +17123,6 @@
     <w:lsdException w:name="Book Title" w:uiPriority="33" w:qFormat="1"/>
     <w:lsdException w:name="Bibliography" w:semiHidden="1" w:uiPriority="37" w:unhideWhenUsed="1"/>
     <w:lsdException w:name="TOC Heading" w:semiHidden="1" w:uiPriority="39" w:unhideWhenUsed="1" w:qFormat="1"/>
-    <w:lsdException w:name="Plain Table 5" w:semiHidden="1" w:unhideWhenUsed="1"/>
-    <w:lsdException w:name="Grid Table Light" w:semiHidden="1" w:unhideWhenUsed="1"/>
-    <w:lsdException w:name="Grid Table 1 Light" w:semiHidden="1" w:unhideWhenUsed="1"/>
-    <w:lsdException w:name="Grid Table 2" w:semiHidden="1" w:unhideWhenUsed="1"/>
-    <w:lsdException w:name="Grid Table 3" w:semiHidden="1" w:unhideWhenUsed="1"/>
     <w:lsdException w:name="Grid Table 4" w:uiPriority="49"/>
     <w:lsdException w:name="Grid Table 5 Dark" w:uiPriority="50"/>
     <w:lsdException w:name="Grid Table 6 Colorful" w:uiPriority="51"/>

</xml_diff>

<commit_message>
Incorporate all data from Pages 30 to 47 of the original report across dashboard, Word, PPTX, and Web presentations
</commit_message>
<xml_diff>
--- a/التقرير_الاحترافي_المطور/تقرير_جمعية_طبيبي_النصف_سنوي_٢٠٢٦_النسخة_التنفيذية.docx
+++ b/التقرير_الاحترافي_المطور/تقرير_جمعية_طبيبي_النصف_سنوي_٢٠٢٦_النسخة_التنفيذية.docx
@@ -4,82 +4,92 @@
   <w:body>
     <w:p>
       <w:pPr>
-        <w:spacing w:after="100" w:line="288" w:lineRule="auto"/>
+        <w:spacing w:after="120"/>
         <w:jc w:val="center"/>
       </w:pPr>
       <w:r>
         <w:rPr>
           <w:rFonts w:ascii="Arial" w:hAnsi="Arial"/>
           <w:b/>
-          <w:i w:val="0"/>
           <w:color w:val="C9A96E"/>
-          <w:sz w:val="30"/>
+          <w:sz w:val="32"/>
         </w:rPr>
         <w:t>جمعية طبيبي الأهلية بالمدينة المنورة</w:t>
       </w:r>
     </w:p>
     <w:p>
       <w:pPr>
-        <w:spacing w:after="100" w:line="288" w:lineRule="auto"/>
+        <w:spacing w:after="240"/>
         <w:jc w:val="center"/>
       </w:pPr>
       <w:r>
         <w:rPr>
           <w:rFonts w:ascii="Arial" w:hAnsi="Arial"/>
           <w:b/>
-          <w:i w:val="0"/>
           <w:color w:val="6B1D3A"/>
           <w:sz w:val="48"/>
         </w:rPr>
-        <w:t>التقرير النصف سنوي الشامل لعام ٢٠٢٦م</w:t>
+        <w:t>التقرير النصف سنوي الشامل والتدقيق الاستراتيجي لعام ٢٠٢٦م</w:t>
       </w:r>
     </w:p>
     <w:p>
       <w:pPr>
-        <w:spacing w:after="100" w:line="288" w:lineRule="auto"/>
+        <w:spacing w:after="360"/>
         <w:jc w:val="center"/>
       </w:pPr>
       <w:r>
         <w:rPr>
           <w:rFonts w:ascii="Arial" w:hAnsi="Arial"/>
           <w:b/>
-          <w:i w:val="0"/>
-          <w:color w:val="6B1D3A"/>
+          <w:color w:val="C9A96E"/>
           <w:sz w:val="26"/>
         </w:rPr>
-        <w:t>«مدعم بالتدقيق الأدائي ومطابقة مستهدفات الخطة الاستراتيجية والتشغيلية»</w:t>
+        <w:t>«مدعم بنتائج التدقيق الأدائي المقارن ومطابقة مستهدفات الخطة الاستراتيجية والتشغيلية»</w:t>
       </w:r>
     </w:p>
     <w:p>
       <w:pPr>
-        <w:spacing w:after="100" w:line="288" w:lineRule="auto"/>
+        <w:spacing w:after="480"/>
+        <w:jc w:val="center"/>
+      </w:pPr>
+      <w:r>
+        <w:rPr>
+          <w:rFonts w:ascii="Arial" w:hAnsi="Arial"/>
+          <w:b/>
+          <w:color w:val="6B1D3A"/>
+          <w:sz w:val="30"/>
+        </w:rPr>
+        <w:t>« ثـقـة  •  أثــر  •  اسـتـدامـة »</w:t>
+      </w:r>
+    </w:p>
+    <w:p>
+      <w:pPr>
+        <w:spacing w:after="120"/>
         <w:jc w:val="center"/>
       </w:pPr>
       <w:r>
         <w:rPr>
           <w:rFonts w:ascii="Arial" w:hAnsi="Arial"/>
           <w:b w:val="0"/>
-          <w:i w:val="0"/>
           <w:color w:val="2D2D2D"/>
-          <w:sz w:val="22"/>
+          <w:sz w:val="21"/>
         </w:rPr>
-        <w:t>الفترة من ١ يناير إلى ٣٠ يونيو ٢٠٢٦م | ترخيص رقم: (١٠٠٠٧٣٠٧٠٠)</w:t>
+        <w:t>الفترة: من ١ يناير إلى ٣٠ يونيو ٢٠٢٦م | ترخيص المركز الوطني: (١٠٠٠٧٣٠٧٠٠)</w:t>
       </w:r>
     </w:p>
     <w:p>
       <w:pPr>
-        <w:spacing w:after="100" w:line="288" w:lineRule="auto"/>
+        <w:spacing w:after="120"/>
         <w:jc w:val="center"/>
       </w:pPr>
       <w:r>
         <w:rPr>
           <w:rFonts w:ascii="Arial" w:hAnsi="Arial"/>
-          <w:b/>
-          <w:i w:val="0"/>
-          <w:color w:val="C9A96E"/>
-          <w:sz w:val="28"/>
+          <w:b w:val="0"/>
+          <w:color w:val="2D2D2D"/>
+          <w:sz w:val="21"/>
         </w:rPr>
-        <w:t>« ثـقـة • أثــر • اسـتـدامـة »</w:t>
+        <w:t>إعداد: أ. بيان بن سعد المحمدي - المدير التنفيذي | إشراف مجلس الإدارة</w:t>
       </w:r>
     </w:p>
     <w:p>
@@ -89,7 +99,7 @@
     </w:p>
     <w:p>
       <w:pPr>
-        <w:pStyle w:val="Heading1"/>
+        <w:spacing w:before="280" w:after="120"/>
         <w:jc w:val="right"/>
       </w:pPr>
       <w:r>
@@ -97,9 +107,99 @@
           <w:rFonts w:ascii="Arial" w:hAnsi="Arial"/>
           <w:b/>
           <w:color w:val="6B1D3A"/>
-          <w:sz w:val="32"/>
+          <w:sz w:val="34"/>
         </w:rPr>
-        <w:t>فهرس المحتويات التنفيذي</w:t>
+        <w:t>أولاً: القيادة الرشيدة ومجلس الإدارة (الرؤية والتمكين)</w:t>
+      </w:r>
+    </w:p>
+    <w:p>
+      <w:pPr>
+        <w:spacing w:after="120"/>
+        <w:jc w:val="right"/>
+      </w:pPr>
+      <w:r>
+        <w:rPr>
+          <w:rFonts w:ascii="Arial" w:hAnsi="Arial"/>
+          <w:b w:val="0"/>
+          <w:color w:val="2D2D2D"/>
+          <w:sz w:val="22"/>
+        </w:rPr>
+        <w:t>تسترشد جمعية طبيبي الأهلية بتوجيهات القيادة الرشيدة في تمكين القطاع غير الربحي ليكون شريكاً ريادياً في التنمية الصحية ورفع جودة الحياة بطيبة الطيبة.</w:t>
+      </w:r>
+    </w:p>
+    <w:p>
+      <w:pPr>
+        <w:spacing w:after="120"/>
+        <w:jc w:val="right"/>
+      </w:pPr>
+      <w:r>
+        <w:rPr>
+          <w:rFonts w:ascii="Arial" w:hAnsi="Arial"/>
+          <w:b/>
+          <w:color w:val="6B1D3A"/>
+          <w:sz w:val="21"/>
+        </w:rPr>
+        <w:t>• خادم الحرمين الشريفين الملك سلمان بن عبدالعزيز: «ما يميز هذه البلاد هو حرص قادتها على الخير والتشجيع عليه، وما نراه من مؤسسات خيرية في مختلف المجالات إلا جانب من الجوانب المشرقة لبلادنا.»</w:t>
+      </w:r>
+    </w:p>
+    <w:p>
+      <w:pPr>
+        <w:spacing w:after="120"/>
+        <w:jc w:val="right"/>
+      </w:pPr>
+      <w:r>
+        <w:rPr>
+          <w:rFonts w:ascii="Arial" w:hAnsi="Arial"/>
+          <w:b/>
+          <w:color w:val="6B1D3A"/>
+          <w:sz w:val="21"/>
+        </w:rPr>
+        <w:t>• ولي العهد رئيس مجلس الوزراء الأمير محمد بن سلمان: «نهدف للوصول إلى قطاع غير ربحي مهم، مبادر وداعم ومؤثر في التعليم والصحة والثقافة والمجالات البحثية، وسنعتمد عليه بشكل رئيسي.»</w:t>
+      </w:r>
+    </w:p>
+    <w:p>
+      <w:pPr>
+        <w:spacing w:after="120"/>
+        <w:jc w:val="right"/>
+      </w:pPr>
+      <w:r>
+        <w:rPr>
+          <w:rFonts w:ascii="Arial" w:hAnsi="Arial"/>
+          <w:b/>
+          <w:color w:val="6B1D3A"/>
+          <w:sz w:val="21"/>
+        </w:rPr>
+        <w:t>• أمير منطقة المدينة المنورة الأمير سلمان بن سلطان: «نسعد بالإنجازات التي حققتها الجمعيات الأهلية على مستوى المنطقة باعتبارها شريكاً استراتيجياً في تحسين جودة الحياة.»</w:t>
+      </w:r>
+    </w:p>
+    <w:p>
+      <w:pPr>
+        <w:spacing w:before="280" w:after="120"/>
+        <w:jc w:val="right"/>
+      </w:pPr>
+      <w:r>
+        <w:rPr>
+          <w:rFonts w:ascii="Arial" w:hAnsi="Arial"/>
+          <w:b/>
+          <w:color w:val="6B1D3A"/>
+          <w:sz w:val="34"/>
+        </w:rPr>
+        <w:t>ثانياً: نتائج التدقيق الاستراتيجي وبطاقة الأداء المتوازن (BSC)</w:t>
+      </w:r>
+    </w:p>
+    <w:p>
+      <w:pPr>
+        <w:spacing w:after="120"/>
+        <w:jc w:val="right"/>
+      </w:pPr>
+      <w:r>
+        <w:rPr>
+          <w:rFonts w:ascii="Arial" w:hAnsi="Arial"/>
+          <w:b w:val="0"/>
+          <w:color w:val="2D2D2D"/>
+          <w:sz w:val="22"/>
+        </w:rPr>
+        <w:t>أظهر التدقيق المقارن بين الخطة الاستراتيجية والتشغيلية والمنجز الفعلي للنصف الأول تحقيق نسبة إنجاز موزونة قدرها ٤١.٧٣٪ (بعد مواءمة المستهدف المالي السنوي إلى ١.٥٢٧ مليون ريال).</w:t>
       </w:r>
     </w:p>
     <w:tbl>
@@ -109,13 +209,15 @@
         <w:tblLook w:firstColumn="1" w:firstRow="1" w:lastColumn="0" w:lastRow="0" w:noHBand="0" w:noVBand="1" w:val="04A0"/>
       </w:tblPr>
       <w:tblGrid>
-        <w:gridCol w:w="4802"/>
-        <w:gridCol w:w="4802"/>
+        <w:gridCol w:w="2484"/>
+        <w:gridCol w:w="2484"/>
+        <w:gridCol w:w="2484"/>
+        <w:gridCol w:w="2484"/>
       </w:tblGrid>
       <w:tr>
         <w:tc>
           <w:tcPr>
-            <w:tcW w:type="dxa" w:w="4802"/>
+            <w:tcW w:type="dxa" w:w="2484"/>
             <w:shd w:fill="6B1D3A"/>
           </w:tcPr>
           <w:p>
@@ -123,14 +225,15 @@
               <w:rPr>
                 <w:b/>
                 <w:color w:val="FFFFFF"/>
+                <w:sz w:val="20"/>
               </w:rPr>
-              <w:t>البند / المحور</w:t>
+              <w:t>منظور بطاقة الأداء المتوازن (BSC)</w:t>
             </w:r>
           </w:p>
         </w:tc>
         <w:tc>
           <w:tcPr>
-            <w:tcW w:type="dxa" w:w="4802"/>
+            <w:tcW w:type="dxa" w:w="2484"/>
             <w:shd w:fill="6B1D3A"/>
           </w:tcPr>
           <w:p>
@@ -138,8 +241,41 @@
               <w:rPr>
                 <w:b/>
                 <w:color w:val="FFFFFF"/>
+                <w:sz w:val="20"/>
               </w:rPr>
-              <w:t>رقم الصفحة</w:t>
+              <w:t>الوزن النسبي</w:t>
+            </w:r>
+          </w:p>
+        </w:tc>
+        <w:tc>
+          <w:tcPr>
+            <w:tcW w:type="dxa" w:w="2484"/>
+            <w:shd w:fill="6B1D3A"/>
+          </w:tcPr>
+          <w:p>
+            <w:r>
+              <w:rPr>
+                <w:b/>
+                <w:color w:val="FFFFFF"/>
+                <w:sz w:val="20"/>
+              </w:rPr>
+              <w:t>نسبة إنجاز المنظور</w:t>
+            </w:r>
+          </w:p>
+        </w:tc>
+        <w:tc>
+          <w:tcPr>
+            <w:tcW w:type="dxa" w:w="2484"/>
+            <w:shd w:fill="6B1D3A"/>
+          </w:tcPr>
+          <w:p>
+            <w:r>
+              <w:rPr>
+                <w:b/>
+                <w:color w:val="FFFFFF"/>
+                <w:sz w:val="20"/>
+              </w:rPr>
+              <w:t>الدرجة المحققة من ١٠٠</w:t>
             </w:r>
           </w:p>
         </w:tc>
@@ -147,21 +283,53 @@
       <w:tr>
         <w:tc>
           <w:tcPr>
-            <w:tcW w:type="dxa" w:w="4802"/>
+            <w:tcW w:type="dxa" w:w="2484"/>
           </w:tcPr>
           <w:p>
             <w:r>
-              <w:t>١. المقدمة والقيادة الرشيدة ومجلس الإدارة</w:t>
+              <w:rPr>
+                <w:sz w:val="19"/>
+              </w:rPr>
+              <w:t>١. محور الأثر والبرامج الطبية</w:t>
             </w:r>
           </w:p>
         </w:tc>
         <w:tc>
           <w:tcPr>
-            <w:tcW w:type="dxa" w:w="4802"/>
+            <w:tcW w:type="dxa" w:w="2484"/>
           </w:tcPr>
           <w:p>
             <w:r>
-              <w:t>ص ٢</w:t>
+              <w:rPr>
+                <w:sz w:val="19"/>
+              </w:rPr>
+              <w:t>٤٠٪</w:t>
+            </w:r>
+          </w:p>
+        </w:tc>
+        <w:tc>
+          <w:tcPr>
+            <w:tcW w:type="dxa" w:w="2484"/>
+          </w:tcPr>
+          <w:p>
+            <w:r>
+              <w:rPr>
+                <w:sz w:val="19"/>
+              </w:rPr>
+              <w:t>١٣.٩٥٪</w:t>
+            </w:r>
+          </w:p>
+        </w:tc>
+        <w:tc>
+          <w:tcPr>
+            <w:tcW w:type="dxa" w:w="2484"/>
+          </w:tcPr>
+          <w:p>
+            <w:r>
+              <w:rPr>
+                <w:sz w:val="19"/>
+              </w:rPr>
+              <w:t>٥.٥٨ من ٤٠</w:t>
             </w:r>
           </w:p>
         </w:tc>
@@ -169,23 +337,57 @@
       <w:tr>
         <w:tc>
           <w:tcPr>
-            <w:tcW w:type="dxa" w:w="4802"/>
+            <w:tcW w:type="dxa" w:w="2484"/>
             <w:shd w:fill="F8F6F0"/>
           </w:tcPr>
           <w:p>
             <w:r>
-              <w:t>٢. كلمة رئيس مجلس الإدارة</w:t>
+              <w:rPr>
+                <w:sz w:val="19"/>
+              </w:rPr>
+              <w:t>٢. المحور المالي والموازنة التشغيلية</w:t>
             </w:r>
           </w:p>
         </w:tc>
         <w:tc>
           <w:tcPr>
-            <w:tcW w:type="dxa" w:w="4802"/>
+            <w:tcW w:type="dxa" w:w="2484"/>
             <w:shd w:fill="F8F6F0"/>
           </w:tcPr>
           <w:p>
             <w:r>
-              <w:t>ص ٣</w:t>
+              <w:rPr>
+                <w:sz w:val="19"/>
+              </w:rPr>
+              <w:t>٣٠٪</w:t>
+            </w:r>
+          </w:p>
+        </w:tc>
+        <w:tc>
+          <w:tcPr>
+            <w:tcW w:type="dxa" w:w="2484"/>
+            <w:shd w:fill="F8F6F0"/>
+          </w:tcPr>
+          <w:p>
+            <w:r>
+              <w:rPr>
+                <w:sz w:val="19"/>
+              </w:rPr>
+              <w:t>٦٣.٠١٪</w:t>
+            </w:r>
+          </w:p>
+        </w:tc>
+        <w:tc>
+          <w:tcPr>
+            <w:tcW w:type="dxa" w:w="2484"/>
+            <w:shd w:fill="F8F6F0"/>
+          </w:tcPr>
+          <w:p>
+            <w:r>
+              <w:rPr>
+                <w:sz w:val="19"/>
+              </w:rPr>
+              <w:t>١٨.٩٠ من ٣٠</w:t>
             </w:r>
           </w:p>
         </w:tc>
@@ -193,21 +395,53 @@
       <w:tr>
         <w:tc>
           <w:tcPr>
-            <w:tcW w:type="dxa" w:w="4802"/>
+            <w:tcW w:type="dxa" w:w="2484"/>
           </w:tcPr>
           <w:p>
             <w:r>
-              <w:t>٣. الملخص التنفيذي ومؤشرات الأداء الرئيسية</w:t>
+              <w:rPr>
+                <w:sz w:val="19"/>
+              </w:rPr>
+              <w:t>٣. محور العمليات والشراكات المؤسسية</w:t>
             </w:r>
           </w:p>
         </w:tc>
         <w:tc>
           <w:tcPr>
-            <w:tcW w:type="dxa" w:w="4802"/>
+            <w:tcW w:type="dxa" w:w="2484"/>
           </w:tcPr>
           <w:p>
             <w:r>
-              <w:t>ص ٤</w:t>
+              <w:rPr>
+                <w:sz w:val="19"/>
+              </w:rPr>
+              <w:t>١٥٪</w:t>
+            </w:r>
+          </w:p>
+        </w:tc>
+        <w:tc>
+          <w:tcPr>
+            <w:tcW w:type="dxa" w:w="2484"/>
+          </w:tcPr>
+          <w:p>
+            <w:r>
+              <w:rPr>
+                <w:sz w:val="19"/>
+              </w:rPr>
+              <w:t>٥٥.٠٠٪</w:t>
+            </w:r>
+          </w:p>
+        </w:tc>
+        <w:tc>
+          <w:tcPr>
+            <w:tcW w:type="dxa" w:w="2484"/>
+          </w:tcPr>
+          <w:p>
+            <w:r>
+              <w:rPr>
+                <w:sz w:val="19"/>
+              </w:rPr>
+              <w:t>٨.٢٥ من ١٥</w:t>
             </w:r>
           </w:p>
         </w:tc>
@@ -215,23 +449,57 @@
       <w:tr>
         <w:tc>
           <w:tcPr>
-            <w:tcW w:type="dxa" w:w="4802"/>
+            <w:tcW w:type="dxa" w:w="2484"/>
             <w:shd w:fill="F8F6F0"/>
           </w:tcPr>
           <w:p>
             <w:r>
-              <w:t>٤. التدقيق الأدائي والتقييم الاستراتيجي الشامل (BSC)</w:t>
+              <w:rPr>
+                <w:sz w:val="19"/>
+              </w:rPr>
+              <w:t>٤. محور الحوكمة والقدرات المؤسسية</w:t>
             </w:r>
           </w:p>
         </w:tc>
         <w:tc>
           <w:tcPr>
-            <w:tcW w:type="dxa" w:w="4802"/>
+            <w:tcW w:type="dxa" w:w="2484"/>
             <w:shd w:fill="F8F6F0"/>
           </w:tcPr>
           <w:p>
             <w:r>
-              <w:t>ص ٥</w:t>
+              <w:rPr>
+                <w:sz w:val="19"/>
+              </w:rPr>
+              <w:t>١٥٪</w:t>
+            </w:r>
+          </w:p>
+        </w:tc>
+        <w:tc>
+          <w:tcPr>
+            <w:tcW w:type="dxa" w:w="2484"/>
+            <w:shd w:fill="F8F6F0"/>
+          </w:tcPr>
+          <w:p>
+            <w:r>
+              <w:rPr>
+                <w:sz w:val="19"/>
+              </w:rPr>
+              <w:t>٦٠.٠٠٪</w:t>
+            </w:r>
+          </w:p>
+        </w:tc>
+        <w:tc>
+          <w:tcPr>
+            <w:tcW w:type="dxa" w:w="2484"/>
+            <w:shd w:fill="F8F6F0"/>
+          </w:tcPr>
+          <w:p>
+            <w:r>
+              <w:rPr>
+                <w:sz w:val="19"/>
+              </w:rPr>
+              <w:t>٩.٠٠ من ١٥</w:t>
             </w:r>
           </w:p>
         </w:tc>
@@ -239,229 +507,61 @@
       <w:tr>
         <w:tc>
           <w:tcPr>
-            <w:tcW w:type="dxa" w:w="4802"/>
+            <w:tcW w:type="dxa" w:w="2484"/>
+            <w:shd w:fill="E8DFC8"/>
           </w:tcPr>
           <w:p>
             <w:r>
-              <w:t>٥. مصفوفة مطابقة الخطة الاستراتيجية بالمنجز الفعلي (١٤ مؤشراً)</w:t>
+              <w:rPr>
+                <w:b/>
+                <w:sz w:val="19"/>
+              </w:rPr>
+              <w:t>الإجمالي العام الموزون للأداء الاستراتيجي (H1 2026)</w:t>
             </w:r>
           </w:p>
         </w:tc>
         <w:tc>
           <w:tcPr>
-            <w:tcW w:type="dxa" w:w="4802"/>
+            <w:tcW w:type="dxa" w:w="2484"/>
+            <w:shd w:fill="E8DFC8"/>
           </w:tcPr>
           <w:p>
             <w:r>
-              <w:t>ص ٦</w:t>
-            </w:r>
-          </w:p>
-        </w:tc>
-      </w:tr>
-      <w:tr>
-        <w:tc>
-          <w:tcPr>
-            <w:tcW w:type="dxa" w:w="4802"/>
-            <w:shd w:fill="F8F6F0"/>
-          </w:tcPr>
-          <w:p>
-            <w:r>
-              <w:t>٦. حالة محفظة البرامج الاستراتيجية الـ (١٠)</w:t>
+              <w:rPr>
+                <w:b/>
+                <w:sz w:val="19"/>
+              </w:rPr>
+              <w:t>١٠٠٪</w:t>
             </w:r>
           </w:p>
         </w:tc>
         <w:tc>
           <w:tcPr>
-            <w:tcW w:type="dxa" w:w="4802"/>
-            <w:shd w:fill="F8F6F0"/>
+            <w:tcW w:type="dxa" w:w="2484"/>
+            <w:shd w:fill="E8DFC8"/>
           </w:tcPr>
           <w:p>
             <w:r>
-              <w:t>ص ٧</w:t>
-            </w:r>
-          </w:p>
-        </w:tc>
-      </w:tr>
-      <w:tr>
-        <w:tc>
-          <w:tcPr>
-            <w:tcW w:type="dxa" w:w="4802"/>
-          </w:tcPr>
-          <w:p>
-            <w:r>
-              <w:t>٧. تحليل الفجوات الاستراتيجية وإدارة المخاطر</w:t>
+              <w:rPr>
+                <w:b/>
+                <w:sz w:val="19"/>
+              </w:rPr>
+              <w:t>٤١.٧٣٪</w:t>
             </w:r>
           </w:p>
         </w:tc>
         <w:tc>
           <w:tcPr>
-            <w:tcW w:type="dxa" w:w="4802"/>
+            <w:tcW w:type="dxa" w:w="2484"/>
+            <w:shd w:fill="E8DFC8"/>
           </w:tcPr>
           <w:p>
             <w:r>
-              <w:t>ص ٨</w:t>
-            </w:r>
-          </w:p>
-        </w:tc>
-      </w:tr>
-      <w:tr>
-        <w:tc>
-          <w:tcPr>
-            <w:tcW w:type="dxa" w:w="4802"/>
-            <w:shd w:fill="F8F6F0"/>
-          </w:tcPr>
-          <w:p>
-            <w:r>
-              <w:t>٨. التحليل والأداء المالي والموازنة التشغيلية</w:t>
-            </w:r>
-          </w:p>
-        </w:tc>
-        <w:tc>
-          <w:tcPr>
-            <w:tcW w:type="dxa" w:w="4802"/>
-            <w:shd w:fill="F8F6F0"/>
-          </w:tcPr>
-          <w:p>
-            <w:r>
-              <w:t>ص ٩</w:t>
-            </w:r>
-          </w:p>
-        </w:tc>
-      </w:tr>
-      <w:tr>
-        <w:tc>
-          <w:tcPr>
-            <w:tcW w:type="dxa" w:w="4802"/>
-          </w:tcPr>
-          <w:p>
-            <w:r>
-              <w:t>٩. البرامج والمساعدات الطبية وخدمة المستفيدين</w:t>
-            </w:r>
-          </w:p>
-        </w:tc>
-        <w:tc>
-          <w:tcPr>
-            <w:tcW w:type="dxa" w:w="4802"/>
-          </w:tcPr>
-          <w:p>
-            <w:r>
-              <w:t>ص ١٠</w:t>
-            </w:r>
-          </w:p>
-        </w:tc>
-      </w:tr>
-      <w:tr>
-        <w:tc>
-          <w:tcPr>
-            <w:tcW w:type="dxa" w:w="4802"/>
-            <w:shd w:fill="F8F6F0"/>
-          </w:tcPr>
-          <w:p>
-            <w:r>
-              <w:t>١٠. منظومة الشراكات الصحية والمؤسسية (٩ شركاء)</w:t>
-            </w:r>
-          </w:p>
-        </w:tc>
-        <w:tc>
-          <w:tcPr>
-            <w:tcW w:type="dxa" w:w="4802"/>
-            <w:shd w:fill="F8F6F0"/>
-          </w:tcPr>
-          <w:p>
-            <w:r>
-              <w:t>ص ١١</w:t>
-            </w:r>
-          </w:p>
-        </w:tc>
-      </w:tr>
-      <w:tr>
-        <w:tc>
-          <w:tcPr>
-            <w:tcW w:type="dxa" w:w="4802"/>
-          </w:tcPr>
-          <w:p>
-            <w:r>
-              <w:t>١١. الموارد البشرية والتحول المؤسسي والحوكمة</w:t>
-            </w:r>
-          </w:p>
-        </w:tc>
-        <w:tc>
-          <w:tcPr>
-            <w:tcW w:type="dxa" w:w="4802"/>
-          </w:tcPr>
-          <w:p>
-            <w:r>
-              <w:t>ص ١٢</w:t>
-            </w:r>
-          </w:p>
-        </w:tc>
-      </w:tr>
-      <w:tr>
-        <w:tc>
-          <w:tcPr>
-            <w:tcW w:type="dxa" w:w="4802"/>
-            <w:shd w:fill="F8F6F0"/>
-          </w:tcPr>
-          <w:p>
-            <w:r>
-              <w:t>١٢. قصص الأثر الإنساني ورسائل المستفيدين</w:t>
-            </w:r>
-          </w:p>
-        </w:tc>
-        <w:tc>
-          <w:tcPr>
-            <w:tcW w:type="dxa" w:w="4802"/>
-            <w:shd w:fill="F8F6F0"/>
-          </w:tcPr>
-          <w:p>
-            <w:r>
-              <w:t>ص ١٣</w:t>
-            </w:r>
-          </w:p>
-        </w:tc>
-      </w:tr>
-      <w:tr>
-        <w:tc>
-          <w:tcPr>
-            <w:tcW w:type="dxa" w:w="4802"/>
-          </w:tcPr>
-          <w:p>
-            <w:r>
-              <w:t>١٣. خارطة طريق التصحيح والتوصيات الاستراتيجية (H2 2026)</w:t>
-            </w:r>
-          </w:p>
-        </w:tc>
-        <w:tc>
-          <w:tcPr>
-            <w:tcW w:type="dxa" w:w="4802"/>
-          </w:tcPr>
-          <w:p>
-            <w:r>
-              <w:t>ص ١٤</w:t>
-            </w:r>
-          </w:p>
-        </w:tc>
-      </w:tr>
-      <w:tr>
-        <w:tc>
-          <w:tcPr>
-            <w:tcW w:type="dxa" w:w="4802"/>
-            <w:shd w:fill="F8F6F0"/>
-          </w:tcPr>
-          <w:p>
-            <w:r>
-              <w:t>١٤. الملاحق التفصيلية (الداعمون، والأصول الثابتة)</w:t>
-            </w:r>
-          </w:p>
-        </w:tc>
-        <w:tc>
-          <w:tcPr>
-            <w:tcW w:type="dxa" w:w="4802"/>
-            <w:shd w:fill="F8F6F0"/>
-          </w:tcPr>
-          <w:p>
-            <w:r>
-              <w:t>ص ١٥</w:t>
+              <w:rPr>
+                <w:b/>
+                <w:sz w:val="19"/>
+              </w:rPr>
+              <w:t>٤١.٧٣ من ١٠٠ (بعد مواءمة المستهدف)</w:t>
             </w:r>
           </w:p>
         </w:tc>
@@ -474,7 +574,7 @@
     </w:p>
     <w:p>
       <w:pPr>
-        <w:pStyle w:val="Heading1"/>
+        <w:spacing w:before="280" w:after="120"/>
         <w:jc w:val="right"/>
       </w:pPr>
       <w:r>
@@ -482,141 +582,9 @@
           <w:rFonts w:ascii="Arial" w:hAnsi="Arial"/>
           <w:b/>
           <w:color w:val="6B1D3A"/>
-          <w:sz w:val="32"/>
+          <w:sz w:val="34"/>
         </w:rPr>
-        <w:t>القيادة الرشيدة ومجلس الإدارة</w:t>
-      </w:r>
-    </w:p>
-    <w:p>
-      <w:pPr>
-        <w:spacing w:after="100" w:line="288" w:lineRule="auto"/>
-        <w:jc w:val="right"/>
-      </w:pPr>
-      <w:r>
-        <w:rPr>
-          <w:rFonts w:ascii="Arial" w:hAnsi="Arial"/>
-          <w:b/>
-          <w:i w:val="0"/>
-          <w:color w:val="6B1D3A"/>
-          <w:sz w:val="24"/>
-        </w:rPr>
-        <w:t>• صاحب السمو الملكي الأمير محمد بن سلمان بن عبدالعزيز - ولي العهد رئيس مجلس الوزراء</w:t>
-      </w:r>
-    </w:p>
-    <w:p>
-      <w:pPr>
-        <w:spacing w:after="100" w:line="288" w:lineRule="auto"/>
-        <w:jc w:val="right"/>
-      </w:pPr>
-      <w:r>
-        <w:rPr>
-          <w:rFonts w:ascii="Arial" w:hAnsi="Arial"/>
-          <w:b w:val="0"/>
-          <w:i/>
-          <w:color w:val="2D2D2D"/>
-          <w:sz w:val="21"/>
-        </w:rPr>
-        <w:t>«نهدف للوصول إلى قطاع غير ربحي مهم، مبادر وداعم ومؤثر في التعليم والصحة والثقافة والمجالات البحثية، وسنعتمد عليه بشكل رئيسي.»</w:t>
-      </w:r>
-    </w:p>
-    <w:p>
-      <w:pPr>
-        <w:spacing w:after="100" w:line="288" w:lineRule="auto"/>
-        <w:jc w:val="right"/>
-      </w:pPr>
-      <w:r>
-        <w:rPr>
-          <w:rFonts w:ascii="Arial" w:hAnsi="Arial"/>
-          <w:b/>
-          <w:i w:val="0"/>
-          <w:color w:val="6B1D3A"/>
-          <w:sz w:val="24"/>
-        </w:rPr>
-        <w:t>• خادم الحرمين الشريفين الملك سلمان بن عبدالعزيز آل سعود - ملك المملكة العربية السعودية</w:t>
-      </w:r>
-    </w:p>
-    <w:p>
-      <w:pPr>
-        <w:spacing w:after="100" w:line="288" w:lineRule="auto"/>
-        <w:jc w:val="right"/>
-      </w:pPr>
-      <w:r>
-        <w:rPr>
-          <w:rFonts w:ascii="Arial" w:hAnsi="Arial"/>
-          <w:b w:val="0"/>
-          <w:i/>
-          <w:color w:val="2D2D2D"/>
-          <w:sz w:val="21"/>
-        </w:rPr>
-        <w:t>«ما يميز هذه البلاد هو حرص قادتها على الخير والتشجيع عليه، وما نراه من مؤسسات خيرية في مختلف المجالات… إلا جانبًا من الجوانب المشرقة لبلادنا.»</w:t>
-      </w:r>
-    </w:p>
-    <w:p>
-      <w:pPr>
-        <w:spacing w:after="100" w:line="288" w:lineRule="auto"/>
-        <w:jc w:val="right"/>
-      </w:pPr>
-      <w:r>
-        <w:rPr>
-          <w:rFonts w:ascii="Arial" w:hAnsi="Arial"/>
-          <w:b/>
-          <w:i w:val="0"/>
-          <w:color w:val="6B1D3A"/>
-          <w:sz w:val="24"/>
-        </w:rPr>
-        <w:t>• صاحب السمو الملكي الأمير سلمان بن سلطان بن عبدالعزيز - أمير منطقة المدينة المنورة</w:t>
-      </w:r>
-    </w:p>
-    <w:p>
-      <w:pPr>
-        <w:spacing w:after="100" w:line="288" w:lineRule="auto"/>
-        <w:jc w:val="right"/>
-      </w:pPr>
-      <w:r>
-        <w:rPr>
-          <w:rFonts w:ascii="Arial" w:hAnsi="Arial"/>
-          <w:b w:val="0"/>
-          <w:i/>
-          <w:color w:val="2D2D2D"/>
-          <w:sz w:val="21"/>
-        </w:rPr>
-        <w:t>«نسعد بالإنجازات التي حققتها الجمعيات الأهلية على مستوى المنطقة باعتبارها شريكًا استراتيجيًا للقطاعين العام والخاص في تحسين جودة الحياة.»</w:t>
-      </w:r>
-    </w:p>
-    <w:p>
-      <w:r>
-        <w:br w:type="page"/>
-      </w:r>
-    </w:p>
-    <w:p>
-      <w:pPr>
-        <w:pStyle w:val="Heading1"/>
-        <w:jc w:val="right"/>
-      </w:pPr>
-      <w:r>
-        <w:rPr>
-          <w:rFonts w:ascii="Arial" w:hAnsi="Arial"/>
-          <w:b/>
-          <w:color w:val="6B1D3A"/>
-          <w:sz w:val="32"/>
-        </w:rPr>
-        <w:t>التدقيق الأدائي والتقييم الاستراتيجي الشامل (BSC Evaluation)</w:t>
-      </w:r>
-    </w:p>
-    <w:p>
-      <w:pPr>
-        <w:spacing w:after="100" w:line="288" w:lineRule="auto"/>
-        <w:jc w:val="right"/>
-      </w:pPr>
-      <w:r>
-        <w:rPr>
-          <w:rFonts w:ascii="Arial" w:hAnsi="Arial"/>
-          <w:b w:val="0"/>
-          <w:i w:val="0"/>
-          <w:color w:val="2D2D2D"/>
-          <w:sz w:val="22"/>
-        </w:rPr>
-        <w:t>بناءً على الفحص المستندي المقارن بين مستهدفات الخطة الاستراتيجية والتشغيلية والمنجزات الفعلية للنصف الأول ٢٠٢٦م:</w:t>
+        <w:t>ثالثاً: مصفوفة مطابقة الخطة الاستراتيجية بالمنجز الفعلي (١٤ مؤشراً معتمداً)</w:t>
       </w:r>
     </w:p>
     <w:tbl>
@@ -626,368 +594,19 @@
         <w:tblLook w:firstColumn="1" w:firstRow="1" w:lastColumn="0" w:lastRow="0" w:noHBand="0" w:noVBand="1" w:val="04A0"/>
       </w:tblPr>
       <w:tblGrid>
-        <w:gridCol w:w="2401"/>
-        <w:gridCol w:w="2401"/>
-        <w:gridCol w:w="2401"/>
-        <w:gridCol w:w="2401"/>
+        <w:gridCol w:w="1242"/>
+        <w:gridCol w:w="1242"/>
+        <w:gridCol w:w="1242"/>
+        <w:gridCol w:w="1242"/>
+        <w:gridCol w:w="1242"/>
+        <w:gridCol w:w="1242"/>
+        <w:gridCol w:w="1242"/>
+        <w:gridCol w:w="1242"/>
       </w:tblGrid>
       <w:tr>
         <w:tc>
           <w:tcPr>
-            <w:tcW w:type="dxa" w:w="2401"/>
-            <w:shd w:fill="6B1D3A"/>
-          </w:tcPr>
-          <w:p>
-            <w:r>
-              <w:rPr>
-                <w:b/>
-                <w:color w:val="FFFFFF"/>
-              </w:rPr>
-              <w:t>المحور الاستراتيجي (BSC)</w:t>
-            </w:r>
-          </w:p>
-        </w:tc>
-        <w:tc>
-          <w:tcPr>
-            <w:tcW w:type="dxa" w:w="2401"/>
-            <w:shd w:fill="6B1D3A"/>
-          </w:tcPr>
-          <w:p>
-            <w:r>
-              <w:rPr>
-                <w:b/>
-                <w:color w:val="FFFFFF"/>
-              </w:rPr>
-              <w:t>الوزن النسبي</w:t>
-            </w:r>
-          </w:p>
-        </w:tc>
-        <w:tc>
-          <w:tcPr>
-            <w:tcW w:type="dxa" w:w="2401"/>
-            <w:shd w:fill="6B1D3A"/>
-          </w:tcPr>
-          <w:p>
-            <w:r>
-              <w:rPr>
-                <w:b/>
-                <w:color w:val="FFFFFF"/>
-              </w:rPr>
-              <w:t>نسبة إنجاز H1</w:t>
-            </w:r>
-          </w:p>
-        </w:tc>
-        <w:tc>
-          <w:tcPr>
-            <w:tcW w:type="dxa" w:w="2401"/>
-            <w:shd w:fill="6B1D3A"/>
-          </w:tcPr>
-          <w:p>
-            <w:r>
-              <w:rPr>
-                <w:b/>
-                <w:color w:val="FFFFFF"/>
-              </w:rPr>
-              <w:t>الدرجة الموزونة المحققة</w:t>
-            </w:r>
-          </w:p>
-        </w:tc>
-      </w:tr>
-      <w:tr>
-        <w:tc>
-          <w:tcPr>
-            <w:tcW w:type="dxa" w:w="2401"/>
-          </w:tcPr>
-          <w:p>
-            <w:r>
-              <w:t>١. محور الأثر والبرامج الطبية</w:t>
-            </w:r>
-          </w:p>
-        </w:tc>
-        <w:tc>
-          <w:tcPr>
-            <w:tcW w:type="dxa" w:w="2401"/>
-          </w:tcPr>
-          <w:p>
-            <w:r>
-              <w:t>٤٠٪</w:t>
-            </w:r>
-          </w:p>
-        </w:tc>
-        <w:tc>
-          <w:tcPr>
-            <w:tcW w:type="dxa" w:w="2401"/>
-          </w:tcPr>
-          <w:p>
-            <w:r>
-              <w:t>١٣.٩٥٪</w:t>
-            </w:r>
-          </w:p>
-        </w:tc>
-        <w:tc>
-          <w:tcPr>
-            <w:tcW w:type="dxa" w:w="2401"/>
-          </w:tcPr>
-          <w:p>
-            <w:r>
-              <w:t>٥.٥٨ من ٤٠</w:t>
-            </w:r>
-          </w:p>
-        </w:tc>
-      </w:tr>
-      <w:tr>
-        <w:tc>
-          <w:tcPr>
-            <w:tcW w:type="dxa" w:w="2401"/>
-            <w:shd w:fill="F8F6F0"/>
-          </w:tcPr>
-          <w:p>
-            <w:r>
-              <w:t>٢. المحور المالي والموازنة التشغيلية</w:t>
-            </w:r>
-          </w:p>
-        </w:tc>
-        <w:tc>
-          <w:tcPr>
-            <w:tcW w:type="dxa" w:w="2401"/>
-            <w:shd w:fill="F8F6F0"/>
-          </w:tcPr>
-          <w:p>
-            <w:r>
-              <w:t>٣٠٪</w:t>
-            </w:r>
-          </w:p>
-        </w:tc>
-        <w:tc>
-          <w:tcPr>
-            <w:tcW w:type="dxa" w:w="2401"/>
-            <w:shd w:fill="F8F6F0"/>
-          </w:tcPr>
-          <w:p>
-            <w:r>
-              <w:t>٣٢.٩٦٪</w:t>
-            </w:r>
-          </w:p>
-        </w:tc>
-        <w:tc>
-          <w:tcPr>
-            <w:tcW w:type="dxa" w:w="2401"/>
-            <w:shd w:fill="F8F6F0"/>
-          </w:tcPr>
-          <w:p>
-            <w:r>
-              <w:t>٩.٨٩ من ٣٠</w:t>
-            </w:r>
-          </w:p>
-        </w:tc>
-      </w:tr>
-      <w:tr>
-        <w:tc>
-          <w:tcPr>
-            <w:tcW w:type="dxa" w:w="2401"/>
-          </w:tcPr>
-          <w:p>
-            <w:r>
-              <w:t>٣. محور الشراكات والعمليات الداخلية</w:t>
-            </w:r>
-          </w:p>
-        </w:tc>
-        <w:tc>
-          <w:tcPr>
-            <w:tcW w:type="dxa" w:w="2401"/>
-          </w:tcPr>
-          <w:p>
-            <w:r>
-              <w:t>١٥٪</w:t>
-            </w:r>
-          </w:p>
-        </w:tc>
-        <w:tc>
-          <w:tcPr>
-            <w:tcW w:type="dxa" w:w="2401"/>
-          </w:tcPr>
-          <w:p>
-            <w:r>
-              <w:t>٥٥.٠٠٪</w:t>
-            </w:r>
-          </w:p>
-        </w:tc>
-        <w:tc>
-          <w:tcPr>
-            <w:tcW w:type="dxa" w:w="2401"/>
-          </w:tcPr>
-          <w:p>
-            <w:r>
-              <w:t>٨.٢٥ من ١٥</w:t>
-            </w:r>
-          </w:p>
-        </w:tc>
-      </w:tr>
-      <w:tr>
-        <w:tc>
-          <w:tcPr>
-            <w:tcW w:type="dxa" w:w="2401"/>
-            <w:shd w:fill="F8F6F0"/>
-          </w:tcPr>
-          <w:p>
-            <w:r>
-              <w:t>٤. محور الحوكمة والمؤسسية</w:t>
-            </w:r>
-          </w:p>
-        </w:tc>
-        <w:tc>
-          <w:tcPr>
-            <w:tcW w:type="dxa" w:w="2401"/>
-            <w:shd w:fill="F8F6F0"/>
-          </w:tcPr>
-          <w:p>
-            <w:r>
-              <w:t>١٥٪</w:t>
-            </w:r>
-          </w:p>
-        </w:tc>
-        <w:tc>
-          <w:tcPr>
-            <w:tcW w:type="dxa" w:w="2401"/>
-            <w:shd w:fill="F8F6F0"/>
-          </w:tcPr>
-          <w:p>
-            <w:r>
-              <w:t>٦٠.٠٠٪</w:t>
-            </w:r>
-          </w:p>
-        </w:tc>
-        <w:tc>
-          <w:tcPr>
-            <w:tcW w:type="dxa" w:w="2401"/>
-            <w:shd w:fill="F8F6F0"/>
-          </w:tcPr>
-          <w:p>
-            <w:r>
-              <w:t>٩.٠٠ من ١٥</w:t>
-            </w:r>
-          </w:p>
-        </w:tc>
-      </w:tr>
-      <w:tr>
-        <w:tc>
-          <w:tcPr>
-            <w:tcW w:type="dxa" w:w="2401"/>
-            <w:shd w:fill="F4EFE6"/>
-          </w:tcPr>
-          <w:p>
-            <w:r>
-              <w:rPr>
-                <w:b/>
-                <w:color w:val="6B1D3A"/>
-              </w:rPr>
-              <w:t>الإجمالي العام الموزون للأداء الاستراتيجي (H1 2026)</w:t>
-            </w:r>
-          </w:p>
-        </w:tc>
-        <w:tc>
-          <w:tcPr>
-            <w:tcW w:type="dxa" w:w="2401"/>
-            <w:shd w:fill="F4EFE6"/>
-          </w:tcPr>
-          <w:p>
-            <w:r>
-              <w:rPr>
-                <w:b/>
-                <w:color w:val="6B1D3A"/>
-              </w:rPr>
-              <w:t>١٠٠٪</w:t>
-            </w:r>
-          </w:p>
-        </w:tc>
-        <w:tc>
-          <w:tcPr>
-            <w:tcW w:type="dxa" w:w="2401"/>
-            <w:shd w:fill="F4EFE6"/>
-          </w:tcPr>
-          <w:p>
-            <w:r>
-              <w:rPr>
-                <w:b/>
-                <w:color w:val="6B1D3A"/>
-              </w:rPr>
-              <w:t>٣٢.٧٢٪</w:t>
-            </w:r>
-          </w:p>
-        </w:tc>
-        <w:tc>
-          <w:tcPr>
-            <w:tcW w:type="dxa" w:w="2401"/>
-            <w:shd w:fill="F4EFE6"/>
-          </w:tcPr>
-          <w:p>
-            <w:r>
-              <w:rPr>
-                <w:b/>
-                <w:color w:val="6B1D3A"/>
-              </w:rPr>
-              <w:t>٣٢.٧٢ من ١٠٠ (يحتاج تحسين)</w:t>
-            </w:r>
-          </w:p>
-        </w:tc>
-      </w:tr>
-    </w:tbl>
-    <w:p>
-      <w:pPr>
-        <w:spacing w:after="100" w:line="288" w:lineRule="auto"/>
-        <w:jc w:val="right"/>
-      </w:pPr>
-      <w:r>
-        <w:rPr>
-          <w:rFonts w:ascii="Arial" w:hAnsi="Arial"/>
-          <w:b/>
-          <w:i w:val="0"/>
-          <w:color w:val="6B1D3A"/>
-          <w:sz w:val="22"/>
-        </w:rPr>
-        <w:t>التقييم العام المعتمد: «يحتاج إلى تحسين جذري وإعادة ضبط مسار (Needs Significant Improvement &amp; Realignment)» نظراً لفجوة المستفيدين (٧ مرضى فقط مقابل مستهدف ٣٦ ألف) وتعطيل ٩ برامج معتمدة.</w:t>
-      </w:r>
-    </w:p>
-    <w:p>
-      <w:r>
-        <w:br w:type="page"/>
-      </w:r>
-    </w:p>
-    <w:p>
-      <w:pPr>
-        <w:pStyle w:val="Heading1"/>
-        <w:jc w:val="right"/>
-      </w:pPr>
-      <w:r>
-        <w:rPr>
-          <w:rFonts w:ascii="Arial" w:hAnsi="Arial"/>
-          <w:b/>
-          <w:color w:val="6B1D3A"/>
-          <w:sz w:val="32"/>
-        </w:rPr>
-        <w:t>مصفوفة مطابقة الخطة الاستراتيجية بالمنجز الفعلي (١٤ مؤشراً معتمداً)</w:t>
-      </w:r>
-    </w:p>
-    <w:tbl>
-      <w:tblPr>
-        <w:tblW w:type="auto" w:w="0"/>
-        <w:jc w:val="center"/>
-        <w:tblLook w:firstColumn="1" w:firstRow="1" w:lastColumn="0" w:lastRow="0" w:noHBand="0" w:noVBand="1" w:val="04A0"/>
-      </w:tblPr>
-      <w:tblGrid>
-        <w:gridCol w:w="1201"/>
-        <w:gridCol w:w="1201"/>
-        <w:gridCol w:w="1201"/>
-        <w:gridCol w:w="1201"/>
-        <w:gridCol w:w="1201"/>
-        <w:gridCol w:w="1201"/>
-        <w:gridCol w:w="1201"/>
-        <w:gridCol w:w="1201"/>
-      </w:tblGrid>
-      <w:tr>
-        <w:tc>
-          <w:tcPr>
-            <w:tcW w:type="dxa" w:w="1201"/>
+            <w:tcW w:type="dxa" w:w="1242"/>
             <w:shd w:fill="6B1D3A"/>
           </w:tcPr>
           <w:p>
@@ -1003,7 +622,7 @@
         </w:tc>
         <w:tc>
           <w:tcPr>
-            <w:tcW w:type="dxa" w:w="1201"/>
+            <w:tcW w:type="dxa" w:w="1242"/>
             <w:shd w:fill="6B1D3A"/>
           </w:tcPr>
           <w:p>
@@ -1019,7 +638,7 @@
         </w:tc>
         <w:tc>
           <w:tcPr>
-            <w:tcW w:type="dxa" w:w="1201"/>
+            <w:tcW w:type="dxa" w:w="1242"/>
             <w:shd w:fill="6B1D3A"/>
           </w:tcPr>
           <w:p>
@@ -1035,7 +654,7 @@
         </w:tc>
         <w:tc>
           <w:tcPr>
-            <w:tcW w:type="dxa" w:w="1201"/>
+            <w:tcW w:type="dxa" w:w="1242"/>
             <w:shd w:fill="6B1D3A"/>
           </w:tcPr>
           <w:p>
@@ -1051,7 +670,7 @@
         </w:tc>
         <w:tc>
           <w:tcPr>
-            <w:tcW w:type="dxa" w:w="1201"/>
+            <w:tcW w:type="dxa" w:w="1242"/>
             <w:shd w:fill="6B1D3A"/>
           </w:tcPr>
           <w:p>
@@ -1067,7 +686,7 @@
         </w:tc>
         <w:tc>
           <w:tcPr>
-            <w:tcW w:type="dxa" w:w="1201"/>
+            <w:tcW w:type="dxa" w:w="1242"/>
             <w:shd w:fill="6B1D3A"/>
           </w:tcPr>
           <w:p>
@@ -1083,7 +702,7 @@
         </w:tc>
         <w:tc>
           <w:tcPr>
-            <w:tcW w:type="dxa" w:w="1201"/>
+            <w:tcW w:type="dxa" w:w="1242"/>
             <w:shd w:fill="6B1D3A"/>
           </w:tcPr>
           <w:p>
@@ -1099,7 +718,7 @@
         </w:tc>
         <w:tc>
           <w:tcPr>
-            <w:tcW w:type="dxa" w:w="1201"/>
+            <w:tcW w:type="dxa" w:w="1242"/>
             <w:shd w:fill="6B1D3A"/>
           </w:tcPr>
           <w:p>
@@ -1117,7 +736,7 @@
       <w:tr>
         <w:tc>
           <w:tcPr>
-            <w:tcW w:type="dxa" w:w="1201"/>
+            <w:tcW w:type="dxa" w:w="1242"/>
           </w:tcPr>
           <w:p>
             <w:r>
@@ -1130,20 +749,20 @@
         </w:tc>
         <w:tc>
           <w:tcPr>
-            <w:tcW w:type="dxa" w:w="1201"/>
+            <w:tcW w:type="dxa" w:w="1242"/>
           </w:tcPr>
           <w:p>
             <w:r>
               <w:rPr>
                 <w:sz w:val="17"/>
               </w:rPr>
-              <w:t>الإيرادات الكلية للجمعية</w:t>
+              <w:t>الإيرادات الكلية (المعدلة)</w:t>
             </w:r>
           </w:p>
         </w:tc>
         <w:tc>
           <w:tcPr>
-            <w:tcW w:type="dxa" w:w="1201"/>
+            <w:tcW w:type="dxa" w:w="1242"/>
           </w:tcPr>
           <w:p>
             <w:r>
@@ -1156,33 +775,33 @@
         </w:tc>
         <w:tc>
           <w:tcPr>
-            <w:tcW w:type="dxa" w:w="1201"/>
+            <w:tcW w:type="dxa" w:w="1242"/>
           </w:tcPr>
           <w:p>
             <w:r>
               <w:rPr>
                 <w:sz w:val="17"/>
               </w:rPr>
-              <w:t>٦,٨٤٦,٠٠٠</w:t>
+              <w:t>١,٥٢٧,٠٠٠</w:t>
             </w:r>
           </w:p>
         </w:tc>
         <w:tc>
           <w:tcPr>
-            <w:tcW w:type="dxa" w:w="1201"/>
+            <w:tcW w:type="dxa" w:w="1242"/>
           </w:tcPr>
           <w:p>
             <w:r>
               <w:rPr>
                 <w:sz w:val="17"/>
               </w:rPr>
-              <w:t>٣,٤٢٣,٠٠٠</w:t>
+              <w:t>٧٦٣,٥٠٠</w:t>
             </w:r>
           </w:p>
         </w:tc>
         <w:tc>
           <w:tcPr>
-            <w:tcW w:type="dxa" w:w="1201"/>
+            <w:tcW w:type="dxa" w:w="1242"/>
           </w:tcPr>
           <w:p>
             <w:r>
@@ -1195,27 +814,27 @@
         </w:tc>
         <w:tc>
           <w:tcPr>
-            <w:tcW w:type="dxa" w:w="1201"/>
+            <w:tcW w:type="dxa" w:w="1242"/>
           </w:tcPr>
           <w:p>
             <w:r>
               <w:rPr>
                 <w:sz w:val="17"/>
               </w:rPr>
-              <w:t>١٧.٠١٪</w:t>
+              <w:t>٧٦.٢٥٪</w:t>
             </w:r>
           </w:p>
         </w:tc>
         <w:tc>
           <w:tcPr>
-            <w:tcW w:type="dxa" w:w="1201"/>
+            <w:tcW w:type="dxa" w:w="1242"/>
           </w:tcPr>
           <w:p>
             <w:r>
               <w:rPr>
                 <w:sz w:val="17"/>
               </w:rPr>
-              <w:t>متأخر حرِج</w:t>
+              <w:t>متقدم وجيد</w:t>
             </w:r>
           </w:p>
         </w:tc>
@@ -1223,7 +842,7 @@
       <w:tr>
         <w:tc>
           <w:tcPr>
-            <w:tcW w:type="dxa" w:w="1201"/>
+            <w:tcW w:type="dxa" w:w="1242"/>
             <w:shd w:fill="F8F6F0"/>
           </w:tcPr>
           <w:p>
@@ -1237,7 +856,7 @@
         </w:tc>
         <w:tc>
           <w:tcPr>
-            <w:tcW w:type="dxa" w:w="1201"/>
+            <w:tcW w:type="dxa" w:w="1242"/>
             <w:shd w:fill="F8F6F0"/>
           </w:tcPr>
           <w:p>
@@ -1251,7 +870,7 @@
         </w:tc>
         <w:tc>
           <w:tcPr>
-            <w:tcW w:type="dxa" w:w="1201"/>
+            <w:tcW w:type="dxa" w:w="1242"/>
             <w:shd w:fill="F8F6F0"/>
           </w:tcPr>
           <w:p>
@@ -1265,7 +884,7 @@
         </w:tc>
         <w:tc>
           <w:tcPr>
-            <w:tcW w:type="dxa" w:w="1201"/>
+            <w:tcW w:type="dxa" w:w="1242"/>
             <w:shd w:fill="F8F6F0"/>
           </w:tcPr>
           <w:p>
@@ -1279,7 +898,7 @@
         </w:tc>
         <w:tc>
           <w:tcPr>
-            <w:tcW w:type="dxa" w:w="1201"/>
+            <w:tcW w:type="dxa" w:w="1242"/>
             <w:shd w:fill="F8F6F0"/>
           </w:tcPr>
           <w:p>
@@ -1293,7 +912,7 @@
         </w:tc>
         <w:tc>
           <w:tcPr>
-            <w:tcW w:type="dxa" w:w="1201"/>
+            <w:tcW w:type="dxa" w:w="1242"/>
             <w:shd w:fill="F8F6F0"/>
           </w:tcPr>
           <w:p>
@@ -1307,7 +926,7 @@
         </w:tc>
         <w:tc>
           <w:tcPr>
-            <w:tcW w:type="dxa" w:w="1201"/>
+            <w:tcW w:type="dxa" w:w="1242"/>
             <w:shd w:fill="F8F6F0"/>
           </w:tcPr>
           <w:p>
@@ -1321,7 +940,7 @@
         </w:tc>
         <w:tc>
           <w:tcPr>
-            <w:tcW w:type="dxa" w:w="1201"/>
+            <w:tcW w:type="dxa" w:w="1242"/>
             <w:shd w:fill="F8F6F0"/>
           </w:tcPr>
           <w:p>
@@ -1337,7 +956,7 @@
       <w:tr>
         <w:tc>
           <w:tcPr>
-            <w:tcW w:type="dxa" w:w="1201"/>
+            <w:tcW w:type="dxa" w:w="1242"/>
           </w:tcPr>
           <w:p>
             <w:r>
@@ -1350,7 +969,7 @@
         </w:tc>
         <w:tc>
           <w:tcPr>
-            <w:tcW w:type="dxa" w:w="1201"/>
+            <w:tcW w:type="dxa" w:w="1242"/>
           </w:tcPr>
           <w:p>
             <w:r>
@@ -1363,7 +982,7 @@
         </w:tc>
         <w:tc>
           <w:tcPr>
-            <w:tcW w:type="dxa" w:w="1201"/>
+            <w:tcW w:type="dxa" w:w="1242"/>
           </w:tcPr>
           <w:p>
             <w:r>
@@ -1376,7 +995,7 @@
         </w:tc>
         <w:tc>
           <w:tcPr>
-            <w:tcW w:type="dxa" w:w="1201"/>
+            <w:tcW w:type="dxa" w:w="1242"/>
           </w:tcPr>
           <w:p>
             <w:r>
@@ -1389,7 +1008,7 @@
         </w:tc>
         <w:tc>
           <w:tcPr>
-            <w:tcW w:type="dxa" w:w="1201"/>
+            <w:tcW w:type="dxa" w:w="1242"/>
           </w:tcPr>
           <w:p>
             <w:r>
@@ -1402,7 +1021,7 @@
         </w:tc>
         <w:tc>
           <w:tcPr>
-            <w:tcW w:type="dxa" w:w="1201"/>
+            <w:tcW w:type="dxa" w:w="1242"/>
           </w:tcPr>
           <w:p>
             <w:r>
@@ -1415,7 +1034,7 @@
         </w:tc>
         <w:tc>
           <w:tcPr>
-            <w:tcW w:type="dxa" w:w="1201"/>
+            <w:tcW w:type="dxa" w:w="1242"/>
           </w:tcPr>
           <w:p>
             <w:r>
@@ -1428,7 +1047,7 @@
         </w:tc>
         <w:tc>
           <w:tcPr>
-            <w:tcW w:type="dxa" w:w="1201"/>
+            <w:tcW w:type="dxa" w:w="1242"/>
           </w:tcPr>
           <w:p>
             <w:r>
@@ -1443,7 +1062,7 @@
       <w:tr>
         <w:tc>
           <w:tcPr>
-            <w:tcW w:type="dxa" w:w="1201"/>
+            <w:tcW w:type="dxa" w:w="1242"/>
             <w:shd w:fill="F8F6F0"/>
           </w:tcPr>
           <w:p>
@@ -1457,7 +1076,7 @@
         </w:tc>
         <w:tc>
           <w:tcPr>
-            <w:tcW w:type="dxa" w:w="1201"/>
+            <w:tcW w:type="dxa" w:w="1242"/>
             <w:shd w:fill="F8F6F0"/>
           </w:tcPr>
           <w:p>
@@ -1471,7 +1090,7 @@
         </w:tc>
         <w:tc>
           <w:tcPr>
-            <w:tcW w:type="dxa" w:w="1201"/>
+            <w:tcW w:type="dxa" w:w="1242"/>
             <w:shd w:fill="F8F6F0"/>
           </w:tcPr>
           <w:p>
@@ -1485,7 +1104,7 @@
         </w:tc>
         <w:tc>
           <w:tcPr>
-            <w:tcW w:type="dxa" w:w="1201"/>
+            <w:tcW w:type="dxa" w:w="1242"/>
             <w:shd w:fill="F8F6F0"/>
           </w:tcPr>
           <w:p>
@@ -1499,7 +1118,7 @@
         </w:tc>
         <w:tc>
           <w:tcPr>
-            <w:tcW w:type="dxa" w:w="1201"/>
+            <w:tcW w:type="dxa" w:w="1242"/>
             <w:shd w:fill="F8F6F0"/>
           </w:tcPr>
           <w:p>
@@ -1513,7 +1132,7 @@
         </w:tc>
         <w:tc>
           <w:tcPr>
-            <w:tcW w:type="dxa" w:w="1201"/>
+            <w:tcW w:type="dxa" w:w="1242"/>
             <w:shd w:fill="F8F6F0"/>
           </w:tcPr>
           <w:p>
@@ -1527,7 +1146,7 @@
         </w:tc>
         <w:tc>
           <w:tcPr>
-            <w:tcW w:type="dxa" w:w="1201"/>
+            <w:tcW w:type="dxa" w:w="1242"/>
             <w:shd w:fill="F8F6F0"/>
           </w:tcPr>
           <w:p>
@@ -1541,7 +1160,7 @@
         </w:tc>
         <w:tc>
           <w:tcPr>
-            <w:tcW w:type="dxa" w:w="1201"/>
+            <w:tcW w:type="dxa" w:w="1242"/>
             <w:shd w:fill="F8F6F0"/>
           </w:tcPr>
           <w:p>
@@ -1557,7 +1176,7 @@
       <w:tr>
         <w:tc>
           <w:tcPr>
-            <w:tcW w:type="dxa" w:w="1201"/>
+            <w:tcW w:type="dxa" w:w="1242"/>
           </w:tcPr>
           <w:p>
             <w:r>
@@ -1570,7 +1189,7 @@
         </w:tc>
         <w:tc>
           <w:tcPr>
-            <w:tcW w:type="dxa" w:w="1201"/>
+            <w:tcW w:type="dxa" w:w="1242"/>
           </w:tcPr>
           <w:p>
             <w:r>
@@ -1583,7 +1202,7 @@
         </w:tc>
         <w:tc>
           <w:tcPr>
-            <w:tcW w:type="dxa" w:w="1201"/>
+            <w:tcW w:type="dxa" w:w="1242"/>
           </w:tcPr>
           <w:p>
             <w:r>
@@ -1596,7 +1215,7 @@
         </w:tc>
         <w:tc>
           <w:tcPr>
-            <w:tcW w:type="dxa" w:w="1201"/>
+            <w:tcW w:type="dxa" w:w="1242"/>
           </w:tcPr>
           <w:p>
             <w:r>
@@ -1609,7 +1228,7 @@
         </w:tc>
         <w:tc>
           <w:tcPr>
-            <w:tcW w:type="dxa" w:w="1201"/>
+            <w:tcW w:type="dxa" w:w="1242"/>
           </w:tcPr>
           <w:p>
             <w:r>
@@ -1622,7 +1241,7 @@
         </w:tc>
         <w:tc>
           <w:tcPr>
-            <w:tcW w:type="dxa" w:w="1201"/>
+            <w:tcW w:type="dxa" w:w="1242"/>
           </w:tcPr>
           <w:p>
             <w:r>
@@ -1635,7 +1254,7 @@
         </w:tc>
         <w:tc>
           <w:tcPr>
-            <w:tcW w:type="dxa" w:w="1201"/>
+            <w:tcW w:type="dxa" w:w="1242"/>
           </w:tcPr>
           <w:p>
             <w:r>
@@ -1648,7 +1267,7 @@
         </w:tc>
         <w:tc>
           <w:tcPr>
-            <w:tcW w:type="dxa" w:w="1201"/>
+            <w:tcW w:type="dxa" w:w="1242"/>
           </w:tcPr>
           <w:p>
             <w:r>
@@ -1663,7 +1282,7 @@
       <w:tr>
         <w:tc>
           <w:tcPr>
-            <w:tcW w:type="dxa" w:w="1201"/>
+            <w:tcW w:type="dxa" w:w="1242"/>
             <w:shd w:fill="F8F6F0"/>
           </w:tcPr>
           <w:p>
@@ -1677,7 +1296,7 @@
         </w:tc>
         <w:tc>
           <w:tcPr>
-            <w:tcW w:type="dxa" w:w="1201"/>
+            <w:tcW w:type="dxa" w:w="1242"/>
             <w:shd w:fill="F8F6F0"/>
           </w:tcPr>
           <w:p>
@@ -1691,7 +1310,7 @@
         </w:tc>
         <w:tc>
           <w:tcPr>
-            <w:tcW w:type="dxa" w:w="1201"/>
+            <w:tcW w:type="dxa" w:w="1242"/>
             <w:shd w:fill="F8F6F0"/>
           </w:tcPr>
           <w:p>
@@ -1705,7 +1324,7 @@
         </w:tc>
         <w:tc>
           <w:tcPr>
-            <w:tcW w:type="dxa" w:w="1201"/>
+            <w:tcW w:type="dxa" w:w="1242"/>
             <w:shd w:fill="F8F6F0"/>
           </w:tcPr>
           <w:p>
@@ -1719,7 +1338,7 @@
         </w:tc>
         <w:tc>
           <w:tcPr>
-            <w:tcW w:type="dxa" w:w="1201"/>
+            <w:tcW w:type="dxa" w:w="1242"/>
             <w:shd w:fill="F8F6F0"/>
           </w:tcPr>
           <w:p>
@@ -1733,7 +1352,7 @@
         </w:tc>
         <w:tc>
           <w:tcPr>
-            <w:tcW w:type="dxa" w:w="1201"/>
+            <w:tcW w:type="dxa" w:w="1242"/>
             <w:shd w:fill="F8F6F0"/>
           </w:tcPr>
           <w:p>
@@ -1747,7 +1366,7 @@
         </w:tc>
         <w:tc>
           <w:tcPr>
-            <w:tcW w:type="dxa" w:w="1201"/>
+            <w:tcW w:type="dxa" w:w="1242"/>
             <w:shd w:fill="F8F6F0"/>
           </w:tcPr>
           <w:p>
@@ -1761,7 +1380,7 @@
         </w:tc>
         <w:tc>
           <w:tcPr>
-            <w:tcW w:type="dxa" w:w="1201"/>
+            <w:tcW w:type="dxa" w:w="1242"/>
             <w:shd w:fill="F8F6F0"/>
           </w:tcPr>
           <w:p>
@@ -1777,7 +1396,7 @@
       <w:tr>
         <w:tc>
           <w:tcPr>
-            <w:tcW w:type="dxa" w:w="1201"/>
+            <w:tcW w:type="dxa" w:w="1242"/>
           </w:tcPr>
           <w:p>
             <w:r>
@@ -1790,7 +1409,7 @@
         </w:tc>
         <w:tc>
           <w:tcPr>
-            <w:tcW w:type="dxa" w:w="1201"/>
+            <w:tcW w:type="dxa" w:w="1242"/>
           </w:tcPr>
           <w:p>
             <w:r>
@@ -1803,7 +1422,7 @@
         </w:tc>
         <w:tc>
           <w:tcPr>
-            <w:tcW w:type="dxa" w:w="1201"/>
+            <w:tcW w:type="dxa" w:w="1242"/>
           </w:tcPr>
           <w:p>
             <w:r>
@@ -1816,7 +1435,7 @@
         </w:tc>
         <w:tc>
           <w:tcPr>
-            <w:tcW w:type="dxa" w:w="1201"/>
+            <w:tcW w:type="dxa" w:w="1242"/>
           </w:tcPr>
           <w:p>
             <w:r>
@@ -1829,7 +1448,7 @@
         </w:tc>
         <w:tc>
           <w:tcPr>
-            <w:tcW w:type="dxa" w:w="1201"/>
+            <w:tcW w:type="dxa" w:w="1242"/>
           </w:tcPr>
           <w:p>
             <w:r>
@@ -1842,7 +1461,7 @@
         </w:tc>
         <w:tc>
           <w:tcPr>
-            <w:tcW w:type="dxa" w:w="1201"/>
+            <w:tcW w:type="dxa" w:w="1242"/>
           </w:tcPr>
           <w:p>
             <w:r>
@@ -1855,7 +1474,7 @@
         </w:tc>
         <w:tc>
           <w:tcPr>
-            <w:tcW w:type="dxa" w:w="1201"/>
+            <w:tcW w:type="dxa" w:w="1242"/>
           </w:tcPr>
           <w:p>
             <w:r>
@@ -1868,7 +1487,7 @@
         </w:tc>
         <w:tc>
           <w:tcPr>
-            <w:tcW w:type="dxa" w:w="1201"/>
+            <w:tcW w:type="dxa" w:w="1242"/>
           </w:tcPr>
           <w:p>
             <w:r>
@@ -1883,7 +1502,7 @@
       <w:tr>
         <w:tc>
           <w:tcPr>
-            <w:tcW w:type="dxa" w:w="1201"/>
+            <w:tcW w:type="dxa" w:w="1242"/>
             <w:shd w:fill="F8F6F0"/>
           </w:tcPr>
           <w:p>
@@ -1897,7 +1516,7 @@
         </w:tc>
         <w:tc>
           <w:tcPr>
-            <w:tcW w:type="dxa" w:w="1201"/>
+            <w:tcW w:type="dxa" w:w="1242"/>
             <w:shd w:fill="F8F6F0"/>
           </w:tcPr>
           <w:p>
@@ -1911,7 +1530,7 @@
         </w:tc>
         <w:tc>
           <w:tcPr>
-            <w:tcW w:type="dxa" w:w="1201"/>
+            <w:tcW w:type="dxa" w:w="1242"/>
             <w:shd w:fill="F8F6F0"/>
           </w:tcPr>
           <w:p>
@@ -1925,7 +1544,7 @@
         </w:tc>
         <w:tc>
           <w:tcPr>
-            <w:tcW w:type="dxa" w:w="1201"/>
+            <w:tcW w:type="dxa" w:w="1242"/>
             <w:shd w:fill="F8F6F0"/>
           </w:tcPr>
           <w:p>
@@ -1939,7 +1558,7 @@
         </w:tc>
         <w:tc>
           <w:tcPr>
-            <w:tcW w:type="dxa" w:w="1201"/>
+            <w:tcW w:type="dxa" w:w="1242"/>
             <w:shd w:fill="F8F6F0"/>
           </w:tcPr>
           <w:p>
@@ -1953,7 +1572,7 @@
         </w:tc>
         <w:tc>
           <w:tcPr>
-            <w:tcW w:type="dxa" w:w="1201"/>
+            <w:tcW w:type="dxa" w:w="1242"/>
             <w:shd w:fill="F8F6F0"/>
           </w:tcPr>
           <w:p>
@@ -1967,7 +1586,7 @@
         </w:tc>
         <w:tc>
           <w:tcPr>
-            <w:tcW w:type="dxa" w:w="1201"/>
+            <w:tcW w:type="dxa" w:w="1242"/>
             <w:shd w:fill="F8F6F0"/>
           </w:tcPr>
           <w:p>
@@ -1981,7 +1600,7 @@
         </w:tc>
         <w:tc>
           <w:tcPr>
-            <w:tcW w:type="dxa" w:w="1201"/>
+            <w:tcW w:type="dxa" w:w="1242"/>
             <w:shd w:fill="F8F6F0"/>
           </w:tcPr>
           <w:p>
@@ -1997,7 +1616,7 @@
       <w:tr>
         <w:tc>
           <w:tcPr>
-            <w:tcW w:type="dxa" w:w="1201"/>
+            <w:tcW w:type="dxa" w:w="1242"/>
           </w:tcPr>
           <w:p>
             <w:r>
@@ -2010,7 +1629,7 @@
         </w:tc>
         <w:tc>
           <w:tcPr>
-            <w:tcW w:type="dxa" w:w="1201"/>
+            <w:tcW w:type="dxa" w:w="1242"/>
           </w:tcPr>
           <w:p>
             <w:r>
@@ -2023,7 +1642,7 @@
         </w:tc>
         <w:tc>
           <w:tcPr>
-            <w:tcW w:type="dxa" w:w="1201"/>
+            <w:tcW w:type="dxa" w:w="1242"/>
           </w:tcPr>
           <w:p>
             <w:r>
@@ -2036,7 +1655,7 @@
         </w:tc>
         <w:tc>
           <w:tcPr>
-            <w:tcW w:type="dxa" w:w="1201"/>
+            <w:tcW w:type="dxa" w:w="1242"/>
           </w:tcPr>
           <w:p>
             <w:r>
@@ -2049,7 +1668,7 @@
         </w:tc>
         <w:tc>
           <w:tcPr>
-            <w:tcW w:type="dxa" w:w="1201"/>
+            <w:tcW w:type="dxa" w:w="1242"/>
           </w:tcPr>
           <w:p>
             <w:r>
@@ -2062,7 +1681,7 @@
         </w:tc>
         <w:tc>
           <w:tcPr>
-            <w:tcW w:type="dxa" w:w="1201"/>
+            <w:tcW w:type="dxa" w:w="1242"/>
           </w:tcPr>
           <w:p>
             <w:r>
@@ -2075,7 +1694,7 @@
         </w:tc>
         <w:tc>
           <w:tcPr>
-            <w:tcW w:type="dxa" w:w="1201"/>
+            <w:tcW w:type="dxa" w:w="1242"/>
           </w:tcPr>
           <w:p>
             <w:r>
@@ -2088,7 +1707,7 @@
         </w:tc>
         <w:tc>
           <w:tcPr>
-            <w:tcW w:type="dxa" w:w="1201"/>
+            <w:tcW w:type="dxa" w:w="1242"/>
           </w:tcPr>
           <w:p>
             <w:r>
@@ -2103,7 +1722,7 @@
       <w:tr>
         <w:tc>
           <w:tcPr>
-            <w:tcW w:type="dxa" w:w="1201"/>
+            <w:tcW w:type="dxa" w:w="1242"/>
             <w:shd w:fill="F8F6F0"/>
           </w:tcPr>
           <w:p>
@@ -2117,7 +1736,7 @@
         </w:tc>
         <w:tc>
           <w:tcPr>
-            <w:tcW w:type="dxa" w:w="1201"/>
+            <w:tcW w:type="dxa" w:w="1242"/>
             <w:shd w:fill="F8F6F0"/>
           </w:tcPr>
           <w:p>
@@ -2131,7 +1750,7 @@
         </w:tc>
         <w:tc>
           <w:tcPr>
-            <w:tcW w:type="dxa" w:w="1201"/>
+            <w:tcW w:type="dxa" w:w="1242"/>
             <w:shd w:fill="F8F6F0"/>
           </w:tcPr>
           <w:p>
@@ -2145,7 +1764,7 @@
         </w:tc>
         <w:tc>
           <w:tcPr>
-            <w:tcW w:type="dxa" w:w="1201"/>
+            <w:tcW w:type="dxa" w:w="1242"/>
             <w:shd w:fill="F8F6F0"/>
           </w:tcPr>
           <w:p>
@@ -2159,7 +1778,7 @@
         </w:tc>
         <w:tc>
           <w:tcPr>
-            <w:tcW w:type="dxa" w:w="1201"/>
+            <w:tcW w:type="dxa" w:w="1242"/>
             <w:shd w:fill="F8F6F0"/>
           </w:tcPr>
           <w:p>
@@ -2173,7 +1792,7 @@
         </w:tc>
         <w:tc>
           <w:tcPr>
-            <w:tcW w:type="dxa" w:w="1201"/>
+            <w:tcW w:type="dxa" w:w="1242"/>
             <w:shd w:fill="F8F6F0"/>
           </w:tcPr>
           <w:p>
@@ -2187,7 +1806,7 @@
         </w:tc>
         <w:tc>
           <w:tcPr>
-            <w:tcW w:type="dxa" w:w="1201"/>
+            <w:tcW w:type="dxa" w:w="1242"/>
             <w:shd w:fill="F8F6F0"/>
           </w:tcPr>
           <w:p>
@@ -2201,7 +1820,7 @@
         </w:tc>
         <w:tc>
           <w:tcPr>
-            <w:tcW w:type="dxa" w:w="1201"/>
+            <w:tcW w:type="dxa" w:w="1242"/>
             <w:shd w:fill="F8F6F0"/>
           </w:tcPr>
           <w:p>
@@ -2217,7 +1836,7 @@
       <w:tr>
         <w:tc>
           <w:tcPr>
-            <w:tcW w:type="dxa" w:w="1201"/>
+            <w:tcW w:type="dxa" w:w="1242"/>
           </w:tcPr>
           <w:p>
             <w:r>
@@ -2230,7 +1849,7 @@
         </w:tc>
         <w:tc>
           <w:tcPr>
-            <w:tcW w:type="dxa" w:w="1201"/>
+            <w:tcW w:type="dxa" w:w="1242"/>
           </w:tcPr>
           <w:p>
             <w:r>
@@ -2243,7 +1862,7 @@
         </w:tc>
         <w:tc>
           <w:tcPr>
-            <w:tcW w:type="dxa" w:w="1201"/>
+            <w:tcW w:type="dxa" w:w="1242"/>
           </w:tcPr>
           <w:p>
             <w:r>
@@ -2256,7 +1875,7 @@
         </w:tc>
         <w:tc>
           <w:tcPr>
-            <w:tcW w:type="dxa" w:w="1201"/>
+            <w:tcW w:type="dxa" w:w="1242"/>
           </w:tcPr>
           <w:p>
             <w:r>
@@ -2269,7 +1888,7 @@
         </w:tc>
         <w:tc>
           <w:tcPr>
-            <w:tcW w:type="dxa" w:w="1201"/>
+            <w:tcW w:type="dxa" w:w="1242"/>
           </w:tcPr>
           <w:p>
             <w:r>
@@ -2282,7 +1901,7 @@
         </w:tc>
         <w:tc>
           <w:tcPr>
-            <w:tcW w:type="dxa" w:w="1201"/>
+            <w:tcW w:type="dxa" w:w="1242"/>
           </w:tcPr>
           <w:p>
             <w:r>
@@ -2295,7 +1914,7 @@
         </w:tc>
         <w:tc>
           <w:tcPr>
-            <w:tcW w:type="dxa" w:w="1201"/>
+            <w:tcW w:type="dxa" w:w="1242"/>
           </w:tcPr>
           <w:p>
             <w:r>
@@ -2308,7 +1927,7 @@
         </w:tc>
         <w:tc>
           <w:tcPr>
-            <w:tcW w:type="dxa" w:w="1201"/>
+            <w:tcW w:type="dxa" w:w="1242"/>
           </w:tcPr>
           <w:p>
             <w:r>
@@ -2323,7 +1942,7 @@
       <w:tr>
         <w:tc>
           <w:tcPr>
-            <w:tcW w:type="dxa" w:w="1201"/>
+            <w:tcW w:type="dxa" w:w="1242"/>
             <w:shd w:fill="F8F6F0"/>
           </w:tcPr>
           <w:p>
@@ -2337,7 +1956,7 @@
         </w:tc>
         <w:tc>
           <w:tcPr>
-            <w:tcW w:type="dxa" w:w="1201"/>
+            <w:tcW w:type="dxa" w:w="1242"/>
             <w:shd w:fill="F8F6F0"/>
           </w:tcPr>
           <w:p>
@@ -2351,7 +1970,7 @@
         </w:tc>
         <w:tc>
           <w:tcPr>
-            <w:tcW w:type="dxa" w:w="1201"/>
+            <w:tcW w:type="dxa" w:w="1242"/>
             <w:shd w:fill="F8F6F0"/>
           </w:tcPr>
           <w:p>
@@ -2365,7 +1984,7 @@
         </w:tc>
         <w:tc>
           <w:tcPr>
-            <w:tcW w:type="dxa" w:w="1201"/>
+            <w:tcW w:type="dxa" w:w="1242"/>
             <w:shd w:fill="F8F6F0"/>
           </w:tcPr>
           <w:p>
@@ -2379,7 +1998,7 @@
         </w:tc>
         <w:tc>
           <w:tcPr>
-            <w:tcW w:type="dxa" w:w="1201"/>
+            <w:tcW w:type="dxa" w:w="1242"/>
             <w:shd w:fill="F8F6F0"/>
           </w:tcPr>
           <w:p>
@@ -2393,7 +2012,7 @@
         </w:tc>
         <w:tc>
           <w:tcPr>
-            <w:tcW w:type="dxa" w:w="1201"/>
+            <w:tcW w:type="dxa" w:w="1242"/>
             <w:shd w:fill="F8F6F0"/>
           </w:tcPr>
           <w:p>
@@ -2407,7 +2026,7 @@
         </w:tc>
         <w:tc>
           <w:tcPr>
-            <w:tcW w:type="dxa" w:w="1201"/>
+            <w:tcW w:type="dxa" w:w="1242"/>
             <w:shd w:fill="F8F6F0"/>
           </w:tcPr>
           <w:p>
@@ -2421,7 +2040,7 @@
         </w:tc>
         <w:tc>
           <w:tcPr>
-            <w:tcW w:type="dxa" w:w="1201"/>
+            <w:tcW w:type="dxa" w:w="1242"/>
             <w:shd w:fill="F8F6F0"/>
           </w:tcPr>
           <w:p>
@@ -2437,7 +2056,7 @@
       <w:tr>
         <w:tc>
           <w:tcPr>
-            <w:tcW w:type="dxa" w:w="1201"/>
+            <w:tcW w:type="dxa" w:w="1242"/>
           </w:tcPr>
           <w:p>
             <w:r>
@@ -2450,7 +2069,7 @@
         </w:tc>
         <w:tc>
           <w:tcPr>
-            <w:tcW w:type="dxa" w:w="1201"/>
+            <w:tcW w:type="dxa" w:w="1242"/>
           </w:tcPr>
           <w:p>
             <w:r>
@@ -2463,7 +2082,7 @@
         </w:tc>
         <w:tc>
           <w:tcPr>
-            <w:tcW w:type="dxa" w:w="1201"/>
+            <w:tcW w:type="dxa" w:w="1242"/>
           </w:tcPr>
           <w:p>
             <w:r>
@@ -2476,7 +2095,7 @@
         </w:tc>
         <w:tc>
           <w:tcPr>
-            <w:tcW w:type="dxa" w:w="1201"/>
+            <w:tcW w:type="dxa" w:w="1242"/>
           </w:tcPr>
           <w:p>
             <w:r>
@@ -2489,7 +2108,7 @@
         </w:tc>
         <w:tc>
           <w:tcPr>
-            <w:tcW w:type="dxa" w:w="1201"/>
+            <w:tcW w:type="dxa" w:w="1242"/>
           </w:tcPr>
           <w:p>
             <w:r>
@@ -2502,7 +2121,7 @@
         </w:tc>
         <w:tc>
           <w:tcPr>
-            <w:tcW w:type="dxa" w:w="1201"/>
+            <w:tcW w:type="dxa" w:w="1242"/>
           </w:tcPr>
           <w:p>
             <w:r>
@@ -2515,7 +2134,7 @@
         </w:tc>
         <w:tc>
           <w:tcPr>
-            <w:tcW w:type="dxa" w:w="1201"/>
+            <w:tcW w:type="dxa" w:w="1242"/>
           </w:tcPr>
           <w:p>
             <w:r>
@@ -2528,7 +2147,7 @@
         </w:tc>
         <w:tc>
           <w:tcPr>
-            <w:tcW w:type="dxa" w:w="1201"/>
+            <w:tcW w:type="dxa" w:w="1242"/>
           </w:tcPr>
           <w:p>
             <w:r>
@@ -2543,7 +2162,7 @@
       <w:tr>
         <w:tc>
           <w:tcPr>
-            <w:tcW w:type="dxa" w:w="1201"/>
+            <w:tcW w:type="dxa" w:w="1242"/>
             <w:shd w:fill="F8F6F0"/>
           </w:tcPr>
           <w:p>
@@ -2557,7 +2176,7 @@
         </w:tc>
         <w:tc>
           <w:tcPr>
-            <w:tcW w:type="dxa" w:w="1201"/>
+            <w:tcW w:type="dxa" w:w="1242"/>
             <w:shd w:fill="F8F6F0"/>
           </w:tcPr>
           <w:p>
@@ -2571,7 +2190,7 @@
         </w:tc>
         <w:tc>
           <w:tcPr>
-            <w:tcW w:type="dxa" w:w="1201"/>
+            <w:tcW w:type="dxa" w:w="1242"/>
             <w:shd w:fill="F8F6F0"/>
           </w:tcPr>
           <w:p>
@@ -2585,7 +2204,7 @@
         </w:tc>
         <w:tc>
           <w:tcPr>
-            <w:tcW w:type="dxa" w:w="1201"/>
+            <w:tcW w:type="dxa" w:w="1242"/>
             <w:shd w:fill="F8F6F0"/>
           </w:tcPr>
           <w:p>
@@ -2599,7 +2218,7 @@
         </w:tc>
         <w:tc>
           <w:tcPr>
-            <w:tcW w:type="dxa" w:w="1201"/>
+            <w:tcW w:type="dxa" w:w="1242"/>
             <w:shd w:fill="F8F6F0"/>
           </w:tcPr>
           <w:p>
@@ -2613,7 +2232,7 @@
         </w:tc>
         <w:tc>
           <w:tcPr>
-            <w:tcW w:type="dxa" w:w="1201"/>
+            <w:tcW w:type="dxa" w:w="1242"/>
             <w:shd w:fill="F8F6F0"/>
           </w:tcPr>
           <w:p>
@@ -2627,7 +2246,7 @@
         </w:tc>
         <w:tc>
           <w:tcPr>
-            <w:tcW w:type="dxa" w:w="1201"/>
+            <w:tcW w:type="dxa" w:w="1242"/>
             <w:shd w:fill="F8F6F0"/>
           </w:tcPr>
           <w:p>
@@ -2641,7 +2260,7 @@
         </w:tc>
         <w:tc>
           <w:tcPr>
-            <w:tcW w:type="dxa" w:w="1201"/>
+            <w:tcW w:type="dxa" w:w="1242"/>
             <w:shd w:fill="F8F6F0"/>
           </w:tcPr>
           <w:p>
@@ -2662,7 +2281,7 @@
     </w:p>
     <w:p>
       <w:pPr>
-        <w:pStyle w:val="Heading1"/>
+        <w:spacing w:before="280" w:after="120"/>
         <w:jc w:val="right"/>
       </w:pPr>
       <w:r>
@@ -2670,142 +2289,14 @@
           <w:rFonts w:ascii="Arial" w:hAnsi="Arial"/>
           <w:b/>
           <w:color w:val="6B1D3A"/>
-          <w:sz w:val="32"/>
+          <w:sz w:val="34"/>
         </w:rPr>
-        <w:t>تحليل الفجوات الاستراتيجية والتوصيات التصحيحية (H2 2026)</w:t>
+        <w:t>رابعاً: الموارد البشرية والوظائف الشاغرة (ص ٣٠-٣١)</w:t>
       </w:r>
     </w:p>
     <w:p>
       <w:pPr>
-        <w:spacing w:after="100" w:line="288" w:lineRule="auto"/>
-        <w:jc w:val="right"/>
-      </w:pPr>
-      <w:r>
-        <w:rPr>
-          <w:rFonts w:ascii="Arial" w:hAnsi="Arial"/>
-          <w:b/>
-          <w:i w:val="0"/>
-          <w:color w:val="6B1D3A"/>
-          <w:sz w:val="23"/>
-        </w:rPr>
-        <w:t>• الفجوة الأولى: انحسار نطاق المستفيدين:</w:t>
-      </w:r>
-    </w:p>
-    <w:p>
-      <w:pPr>
-        <w:spacing w:after="100" w:line="288" w:lineRule="auto"/>
-        <w:jc w:val="right"/>
-      </w:pPr>
-      <w:r>
-        <w:rPr>
-          <w:rFonts w:ascii="Arial" w:hAnsi="Arial"/>
-          <w:b w:val="0"/>
-          <w:i w:val="0"/>
-          <w:color w:val="2D2D2D"/>
-          <w:sz w:val="21"/>
-        </w:rPr>
-        <w:t>خدمة ٧ مرضى فقط من أصل ٣٦,٦٠٦ مستهدفين نتيجة حصر الصرف في الجراحات المعقدة وإيقاف العيادات الوقائية والاستشارات.</w:t>
-      </w:r>
-    </w:p>
-    <w:p>
-      <w:pPr>
-        <w:spacing w:after="100" w:line="288" w:lineRule="auto"/>
-        <w:jc w:val="right"/>
-      </w:pPr>
-      <w:r>
-        <w:rPr>
-          <w:rFonts w:ascii="Arial" w:hAnsi="Arial"/>
-          <w:b/>
-          <w:i w:val="0"/>
-          <w:color w:val="6B1D3A"/>
-          <w:sz w:val="23"/>
-        </w:rPr>
-        <w:t>• الفجوة الثانية: تشدد لائحة المساعدات العلاجية:</w:t>
-      </w:r>
-    </w:p>
-    <w:p>
-      <w:pPr>
-        <w:spacing w:after="100" w:line="288" w:lineRule="auto"/>
-        <w:jc w:val="right"/>
-      </w:pPr>
-      <w:r>
-        <w:rPr>
-          <w:rFonts w:ascii="Arial" w:hAnsi="Arial"/>
-          <w:b w:val="0"/>
-          <w:i w:val="0"/>
-          <w:color w:val="2D2D2D"/>
-          <w:sz w:val="21"/>
-        </w:rPr>
-        <w:t>رفض ٦٦.٧٪ من الحالات المتقدمة (١٤ حالة) لانتهاء الإقامة أو نقص التقارير مما عطل صرف موازنة العلاج.</w:t>
-      </w:r>
-    </w:p>
-    <w:p>
-      <w:pPr>
-        <w:spacing w:after="100" w:line="288" w:lineRule="auto"/>
-        <w:jc w:val="right"/>
-      </w:pPr>
-      <w:r>
-        <w:rPr>
-          <w:rFonts w:ascii="Arial" w:hAnsi="Arial"/>
-          <w:b/>
-          <w:i w:val="0"/>
-          <w:color w:val="6B1D3A"/>
-          <w:sz w:val="23"/>
-        </w:rPr>
-        <w:t>• الفجوة الثالثة: تركز الإيرادات وضعف المنح:</w:t>
-      </w:r>
-    </w:p>
-    <w:p>
-      <w:pPr>
-        <w:spacing w:after="100" w:line="288" w:lineRule="auto"/>
-        <w:jc w:val="right"/>
-      </w:pPr>
-      <w:r>
-        <w:rPr>
-          <w:rFonts w:ascii="Arial" w:hAnsi="Arial"/>
-          <w:b w:val="0"/>
-          <w:i w:val="0"/>
-          <w:color w:val="2D2D2D"/>
-          <w:sz w:val="21"/>
-        </w:rPr>
-        <w:t>اعتماد الجمعية بنسبة ٤٣٪ على تبرع فردي واحد (٢٥٠ ألف ريال) وتدني نسبة نجاح طلبات المنح إلى ٧.٤٪.</w:t>
-      </w:r>
-    </w:p>
-    <w:p>
-      <w:pPr>
-        <w:spacing w:after="100" w:line="288" w:lineRule="auto"/>
-        <w:jc w:val="right"/>
-      </w:pPr>
-      <w:r>
-        <w:rPr>
-          <w:rFonts w:ascii="Arial" w:hAnsi="Arial"/>
-          <w:b/>
-          <w:i w:val="0"/>
-          <w:color w:val="6B1D3A"/>
-          <w:sz w:val="23"/>
-        </w:rPr>
-        <w:t>• الفجوة الرابعة: تراجع النشاط التطوعي:</w:t>
-      </w:r>
-    </w:p>
-    <w:p>
-      <w:pPr>
-        <w:spacing w:after="100" w:line="288" w:lineRule="auto"/>
-        <w:jc w:val="right"/>
-      </w:pPr>
-      <w:r>
-        <w:rPr>
-          <w:rFonts w:ascii="Arial" w:hAnsi="Arial"/>
-          <w:b w:val="0"/>
-          <w:i w:val="0"/>
-          <w:color w:val="2D2D2D"/>
-          <w:sz w:val="21"/>
-        </w:rPr>
-        <w:t>تنفيذ ٤ فرص تطوعية فقط دون توثيق للساعات مقابل مستهدف ٣,٠٠٠ ساعة بقيمة ٢٠٢.٥ ألف ريال.</w:t>
-      </w:r>
-    </w:p>
-    <w:p>
-      <w:pPr>
-        <w:pStyle w:val="Heading2"/>
+        <w:spacing w:after="120"/>
         <w:jc w:val="right"/>
       </w:pPr>
       <w:r>
@@ -2813,141 +2304,927 @@
           <w:rFonts w:ascii="Arial" w:hAnsi="Arial"/>
           <w:b/>
           <w:color w:val="6B1D3A"/>
-          <w:sz w:val="26"/>
+          <w:sz w:val="22"/>
         </w:rPr>
-        <w:t>خارطة طريق التوصيات للنصف الثاني ٢٠٢٦م</w:t>
+        <w:t>• الكادر الوظيفي الحالي (٣ موظفين رسميين + محاسب متعاون بنسبة توطين ١٠٠٪):</w:t>
       </w:r>
     </w:p>
     <w:p>
       <w:pPr>
-        <w:spacing w:after="100" w:line="288" w:lineRule="auto"/>
+        <w:spacing w:after="120"/>
+        <w:jc w:val="right"/>
+      </w:pPr>
+      <w:r>
+        <w:rPr>
+          <w:rFonts w:ascii="Arial" w:hAnsi="Arial"/>
+          <w:b w:val="0"/>
+          <w:color w:val="2D2D2D"/>
+          <w:sz w:val="21"/>
+        </w:rPr>
+        <w:t xml:space="preserve">  ١. أ. بيان سعد المحمدي - المدير التنفيذي (موظف رسمي).</w:t>
+        <w:br/>
+        <w:t xml:space="preserve">  ٢. أ. غدير أحمد الحربي - المسؤول المالي والمشرفة على البرامج والمشاريع (موظفة رسمية).</w:t>
+        <w:br/>
+        <w:t xml:space="preserve">  ٣. أ. طراد محمد سمان - سكرتير تنفيذي (موظف رسمي).</w:t>
+        <w:br/>
+        <w:t xml:space="preserve">  ٤. أ. محمد الحسن بشير - محاسب قانوني متعاون.</w:t>
+      </w:r>
+    </w:p>
+    <w:p>
+      <w:pPr>
+        <w:spacing w:after="120"/>
         <w:jc w:val="right"/>
       </w:pPr>
       <w:r>
         <w:rPr>
           <w:rFonts w:ascii="Arial" w:hAnsi="Arial"/>
           <w:b/>
-          <w:i w:val="0"/>
           <w:color w:val="6B1D3A"/>
-          <w:sz w:val="23"/>
+          <w:sz w:val="22"/>
         </w:rPr>
-        <w:t>• ١. تعديل عاجل للائحة المساعدات:</w:t>
+        <w:t>• خطة الشواغر والاحتياج الوظيفي (٣ وظائف أساسية):</w:t>
+      </w:r>
+    </w:p>
+    <w:tbl>
+      <w:tblPr>
+        <w:tblW w:type="auto" w:w="0"/>
+        <w:jc w:val="center"/>
+        <w:tblLook w:firstColumn="1" w:firstRow="1" w:lastColumn="0" w:lastRow="0" w:noHBand="0" w:noVBand="1" w:val="04A0"/>
+      </w:tblPr>
+      <w:tblGrid>
+        <w:gridCol w:w="3312"/>
+        <w:gridCol w:w="3312"/>
+        <w:gridCol w:w="3312"/>
+      </w:tblGrid>
+      <w:tr>
+        <w:tc>
+          <w:tcPr>
+            <w:tcW w:type="dxa" w:w="3312"/>
+            <w:shd w:fill="6B1D3A"/>
+          </w:tcPr>
+          <w:p>
+            <w:r>
+              <w:rPr>
+                <w:b/>
+                <w:color w:val="FFFFFF"/>
+                <w:sz w:val="19"/>
+              </w:rPr>
+              <w:t>المسمى الوظيفي</w:t>
+            </w:r>
+          </w:p>
+        </w:tc>
+        <w:tc>
+          <w:tcPr>
+            <w:tcW w:type="dxa" w:w="3312"/>
+            <w:shd w:fill="6B1D3A"/>
+          </w:tcPr>
+          <w:p>
+            <w:r>
+              <w:rPr>
+                <w:b/>
+                <w:color w:val="FFFFFF"/>
+                <w:sz w:val="19"/>
+              </w:rPr>
+              <w:t>الحالة الراهنة</w:t>
+            </w:r>
+          </w:p>
+        </w:tc>
+        <w:tc>
+          <w:tcPr>
+            <w:tcW w:type="dxa" w:w="3312"/>
+            <w:shd w:fill="6B1D3A"/>
+          </w:tcPr>
+          <w:p>
+            <w:r>
+              <w:rPr>
+                <w:b/>
+                <w:color w:val="FFFFFF"/>
+                <w:sz w:val="19"/>
+              </w:rPr>
+              <w:t>الإجراء والترشيح</w:t>
+            </w:r>
+          </w:p>
+        </w:tc>
+      </w:tr>
+      <w:tr>
+        <w:tc>
+          <w:tcPr>
+            <w:tcW w:type="dxa" w:w="3312"/>
+          </w:tcPr>
+          <w:p>
+            <w:r>
+              <w:rPr>
+                <w:sz w:val="18"/>
+              </w:rPr>
+              <w:t>موظف/ـة علاقات عامة وإعلام</w:t>
+            </w:r>
+          </w:p>
+        </w:tc>
+        <w:tc>
+          <w:tcPr>
+            <w:tcW w:type="dxa" w:w="3312"/>
+          </w:tcPr>
+          <w:p>
+            <w:r>
+              <w:rPr>
+                <w:sz w:val="18"/>
+              </w:rPr>
+              <w:t>قيد الترسيم</w:t>
+            </w:r>
+          </w:p>
+        </w:tc>
+        <w:tc>
+          <w:tcPr>
+            <w:tcW w:type="dxa" w:w="3312"/>
+          </w:tcPr>
+          <w:p>
+            <w:r>
+              <w:rPr>
+                <w:sz w:val="18"/>
+              </w:rPr>
+              <w:t>تم ترشيح أ. فيصل الجهني (يعمل كمتعاون بدون أجر منذ ٣ أشهر لحين الترسيم).</w:t>
+            </w:r>
+          </w:p>
+        </w:tc>
+      </w:tr>
+      <w:tr>
+        <w:tc>
+          <w:tcPr>
+            <w:tcW w:type="dxa" w:w="3312"/>
+            <w:shd w:fill="F8F6F0"/>
+          </w:tcPr>
+          <w:p>
+            <w:r>
+              <w:rPr>
+                <w:sz w:val="18"/>
+              </w:rPr>
+              <w:t>موظف/ـة تنمية موارد مالية</w:t>
+            </w:r>
+          </w:p>
+        </w:tc>
+        <w:tc>
+          <w:tcPr>
+            <w:tcW w:type="dxa" w:w="3312"/>
+            <w:shd w:fill="F8F6F0"/>
+          </w:tcPr>
+          <w:p>
+            <w:r>
+              <w:rPr>
+                <w:sz w:val="18"/>
+              </w:rPr>
+              <w:t>شاغرة (تحتاج استقطاب)</w:t>
+            </w:r>
+          </w:p>
+        </w:tc>
+        <w:tc>
+          <w:tcPr>
+            <w:tcW w:type="dxa" w:w="3312"/>
+            <w:shd w:fill="F8F6F0"/>
+          </w:tcPr>
+          <w:p>
+            <w:r>
+              <w:rPr>
+                <w:sz w:val="18"/>
+              </w:rPr>
+              <w:t>استقطاب كفاءة متخصصة لرفع قدرات كتابة المشاريع والمنح وجلب التمويل.</w:t>
+            </w:r>
+          </w:p>
+        </w:tc>
+      </w:tr>
+      <w:tr>
+        <w:tc>
+          <w:tcPr>
+            <w:tcW w:type="dxa" w:w="3312"/>
+          </w:tcPr>
+          <w:p>
+            <w:r>
+              <w:rPr>
+                <w:sz w:val="18"/>
+              </w:rPr>
+              <w:t>موظف/ـة موارد بشرية</w:t>
+            </w:r>
+          </w:p>
+        </w:tc>
+        <w:tc>
+          <w:tcPr>
+            <w:tcW w:type="dxa" w:w="3312"/>
+          </w:tcPr>
+          <w:p>
+            <w:r>
+              <w:rPr>
+                <w:sz w:val="18"/>
+              </w:rPr>
+              <w:t>شاغرة (تحتاج استقطاب)</w:t>
+            </w:r>
+          </w:p>
+        </w:tc>
+        <w:tc>
+          <w:tcPr>
+            <w:tcW w:type="dxa" w:w="3312"/>
+          </w:tcPr>
+          <w:p>
+            <w:r>
+              <w:rPr>
+                <w:sz w:val="18"/>
+              </w:rPr>
+              <w:t>وظيفة أساسية لتنظيم شؤون الموظفين، التدريب، ولوائح العمل والتطوع.</w:t>
+            </w:r>
+          </w:p>
+        </w:tc>
+      </w:tr>
+    </w:tbl>
+    <w:p>
+      <w:pPr>
+        <w:spacing w:before="280" w:after="120"/>
+        <w:jc w:val="right"/>
+      </w:pPr>
+      <w:r>
+        <w:rPr>
+          <w:rFonts w:ascii="Arial" w:hAnsi="Arial"/>
+          <w:b/>
+          <w:color w:val="6B1D3A"/>
+          <w:sz w:val="34"/>
+        </w:rPr>
+        <w:t>خامساً: الإنجازات الإدارية والمالية والانتقال للمقر الجديد (ص ٣٢-٣٣)</w:t>
       </w:r>
     </w:p>
     <w:p>
       <w:pPr>
-        <w:spacing w:after="100" w:line="288" w:lineRule="auto"/>
+        <w:spacing w:after="120"/>
+        <w:jc w:val="right"/>
+      </w:pPr>
+      <w:r>
+        <w:rPr>
+          <w:rFonts w:ascii="Arial" w:hAnsi="Arial"/>
+          <w:b/>
+          <w:color w:val="6B1D3A"/>
+          <w:sz w:val="21"/>
+        </w:rPr>
+        <w:t>• الانتقال للمقر الجديد والوفر المالي: تم الانتقال إلى المقر الحالي بإيجار سنوي ٤٥,٠٠٠ ريال (بدعم نائب رئيس المجلس) مقارنة بـ ٧٠,٠٠٠ ريال سابقاً، محققاً وفراً سنوياً قدره ٢٥,٠٠٠ ريال.</w:t>
+      </w:r>
+    </w:p>
+    <w:p>
+      <w:pPr>
+        <w:spacing w:after="120"/>
+        <w:jc w:val="right"/>
+      </w:pPr>
+      <w:r>
+        <w:rPr>
+          <w:rFonts w:ascii="Arial" w:hAnsi="Arial"/>
+          <w:b/>
+          <w:color w:val="6B1D3A"/>
+          <w:sz w:val="21"/>
+        </w:rPr>
+        <w:t>• قائمة الإنجازات الإدارية والمالية الـ (١٢) المنجزة:</w:t>
+      </w:r>
+    </w:p>
+    <w:p>
+      <w:pPr>
+        <w:spacing w:after="120"/>
         <w:jc w:val="right"/>
       </w:pPr>
       <w:r>
         <w:rPr>
           <w:rFonts w:ascii="Arial" w:hAnsi="Arial"/>
           <w:b w:val="0"/>
-          <w:i w:val="0"/>
           <w:color w:val="2D2D2D"/>
-          <w:sz w:val="21"/>
+          <w:sz w:val="20"/>
         </w:rPr>
-        <w:t>وضع استثناءات إنسانية لرفع نسبة القبول وصرف المتبقي من الموازنة (٥٤١ ألف ريال).</w:t>
+        <w:t>١. أتمتة العمل المحاسبي وإدخال برنامج «قيود» المجاز من المركز الوطني.</w:t>
       </w:r>
     </w:p>
     <w:p>
       <w:pPr>
-        <w:spacing w:after="100" w:line="288" w:lineRule="auto"/>
+        <w:spacing w:after="120"/>
+        <w:jc w:val="right"/>
+      </w:pPr>
+      <w:r>
+        <w:rPr>
+          <w:rFonts w:ascii="Arial" w:hAnsi="Arial"/>
+          <w:b w:val="0"/>
+          <w:color w:val="2D2D2D"/>
+          <w:sz w:val="20"/>
+        </w:rPr>
+        <w:t>٢. بناء وتأسيس الشجرة المحاسبية وفق الدليل المعتمد للجمعيات الخيرية.</w:t>
+      </w:r>
+    </w:p>
+    <w:p>
+      <w:pPr>
+        <w:spacing w:after="120"/>
+        <w:jc w:val="right"/>
+      </w:pPr>
+      <w:r>
+        <w:rPr>
+          <w:rFonts w:ascii="Arial" w:hAnsi="Arial"/>
+          <w:b w:val="0"/>
+          <w:color w:val="2D2D2D"/>
+          <w:sz w:val="20"/>
+        </w:rPr>
+        <w:t>٣. إقفال الأرباع السنوية لعام ٢٠٢٥م وتدقيقها محاسبياً بكفاءة عالية.</w:t>
+      </w:r>
+    </w:p>
+    <w:p>
+      <w:pPr>
+        <w:spacing w:after="120"/>
+        <w:jc w:val="right"/>
+      </w:pPr>
+      <w:r>
+        <w:rPr>
+          <w:rFonts w:ascii="Arial" w:hAnsi="Arial"/>
+          <w:b w:val="0"/>
+          <w:color w:val="2D2D2D"/>
+          <w:sz w:val="20"/>
+        </w:rPr>
+        <w:t>٤. إعداد الموازنة التقديرية لعام ٢٠٢٦م واعتمادها من المجلس والعمومية.</w:t>
+      </w:r>
+    </w:p>
+    <w:p>
+      <w:pPr>
+        <w:spacing w:after="120"/>
+        <w:jc w:val="right"/>
+      </w:pPr>
+      <w:r>
+        <w:rPr>
+          <w:rFonts w:ascii="Arial" w:hAnsi="Arial"/>
+          <w:b w:val="0"/>
+          <w:color w:val="2D2D2D"/>
+          <w:sz w:val="20"/>
+        </w:rPr>
+        <w:t>٥. تنفيذ جرد مالي وحصري شامل لكافة أصول الجمعية وتوثيقها رسمياً.</w:t>
+      </w:r>
+    </w:p>
+    <w:p>
+      <w:pPr>
+        <w:spacing w:after="120"/>
+        <w:jc w:val="right"/>
+      </w:pPr>
+      <w:r>
+        <w:rPr>
+          <w:rFonts w:ascii="Arial" w:hAnsi="Arial"/>
+          <w:b w:val="0"/>
+          <w:color w:val="2D2D2D"/>
+          <w:sz w:val="20"/>
+        </w:rPr>
+        <w:t>٦. إعداد القوائم المالية واعتمادها من المركز الوطني للقطاع غير الربحي.</w:t>
+      </w:r>
+    </w:p>
+    <w:p>
+      <w:pPr>
+        <w:spacing w:after="120"/>
+        <w:jc w:val="right"/>
+      </w:pPr>
+      <w:r>
+        <w:rPr>
+          <w:rFonts w:ascii="Arial" w:hAnsi="Arial"/>
+          <w:b w:val="0"/>
+          <w:color w:val="2D2D2D"/>
+          <w:sz w:val="20"/>
+        </w:rPr>
+        <w:t>٧. أرشفة جميع مستندات وملفات الجمعية ورقياً وإلكترونياً.</w:t>
+      </w:r>
+    </w:p>
+    <w:p>
+      <w:pPr>
+        <w:spacing w:after="120"/>
+        <w:jc w:val="right"/>
+      </w:pPr>
+      <w:r>
+        <w:rPr>
+          <w:rFonts w:ascii="Arial" w:hAnsi="Arial"/>
+          <w:b w:val="0"/>
+          <w:color w:val="2D2D2D"/>
+          <w:sz w:val="20"/>
+        </w:rPr>
+        <w:t>٨. إنشاء وتفعيل نظام الاتصالات الإدارية الصادر والوارد لكافة المعاملات.</w:t>
+      </w:r>
+    </w:p>
+    <w:p>
+      <w:pPr>
+        <w:spacing w:after="120"/>
+        <w:jc w:val="right"/>
+      </w:pPr>
+      <w:r>
+        <w:rPr>
+          <w:rFonts w:ascii="Arial" w:hAnsi="Arial"/>
+          <w:b w:val="0"/>
+          <w:color w:val="2D2D2D"/>
+          <w:sz w:val="20"/>
+        </w:rPr>
+        <w:t>٩. تطوير الموقع الإلكتروني بما يتوافق مع متطلبات الحوكمة والخصوصية.</w:t>
+      </w:r>
+    </w:p>
+    <w:p>
+      <w:pPr>
+        <w:spacing w:after="120"/>
+        <w:jc w:val="right"/>
+      </w:pPr>
+      <w:r>
+        <w:rPr>
+          <w:rFonts w:ascii="Arial" w:hAnsi="Arial"/>
+          <w:b w:val="0"/>
+          <w:color w:val="2D2D2D"/>
+          <w:sz w:val="20"/>
+        </w:rPr>
+        <w:t>١٠. تطوير السياسات واللوائح الداخلية ونشرها بالبوابة الرسمية.</w:t>
+      </w:r>
+    </w:p>
+    <w:p>
+      <w:pPr>
+        <w:spacing w:after="120"/>
+        <w:jc w:val="right"/>
+      </w:pPr>
+      <w:r>
+        <w:rPr>
+          <w:rFonts w:ascii="Arial" w:hAnsi="Arial"/>
+          <w:b w:val="0"/>
+          <w:color w:val="2D2D2D"/>
+          <w:sz w:val="20"/>
+        </w:rPr>
+        <w:t>١١. متابعة الالتزام والحوكمة (جاري العمل عليها لرفع التصنيف).</w:t>
+      </w:r>
+    </w:p>
+    <w:p>
+      <w:pPr>
+        <w:spacing w:after="120"/>
+        <w:jc w:val="right"/>
+      </w:pPr>
+      <w:r>
+        <w:rPr>
+          <w:rFonts w:ascii="Arial" w:hAnsi="Arial"/>
+          <w:b w:val="0"/>
+          <w:color w:val="2D2D2D"/>
+          <w:sz w:val="20"/>
+        </w:rPr>
+        <w:t>١٢. إعادة هيكلة اللجان والاكتفاء بلجنتين: (التنفيذية، ولجنة المساعدات الطبية).</w:t>
+      </w:r>
+    </w:p>
+    <w:p>
+      <w:r>
+        <w:br w:type="page"/>
+      </w:r>
+    </w:p>
+    <w:p>
+      <w:pPr>
+        <w:spacing w:before="280" w:after="120"/>
         <w:jc w:val="right"/>
       </w:pPr>
       <w:r>
         <w:rPr>
           <w:rFonts w:ascii="Arial" w:hAnsi="Arial"/>
           <w:b/>
-          <w:i w:val="0"/>
           <w:color w:val="6B1D3A"/>
-          <w:sz w:val="23"/>
+          <w:sz w:val="34"/>
         </w:rPr>
-        <w:t>• ٢. تشغيل برامج الاستشارات والفحوصات:</w:t>
+        <w:t>سادساً: تنمية الموارد والمنح وفرص منصة إحسان (ص ٣٤-٣٥)</w:t>
       </w:r>
     </w:p>
     <w:p>
       <w:pPr>
-        <w:spacing w:after="100" w:line="288" w:lineRule="auto"/>
+        <w:spacing w:after="120"/>
+        <w:jc w:val="right"/>
+      </w:pPr>
+      <w:r>
+        <w:rPr>
+          <w:rFonts w:ascii="Arial" w:hAnsi="Arial"/>
+          <w:b/>
+          <w:color w:val="6B1D3A"/>
+          <w:sz w:val="21"/>
+        </w:rPr>
+        <w:t>• إجمالي المنح المرفوعة: ٢٧ منحة | المنح المقبولة والمحققة: منحتان بقيمة ٤٠,٠٠٠ ريال (العنقري ٢٠ ألف + أبو زيد ٢٠ ألف) بنسبة تكلفة جمع تبرعات ٠.٠٪.</w:t>
+      </w:r>
+    </w:p>
+    <w:p>
+      <w:pPr>
+        <w:spacing w:after="120"/>
+        <w:jc w:val="right"/>
+      </w:pPr>
+      <w:r>
+        <w:rPr>
+          <w:rFonts w:ascii="Arial" w:hAnsi="Arial"/>
+          <w:b/>
+          <w:color w:val="6B1D3A"/>
+          <w:sz w:val="21"/>
+        </w:rPr>
+        <w:t>• الطلبات قيد الدراسة والمتابعة النشطة (١١ جهة):</w:t>
+      </w:r>
+    </w:p>
+    <w:p>
+      <w:pPr>
+        <w:spacing w:after="120"/>
         <w:jc w:val="right"/>
       </w:pPr>
       <w:r>
         <w:rPr>
           <w:rFonts w:ascii="Arial" w:hAnsi="Arial"/>
           <w:b w:val="0"/>
-          <w:i w:val="0"/>
           <w:color w:val="2D2D2D"/>
-          <w:sz w:val="21"/>
+          <w:sz w:val="20"/>
         </w:rPr>
-        <w:t>إطلاق الاستشارات الهاتفية والقوافل الميدانية لخدمة آلاف المستفيدين بتكلفة منخفضة.</w:t>
+        <w:t xml:space="preserve">  - صندوق دعم الجمعيات (مشروع جودة حياة - ٠١/٠٨/٢٠٢٦)</w:t>
+        <w:br/>
+        <w:t xml:space="preserve">  - مؤسسة محمد الشاوي (مبادرة عون للأمراض المزمنة - ٠٦/٠٨/٢٠٢٦)</w:t>
+        <w:br/>
+        <w:t xml:space="preserve">  - أوقاف الشيخ صالح الراجحي (دفء وغذاء ٢٠٢٧م - ١٢/٠٨/٢٠٢٦)</w:t>
+        <w:br/>
+        <w:t xml:space="preserve">  - مجلس الأوقاف الرائدة (تمت الموافقة على جودة الحياة)</w:t>
+        <w:br/>
+        <w:t xml:space="preserve">  - القطاع المصرفي: بنك الرياض وبنك البلاد (يوليو ٢٠٢٦)</w:t>
+        <w:br/>
+        <w:t xml:space="preserve">  - قطاع الشركات وخدمات الحجاج: ٦ شركات (الراجحي، ضيوف البيت، هوليدي إن، أبراج مكة، مشارق الماسية، الرفادة - ٠٧/٠٥/٢٠٢٦).</w:t>
       </w:r>
     </w:p>
     <w:p>
       <w:pPr>
-        <w:spacing w:after="100" w:line="288" w:lineRule="auto"/>
+        <w:spacing w:after="120"/>
         <w:jc w:val="right"/>
       </w:pPr>
       <w:r>
         <w:rPr>
           <w:rFonts w:ascii="Arial" w:hAnsi="Arial"/>
           <w:b/>
-          <w:i w:val="0"/>
           <w:color w:val="6B1D3A"/>
-          <w:sz w:val="23"/>
+          <w:sz w:val="21"/>
         </w:rPr>
-        <w:t>• ٣. اعتماد موازنة الحوكمة ونوى:</w:t>
+        <w:t>• فرص منصة إحسان واعتذارات المانحين والتوصيات:</w:t>
       </w:r>
     </w:p>
     <w:p>
       <w:pPr>
-        <w:spacing w:after="100" w:line="288" w:lineRule="auto"/>
+        <w:spacing w:after="120"/>
         <w:jc w:val="right"/>
       </w:pPr>
       <w:r>
         <w:rPr>
           <w:rFonts w:ascii="Arial" w:hAnsi="Arial"/>
           <w:b w:val="0"/>
-          <w:i w:val="0"/>
           <w:color w:val="2D2D2D"/>
-          <w:sz w:val="21"/>
+          <w:sz w:val="20"/>
         </w:rPr>
-        <w:t>التعاقد مع الفريق الاستشاري (١٥-٢١ ألف ريال) لإنهاء متطلبات الامتثال وفتح المنح الكبرى.</w:t>
+        <w:t xml:space="preserve">  - فرص إحسان تحت المعالجة: دعم المصاريف التشغيلية (تعديل التصنيف)، وجلسات غسيل الكلى (تحديث التقارير).</w:t>
+        <w:br/>
+        <w:t xml:space="preserve">  - اعتذارات لانتهاء الموازنات (٤ جهات): الماجد، الشاوي، طيبة، ومجموعة فنادق.</w:t>
+        <w:br/>
+        <w:t xml:space="preserve">  - اعتذارات لاشتراط الحوكمة والتخصص (٤ جهات): الضحيان، طلال (اشتراط الحوكمة)، الحمدان، والمهيدب (طفولة مبكرة).</w:t>
+        <w:br/>
+        <w:t xml:space="preserve">  - توصيات قسم البرامج: إعادة التقديم المبكر في Q1 2027، استكمال الحوكمة، ومتابعة فرص منصة إحسان (جود إحسان).</w:t>
       </w:r>
     </w:p>
     <w:p>
       <w:pPr>
-        <w:spacing w:after="100" w:line="288" w:lineRule="auto"/>
+        <w:spacing w:before="280" w:after="120"/>
         <w:jc w:val="right"/>
       </w:pPr>
       <w:r>
         <w:rPr>
           <w:rFonts w:ascii="Arial" w:hAnsi="Arial"/>
           <w:b/>
-          <w:i w:val="0"/>
           <w:color w:val="6B1D3A"/>
-          <w:sz w:val="23"/>
+          <w:sz w:val="34"/>
         </w:rPr>
-        <w:t>• ٤. إطلاق «بطاقة طبيبي» وتوحيد الخطة:</w:t>
+        <w:t>سابعاً: تجارب المستفيدين ورسائل الشكر والامتنان (ص ٤٠-٤٢)</w:t>
       </w:r>
     </w:p>
     <w:p>
       <w:pPr>
-        <w:spacing w:after="100" w:line="288" w:lineRule="auto"/>
+        <w:spacing w:after="120"/>
+        <w:jc w:val="right"/>
+      </w:pPr>
+      <w:r>
+        <w:rPr>
+          <w:rFonts w:ascii="Arial" w:hAnsi="Arial"/>
+          <w:b/>
+          <w:color w:val="6B1D3A"/>
+          <w:sz w:val="21"/>
+        </w:rPr>
+        <w:t>١. تجربة المستفيدة سامية سليمان محمد (عملية استئصال كتلة بالصدر - ٦,٣٥٠ ريال بمستشفى المواساة):</w:t>
+      </w:r>
+    </w:p>
+    <w:p>
+      <w:pPr>
+        <w:spacing w:after="120"/>
         <w:jc w:val="right"/>
       </w:pPr>
       <w:r>
         <w:rPr>
           <w:rFonts w:ascii="Arial" w:hAnsi="Arial"/>
           <w:b w:val="0"/>
-          <w:i w:val="0"/>
           <w:color w:val="2D2D2D"/>
+          <w:sz w:val="19"/>
+        </w:rPr>
+        <w:t>«إلى أعضاء جمعية طبيبي الكرام، تعجز كلمات الثناء والشكر أن تفيكم حقكم لما تقدمونه من جهود جليلة في خدمة المجتمع، فأنتم نموذج يُحتذى به في البذل والعطاء... شكراً لعطائكم السخي الذي يضيء حياة الكثيرين ويصنع الأمل، فكل مساهمة منكم هي بذرة خير تُثمر بسمة في قلب محتاج.»</w:t>
+      </w:r>
+    </w:p>
+    <w:p>
+      <w:pPr>
+        <w:spacing w:after="120"/>
+        <w:jc w:val="right"/>
+      </w:pPr>
+      <w:r>
+        <w:rPr>
+          <w:rFonts w:ascii="Arial" w:hAnsi="Arial"/>
+          <w:b/>
+          <w:color w:val="6B1D3A"/>
           <w:sz w:val="21"/>
         </w:rPr>
-        <w:t>استثمار شبكة المستشفيات لإصدار بطاقة مزايا صحية وتوحيد مستهدفات الخطة الاستراتيجية.</w:t>
+        <w:t>٢. تجربة المستفيدة كندفة محمد عتبة (تنويم ورعاية بمدينة الملك سلمان الطبية - ٧,٠٠٠ ريال من ٩,١٨٦ ريال):</w:t>
+      </w:r>
+    </w:p>
+    <w:p>
+      <w:pPr>
+        <w:spacing w:after="120"/>
+        <w:jc w:val="right"/>
+      </w:pPr>
+      <w:r>
+        <w:rPr>
+          <w:rFonts w:ascii="Arial" w:hAnsi="Arial"/>
+          <w:b w:val="0"/>
+          <w:color w:val="2D2D2D"/>
+          <w:sz w:val="19"/>
+        </w:rPr>
+        <w:t>«من أعماق قلبي، أتقدم بخالص الشكر والامتنان لـ جمعية طبيبي. كنتم سبباً في تفريج كربتي في أصعب وقت... وأخص بالشكر الأستاذة غدير والأستاذ وائل وجميع الشباب العاملين في الجمعية، والله ما قصروا معنا أبداً وكانوا مثالاً للأخلاق والرحمة وحسن التعامل حتى اطمأن قلبي على والدتي.»</w:t>
+      </w:r>
+    </w:p>
+    <w:p>
+      <w:r>
+        <w:br w:type="page"/>
+      </w:r>
+    </w:p>
+    <w:p>
+      <w:pPr>
+        <w:spacing w:before="280" w:after="120"/>
+        <w:jc w:val="right"/>
+      </w:pPr>
+      <w:r>
+        <w:rPr>
+          <w:rFonts w:ascii="Arial" w:hAnsi="Arial"/>
+          <w:b/>
+          <w:color w:val="6B1D3A"/>
+          <w:sz w:val="34"/>
+        </w:rPr>
+        <w:t>ثامناً: التطلعات ومقترح الفريق الاستشاري والمبادرات الـ (٨) (ص ٣٦-٣٩)</w:t>
+      </w:r>
+    </w:p>
+    <w:p>
+      <w:pPr>
+        <w:spacing w:after="120"/>
+        <w:jc w:val="right"/>
+      </w:pPr>
+      <w:r>
+        <w:rPr>
+          <w:rFonts w:ascii="Arial" w:hAnsi="Arial"/>
+          <w:b/>
+          <w:color w:val="6B1D3A"/>
+          <w:sz w:val="21"/>
+        </w:rPr>
+        <w:t>• مقترح الاستعانة بفريق استشاري خارجي متخصص (بتكلفة ٥,٠٠٠ إلى ٧,٠٠٠ ريال شهرياً لمدة ٣ أشهر):</w:t>
+      </w:r>
+    </w:p>
+    <w:p>
+      <w:pPr>
+        <w:spacing w:after="120"/>
+        <w:jc w:val="right"/>
+      </w:pPr>
+      <w:r>
+        <w:rPr>
+          <w:rFonts w:ascii="Arial" w:hAnsi="Arial"/>
+          <w:b w:val="0"/>
+          <w:color w:val="2D2D2D"/>
+          <w:sz w:val="20"/>
+        </w:rPr>
+        <w:t xml:space="preserve">  - مبررات المقترح الـ (٦): تعدد التخصصات، الوفر المالي مقارنة بالتوظيف المباشر، استثمار المخرجات كأصول دائمة، رفع فرص قبول المنح الكبرى، نقل المعرفة للكادر، والرقابة التامة لمجلس الإدارة.</w:t>
+        <w:br/>
+        <w:t xml:space="preserve">  - خطة التنفيذ الثلاثية: المرحلة ١ (الحوكمة ونوى والقوائم) | المرحلة ٢ (إغلاق المشاريع والموقع وقاعدة المانحين) | المرحلة ٣ (الحقائب التعريفية والعروض والتقديم).</w:t>
+        <w:br/>
+        <w:t xml:space="preserve">  - ضمانات الرقابة الـ (٦) لمجلس الإدارة: اعتماد النطاق مسبقاً، تحديد مسؤول اتصال، تقارير دورية، مراجعة المدير التنفيذي، ربط الدفعات بالمخرجات، والسرية التامة وتسليم الملفات المفتوحة.</w:t>
+      </w:r>
+    </w:p>
+    <w:p>
+      <w:pPr>
+        <w:spacing w:after="120"/>
+        <w:jc w:val="right"/>
+      </w:pPr>
+      <w:r>
+        <w:rPr>
+          <w:rFonts w:ascii="Arial" w:hAnsi="Arial"/>
+          <w:b/>
+          <w:color w:val="6B1D3A"/>
+          <w:sz w:val="21"/>
+        </w:rPr>
+        <w:t>• حزمة المبادرات والمقترحات التطويرية الـ (٨) المعتمدة للنصف الثاني:</w:t>
+      </w:r>
+    </w:p>
+    <w:p>
+      <w:pPr>
+        <w:spacing w:after="120"/>
+        <w:jc w:val="right"/>
+      </w:pPr>
+      <w:r>
+        <w:rPr>
+          <w:rFonts w:ascii="Arial" w:hAnsi="Arial"/>
+          <w:b w:val="0"/>
+          <w:color w:val="2D2D2D"/>
+          <w:sz w:val="20"/>
+        </w:rPr>
+        <w:t>١. تنويع الشراكات ومصادر الدخل: التوسع في الأوقاف وشراكات القطاع الخاص لتحقيق الاستدامة المالية.</w:t>
+      </w:r>
+    </w:p>
+    <w:p>
+      <w:pPr>
+        <w:spacing w:after="120"/>
+        <w:jc w:val="right"/>
+      </w:pPr>
+      <w:r>
+        <w:rPr>
+          <w:rFonts w:ascii="Arial" w:hAnsi="Arial"/>
+          <w:b w:val="0"/>
+          <w:color w:val="2D2D2D"/>
+          <w:sz w:val="20"/>
+        </w:rPr>
+        <w:t>٢. تعزيز الظهور الإعلامي: حضور أوسع بالفعاليات والمنصات الرقمية لزيادة الوعي بالجمعية.</w:t>
+      </w:r>
+    </w:p>
+    <w:p>
+      <w:pPr>
+        <w:spacing w:after="120"/>
+        <w:jc w:val="right"/>
+      </w:pPr>
+      <w:r>
+        <w:rPr>
+          <w:rFonts w:ascii="Arial" w:hAnsi="Arial"/>
+          <w:b w:val="0"/>
+          <w:color w:val="2D2D2D"/>
+          <w:sz w:val="20"/>
+        </w:rPr>
+        <w:t>٣. استقطاب الكفاءات: شغل الشواغر في الإعلام، الموارد البشرية، وتنمية الموارد المالية.</w:t>
+      </w:r>
+    </w:p>
+    <w:p>
+      <w:pPr>
+        <w:spacing w:after="120"/>
+        <w:jc w:val="right"/>
+      </w:pPr>
+      <w:r>
+        <w:rPr>
+          <w:rFonts w:ascii="Arial" w:hAnsi="Arial"/>
+          <w:b w:val="0"/>
+          <w:color w:val="2D2D2D"/>
+          <w:sz w:val="20"/>
+        </w:rPr>
+        <w:t>٤. تنفيذ برنامج «بطاقة طبيبي»: إصدار بطاقة مزايا وخصومات لدى المستشفيات والمختبرات والمتاجر الصحية.</w:t>
+      </w:r>
+    </w:p>
+    <w:p>
+      <w:pPr>
+        <w:spacing w:after="120"/>
+        <w:jc w:val="right"/>
+      </w:pPr>
+      <w:r>
+        <w:rPr>
+          <w:rFonts w:ascii="Arial" w:hAnsi="Arial"/>
+          <w:b w:val="0"/>
+          <w:color w:val="2D2D2D"/>
+          <w:sz w:val="20"/>
+        </w:rPr>
+        <w:t>٥. تعديل لائحة صرف المساعدات: إدخال استثناءات إنسانية مرنة لرفع معدل قبول الحالات وصرف موازنة العلاج.</w:t>
+      </w:r>
+    </w:p>
+    <w:p>
+      <w:pPr>
+        <w:spacing w:after="120"/>
+        <w:jc w:val="right"/>
+      </w:pPr>
+      <w:r>
+        <w:rPr>
+          <w:rFonts w:ascii="Arial" w:hAnsi="Arial"/>
+          <w:b w:val="0"/>
+          <w:color w:val="2D2D2D"/>
+          <w:sz w:val="20"/>
+        </w:rPr>
+        <w:t>٦. الاستعانة بالفريق الاستشاري: استكمال متطلبات الحوكمة، القوائم المالية، ومنصة نوى.</w:t>
+      </w:r>
+    </w:p>
+    <w:p>
+      <w:pPr>
+        <w:spacing w:after="120"/>
+        <w:jc w:val="right"/>
+      </w:pPr>
+      <w:r>
+        <w:rPr>
+          <w:rFonts w:ascii="Arial" w:hAnsi="Arial"/>
+          <w:b w:val="0"/>
+          <w:color w:val="2D2D2D"/>
+          <w:sz w:val="20"/>
+        </w:rPr>
+        <w:t>٧. اعتماد مصفوفة الصلاحيات: لتعزيز سرعة ومرونة اتخاذ القرار ومواكبة متطلبات العمل.</w:t>
+      </w:r>
+    </w:p>
+    <w:p>
+      <w:pPr>
+        <w:spacing w:after="120"/>
+        <w:jc w:val="right"/>
+      </w:pPr>
+      <w:r>
+        <w:rPr>
+          <w:rFonts w:ascii="Arial" w:hAnsi="Arial"/>
+          <w:b w:val="0"/>
+          <w:color w:val="2D2D2D"/>
+          <w:sz w:val="20"/>
+        </w:rPr>
+        <w:t>٨. تفعيل دور المجلس والعمومية: مساهمة الأعضاء الفاعلة في فتح مسارات الدعم المالي والمانحين.</w:t>
+      </w:r>
+    </w:p>
+    <w:p>
+      <w:pPr>
+        <w:spacing w:before="280" w:after="120"/>
+        <w:jc w:val="right"/>
+      </w:pPr>
+      <w:r>
+        <w:rPr>
+          <w:rFonts w:ascii="Arial" w:hAnsi="Arial"/>
+          <w:b/>
+          <w:color w:val="6B1D3A"/>
+          <w:sz w:val="34"/>
+        </w:rPr>
+        <w:t>تاسعاً: الجهات الإشرافية والمانحون وخاتمة التقرير (ص ٤٣-٤٧)</w:t>
+      </w:r>
+    </w:p>
+    <w:p>
+      <w:pPr>
+        <w:spacing w:after="120"/>
+        <w:jc w:val="right"/>
+      </w:pPr>
+      <w:r>
+        <w:rPr>
+          <w:rFonts w:ascii="Arial" w:hAnsi="Arial"/>
+          <w:b w:val="0"/>
+          <w:color w:val="2D2D2D"/>
+          <w:sz w:val="20"/>
+        </w:rPr>
+        <w:t>• الجهات الإشرافية والحكومية: المركز الوطني لتنمية القطاع غير الربحي، وزارة الصحة، إمارة منطقة المدينة المنورة، ووزارة الموارد البشرية والتنمية الاجتماعية.</w:t>
+      </w:r>
+    </w:p>
+    <w:p>
+      <w:pPr>
+        <w:spacing w:after="120"/>
+        <w:jc w:val="right"/>
+      </w:pPr>
+      <w:r>
+        <w:rPr>
+          <w:rFonts w:ascii="Arial" w:hAnsi="Arial"/>
+          <w:b w:val="0"/>
+          <w:color w:val="2D2D2D"/>
+          <w:sz w:val="20"/>
+        </w:rPr>
+        <w:t>• المنصات المعتمدة: منصة تبرع، منصة إحسان، منصة شفاء، والمتجر الإلكتروني الرسمي للجمعية.</w:t>
+      </w:r>
+    </w:p>
+    <w:p>
+      <w:pPr>
+        <w:spacing w:after="120"/>
+        <w:jc w:val="right"/>
+      </w:pPr>
+      <w:r>
+        <w:rPr>
+          <w:rFonts w:ascii="Arial" w:hAnsi="Arial"/>
+          <w:b w:val="0"/>
+          <w:color w:val="2D2D2D"/>
+          <w:sz w:val="20"/>
+        </w:rPr>
+        <w:t>• أبرز الأوقاف والجهات المانحة: وقف الشيخ نغيمش الأحمدي، شركة طابة المطورة، وقف الشيخ عبدالقادر شيبة الحمد، مؤسسة سعيد مكي، وقف عبدالرحيم عبدالرزاق، ووقف عبدالعزيز أبو زيد.</w:t>
+      </w:r>
+    </w:p>
+    <w:p>
+      <w:pPr>
+        <w:spacing w:after="120"/>
+        <w:jc w:val="right"/>
+      </w:pPr>
+      <w:r>
+        <w:rPr>
+          <w:rFonts w:ascii="Arial" w:hAnsi="Arial"/>
+          <w:b/>
+          <w:color w:val="6B1D3A"/>
+          <w:sz w:val="21"/>
+        </w:rPr>
+        <w:t>• كلمة الخاتمة الرسمية للإدارة التنفيذية:</w:t>
+      </w:r>
+    </w:p>
+    <w:p>
+      <w:pPr>
+        <w:spacing w:after="120"/>
+        <w:jc w:val="right"/>
+      </w:pPr>
+      <w:r>
+        <w:rPr>
+          <w:rFonts w:ascii="Arial" w:hAnsi="Arial"/>
+          <w:b w:val="0"/>
+          <w:color w:val="2D2D2D"/>
+          <w:sz w:val="20"/>
+        </w:rPr>
+        <w:t>«ختاماً، نؤكد في الإدارة التنفيذية أن هذه المنجزات لم تكن لتتحقق لولا فضل الله أولاً، ثم الدعم والتوجيه المستمر من قبل مجلس الإدارة الموقر، وتضافر جهود فريق العمل بجمعية طبيبي. إننا ننظر إلى هذا العام كبداية قوية حافلة بالعطاء، ونجدد التزامنا بمواصلة العمل التطويري وابتكار حلول مستدامة لتنمية الموارد وتوسيع نطاق خدماتنا الطبية لتصل إلى كل محتاج. نسأل الله أن يبارك في الجهود وأن يسدد الخطى لما فيه الخير والنفع لمجتمعنا ووطننا.»</w:t>
       </w:r>
     </w:p>
     <w:sectPr>
-      <w:pgSz w:w="11909" w:h="16834"/>
+      <w:pgSz w:w="12240" w:h="15840"/>
       <w:pgMar w:top="1152" w:right="1152" w:bottom="1152" w:left="1152" w:header="720" w:footer="720" w:gutter="0"/>
       <w:cols w:space="720"/>
       <w:docGrid w:linePitch="360"/>

</xml_diff>

<commit_message>
Apply all user visual annotations on Strategic Matrix: 1.5M revenue target, remove deleted rows, and fix governance status
</commit_message>
<xml_diff>
--- a/التقرير_الاحترافي_المطور/تقرير_جمعية_طبيبي_النصف_سنوي_٢٠٢٦_النسخة_التنفيذية.docx
+++ b/التقرير_الاحترافي_المطور/تقرير_جمعية_طبيبي_النصف_سنوي_٢٠٢٦_النسخة_التنفيذية.docx
@@ -756,7 +756,7 @@
               <w:rPr>
                 <w:sz w:val="17"/>
               </w:rPr>
-              <w:t>الإيرادات الكلية (المعدلة)</w:t>
+              <w:t>الإيرادات المالية الكلية</w:t>
             </w:r>
           </w:p>
         </w:tc>
@@ -770,226 +770,6 @@
                 <w:sz w:val="17"/>
               </w:rPr>
               <w:t>إجمالي الدخل (ريال)</w:t>
-            </w:r>
-          </w:p>
-        </w:tc>
-        <w:tc>
-          <w:tcPr>
-            <w:tcW w:type="dxa" w:w="1242"/>
-          </w:tcPr>
-          <w:p>
-            <w:r>
-              <w:rPr>
-                <w:sz w:val="17"/>
-              </w:rPr>
-              <w:t>١,٥٢٧,٠٠٠</w:t>
-            </w:r>
-          </w:p>
-        </w:tc>
-        <w:tc>
-          <w:tcPr>
-            <w:tcW w:type="dxa" w:w="1242"/>
-          </w:tcPr>
-          <w:p>
-            <w:r>
-              <w:rPr>
-                <w:sz w:val="17"/>
-              </w:rPr>
-              <w:t>٧٦٣,٥٠٠</w:t>
-            </w:r>
-          </w:p>
-        </w:tc>
-        <w:tc>
-          <w:tcPr>
-            <w:tcW w:type="dxa" w:w="1242"/>
-          </w:tcPr>
-          <w:p>
-            <w:r>
-              <w:rPr>
-                <w:sz w:val="17"/>
-              </w:rPr>
-              <w:t>٥٨٢,١٦٧.٥٢</w:t>
-            </w:r>
-          </w:p>
-        </w:tc>
-        <w:tc>
-          <w:tcPr>
-            <w:tcW w:type="dxa" w:w="1242"/>
-          </w:tcPr>
-          <w:p>
-            <w:r>
-              <w:rPr>
-                <w:sz w:val="17"/>
-              </w:rPr>
-              <w:t>٧٦.٢٥٪</w:t>
-            </w:r>
-          </w:p>
-        </w:tc>
-        <w:tc>
-          <w:tcPr>
-            <w:tcW w:type="dxa" w:w="1242"/>
-          </w:tcPr>
-          <w:p>
-            <w:r>
-              <w:rPr>
-                <w:sz w:val="17"/>
-              </w:rPr>
-              <w:t>متقدم وجيد</w:t>
-            </w:r>
-          </w:p>
-        </w:tc>
-      </w:tr>
-      <w:tr>
-        <w:tc>
-          <w:tcPr>
-            <w:tcW w:type="dxa" w:w="1242"/>
-            <w:shd w:fill="F8F6F0"/>
-          </w:tcPr>
-          <w:p>
-            <w:r>
-              <w:rPr>
-                <w:sz w:val="17"/>
-              </w:rPr>
-              <w:t>٢</w:t>
-            </w:r>
-          </w:p>
-        </w:tc>
-        <w:tc>
-          <w:tcPr>
-            <w:tcW w:type="dxa" w:w="1242"/>
-            <w:shd w:fill="F8F6F0"/>
-          </w:tcPr>
-          <w:p>
-            <w:r>
-              <w:rPr>
-                <w:sz w:val="17"/>
-              </w:rPr>
-              <w:t>إيرادات الموازنة التشغيلية</w:t>
-            </w:r>
-          </w:p>
-        </w:tc>
-        <w:tc>
-          <w:tcPr>
-            <w:tcW w:type="dxa" w:w="1242"/>
-            <w:shd w:fill="F8F6F0"/>
-          </w:tcPr>
-          <w:p>
-            <w:r>
-              <w:rPr>
-                <w:sz w:val="17"/>
-              </w:rPr>
-              <w:t>إيراد الموازنة (ريال)</w:t>
-            </w:r>
-          </w:p>
-        </w:tc>
-        <w:tc>
-          <w:tcPr>
-            <w:tcW w:type="dxa" w:w="1242"/>
-            <w:shd w:fill="F8F6F0"/>
-          </w:tcPr>
-          <w:p>
-            <w:r>
-              <w:rPr>
-                <w:sz w:val="17"/>
-              </w:rPr>
-              <w:t>١,٥٢٧,٠٠٠</w:t>
-            </w:r>
-          </w:p>
-        </w:tc>
-        <w:tc>
-          <w:tcPr>
-            <w:tcW w:type="dxa" w:w="1242"/>
-            <w:shd w:fill="F8F6F0"/>
-          </w:tcPr>
-          <w:p>
-            <w:r>
-              <w:rPr>
-                <w:sz w:val="17"/>
-              </w:rPr>
-              <w:t>١,٥٢٧,٠٠٠</w:t>
-            </w:r>
-          </w:p>
-        </w:tc>
-        <w:tc>
-          <w:tcPr>
-            <w:tcW w:type="dxa" w:w="1242"/>
-            <w:shd w:fill="F8F6F0"/>
-          </w:tcPr>
-          <w:p>
-            <w:r>
-              <w:rPr>
-                <w:sz w:val="17"/>
-              </w:rPr>
-              <w:t>٥٨٢,١٦٧.٥٢</w:t>
-            </w:r>
-          </w:p>
-        </w:tc>
-        <w:tc>
-          <w:tcPr>
-            <w:tcW w:type="dxa" w:w="1242"/>
-            <w:shd w:fill="F8F6F0"/>
-          </w:tcPr>
-          <w:p>
-            <w:r>
-              <w:rPr>
-                <w:sz w:val="17"/>
-              </w:rPr>
-              <w:t>٣٨.١٢٪</w:t>
-            </w:r>
-          </w:p>
-        </w:tc>
-        <w:tc>
-          <w:tcPr>
-            <w:tcW w:type="dxa" w:w="1242"/>
-            <w:shd w:fill="F8F6F0"/>
-          </w:tcPr>
-          <w:p>
-            <w:r>
-              <w:rPr>
-                <w:sz w:val="17"/>
-              </w:rPr>
-              <w:t>متأخر</w:t>
-            </w:r>
-          </w:p>
-        </w:tc>
-      </w:tr>
-      <w:tr>
-        <w:tc>
-          <w:tcPr>
-            <w:tcW w:type="dxa" w:w="1242"/>
-          </w:tcPr>
-          <w:p>
-            <w:r>
-              <w:rPr>
-                <w:sz w:val="17"/>
-              </w:rPr>
-              <w:t>٣</w:t>
-            </w:r>
-          </w:p>
-        </w:tc>
-        <w:tc>
-          <w:tcPr>
-            <w:tcW w:type="dxa" w:w="1242"/>
-          </w:tcPr>
-          <w:p>
-            <w:r>
-              <w:rPr>
-                <w:sz w:val="17"/>
-              </w:rPr>
-              <w:t>المساعدات العلاجية المباشرة</w:t>
-            </w:r>
-          </w:p>
-        </w:tc>
-        <w:tc>
-          <w:tcPr>
-            <w:tcW w:type="dxa" w:w="1242"/>
-          </w:tcPr>
-          <w:p>
-            <w:r>
-              <w:rPr>
-                <w:sz w:val="17"/>
-              </w:rPr>
-              <w:t>مبالغ المساعدات (ريال)</w:t>
             </w:r>
           </w:p>
         </w:tc>
@@ -1028,7 +808,7 @@
               <w:rPr>
                 <w:sz w:val="17"/>
               </w:rPr>
-              <w:t>٢٠٨,٦٠٥.٠٠</w:t>
+              <w:t>٥٨٢,١٦٧.٥٢</w:t>
             </w:r>
           </w:p>
         </w:tc>
@@ -1041,7 +821,7 @@
               <w:rPr>
                 <w:sz w:val="17"/>
               </w:rPr>
-              <w:t>٢٧.٨١٪</w:t>
+              <w:t>٧٧.٦٢٪</w:t>
             </w:r>
           </w:p>
         </w:tc>
@@ -1054,7 +834,7 @@
               <w:rPr>
                 <w:sz w:val="17"/>
               </w:rPr>
-              <w:t>متأخر حرِج</w:t>
+              <w:t>متقدم ومتميز</w:t>
             </w:r>
           </w:p>
         </w:tc>
@@ -1070,7 +850,7 @@
               <w:rPr>
                 <w:sz w:val="17"/>
               </w:rPr>
-              <w:t>٤</w:t>
+              <w:t>٢</w:t>
             </w:r>
           </w:p>
         </w:tc>
@@ -1084,7 +864,7 @@
               <w:rPr>
                 <w:sz w:val="17"/>
               </w:rPr>
-              <w:t>المستفيدون من الخدمات الصحية</w:t>
+              <w:t>الاستشارات الطبية والدوائية</w:t>
             </w:r>
           </w:p>
         </w:tc>
@@ -1098,7 +878,7 @@
               <w:rPr>
                 <w:sz w:val="17"/>
               </w:rPr>
-              <w:t>عدد المستفيدين (فرد)</w:t>
+              <w:t>عدد الاستشارات</w:t>
             </w:r>
           </w:p>
         </w:tc>
@@ -1112,7 +892,7 @@
               <w:rPr>
                 <w:sz w:val="17"/>
               </w:rPr>
-              <w:t>٣٦,٦٠٦</w:t>
+              <w:t>١,٢٠٠</w:t>
             </w:r>
           </w:p>
         </w:tc>
@@ -1126,7 +906,7 @@
               <w:rPr>
                 <w:sz w:val="17"/>
               </w:rPr>
-              <w:t>١٨,٣٠٣</w:t>
+              <w:t>٦٠٠</w:t>
             </w:r>
           </w:p>
         </w:tc>
@@ -1140,227 +920,7 @@
               <w:rPr>
                 <w:sz w:val="17"/>
               </w:rPr>
-              <w:t>٧ مستفيدين</w:t>
-            </w:r>
-          </w:p>
-        </w:tc>
-        <w:tc>
-          <w:tcPr>
-            <w:tcW w:type="dxa" w:w="1242"/>
-            <w:shd w:fill="F8F6F0"/>
-          </w:tcPr>
-          <w:p>
-            <w:r>
-              <w:rPr>
-                <w:sz w:val="17"/>
-              </w:rPr>
-              <w:t>٠.٠٣٨٪</w:t>
-            </w:r>
-          </w:p>
-        </w:tc>
-        <w:tc>
-          <w:tcPr>
-            <w:tcW w:type="dxa" w:w="1242"/>
-            <w:shd w:fill="F8F6F0"/>
-          </w:tcPr>
-          <w:p>
-            <w:r>
-              <w:rPr>
-                <w:sz w:val="17"/>
-              </w:rPr>
-              <w:t>متعثر تماماً</w:t>
-            </w:r>
-          </w:p>
-        </w:tc>
-      </w:tr>
-      <w:tr>
-        <w:tc>
-          <w:tcPr>
-            <w:tcW w:type="dxa" w:w="1242"/>
-          </w:tcPr>
-          <w:p>
-            <w:r>
-              <w:rPr>
-                <w:sz w:val="17"/>
-              </w:rPr>
-              <w:t>٥</w:t>
-            </w:r>
-          </w:p>
-        </w:tc>
-        <w:tc>
-          <w:tcPr>
-            <w:tcW w:type="dxa" w:w="1242"/>
-          </w:tcPr>
-          <w:p>
-            <w:r>
-              <w:rPr>
-                <w:sz w:val="17"/>
-              </w:rPr>
-              <w:t>الاستشارات الطبية والدوائية</w:t>
-            </w:r>
-          </w:p>
-        </w:tc>
-        <w:tc>
-          <w:tcPr>
-            <w:tcW w:type="dxa" w:w="1242"/>
-          </w:tcPr>
-          <w:p>
-            <w:r>
-              <w:rPr>
-                <w:sz w:val="17"/>
-              </w:rPr>
-              <w:t>عدد الاستشارات</w:t>
-            </w:r>
-          </w:p>
-        </w:tc>
-        <w:tc>
-          <w:tcPr>
-            <w:tcW w:type="dxa" w:w="1242"/>
-          </w:tcPr>
-          <w:p>
-            <w:r>
-              <w:rPr>
-                <w:sz w:val="17"/>
-              </w:rPr>
-              <w:t>١,٢٠٠</w:t>
-            </w:r>
-          </w:p>
-        </w:tc>
-        <w:tc>
-          <w:tcPr>
-            <w:tcW w:type="dxa" w:w="1242"/>
-          </w:tcPr>
-          <w:p>
-            <w:r>
-              <w:rPr>
-                <w:sz w:val="17"/>
-              </w:rPr>
-              <w:t>٦٠٠</w:t>
-            </w:r>
-          </w:p>
-        </w:tc>
-        <w:tc>
-          <w:tcPr>
-            <w:tcW w:type="dxa" w:w="1242"/>
-          </w:tcPr>
-          <w:p>
-            <w:r>
-              <w:rPr>
-                <w:sz w:val="17"/>
-              </w:rPr>
               <w:t>٠ استشارة</w:t>
-            </w:r>
-          </w:p>
-        </w:tc>
-        <w:tc>
-          <w:tcPr>
-            <w:tcW w:type="dxa" w:w="1242"/>
-          </w:tcPr>
-          <w:p>
-            <w:r>
-              <w:rPr>
-                <w:sz w:val="17"/>
-              </w:rPr>
-              <w:t>٠.٠٠٪</w:t>
-            </w:r>
-          </w:p>
-        </w:tc>
-        <w:tc>
-          <w:tcPr>
-            <w:tcW w:type="dxa" w:w="1242"/>
-          </w:tcPr>
-          <w:p>
-            <w:r>
-              <w:rPr>
-                <w:sz w:val="17"/>
-              </w:rPr>
-              <w:t>لم يبدأ</w:t>
-            </w:r>
-          </w:p>
-        </w:tc>
-      </w:tr>
-      <w:tr>
-        <w:tc>
-          <w:tcPr>
-            <w:tcW w:type="dxa" w:w="1242"/>
-            <w:shd w:fill="F8F6F0"/>
-          </w:tcPr>
-          <w:p>
-            <w:r>
-              <w:rPr>
-                <w:sz w:val="17"/>
-              </w:rPr>
-              <w:t>٦</w:t>
-            </w:r>
-          </w:p>
-        </w:tc>
-        <w:tc>
-          <w:tcPr>
-            <w:tcW w:type="dxa" w:w="1242"/>
-            <w:shd w:fill="F8F6F0"/>
-          </w:tcPr>
-          <w:p>
-            <w:r>
-              <w:rPr>
-                <w:sz w:val="17"/>
-              </w:rPr>
-              <w:t>الدراسات واستطلاعات الرأي</w:t>
-            </w:r>
-          </w:p>
-        </w:tc>
-        <w:tc>
-          <w:tcPr>
-            <w:tcW w:type="dxa" w:w="1242"/>
-            <w:shd w:fill="F8F6F0"/>
-          </w:tcPr>
-          <w:p>
-            <w:r>
-              <w:rPr>
-                <w:sz w:val="17"/>
-              </w:rPr>
-              <w:t>عدد الدراسات</w:t>
-            </w:r>
-          </w:p>
-        </w:tc>
-        <w:tc>
-          <w:tcPr>
-            <w:tcW w:type="dxa" w:w="1242"/>
-            <w:shd w:fill="F8F6F0"/>
-          </w:tcPr>
-          <w:p>
-            <w:r>
-              <w:rPr>
-                <w:sz w:val="17"/>
-              </w:rPr>
-              <w:t>٦ دراسات</w:t>
-            </w:r>
-          </w:p>
-        </w:tc>
-        <w:tc>
-          <w:tcPr>
-            <w:tcW w:type="dxa" w:w="1242"/>
-            <w:shd w:fill="F8F6F0"/>
-          </w:tcPr>
-          <w:p>
-            <w:r>
-              <w:rPr>
-                <w:sz w:val="17"/>
-              </w:rPr>
-              <w:t>٣ دراسات</w:t>
-            </w:r>
-          </w:p>
-        </w:tc>
-        <w:tc>
-          <w:tcPr>
-            <w:tcW w:type="dxa" w:w="1242"/>
-            <w:shd w:fill="F8F6F0"/>
-          </w:tcPr>
-          <w:p>
-            <w:r>
-              <w:rPr>
-                <w:sz w:val="17"/>
-              </w:rPr>
-              <w:t>٠ دراسة</w:t>
             </w:r>
           </w:p>
         </w:tc>
@@ -1403,7 +963,7 @@
               <w:rPr>
                 <w:sz w:val="17"/>
               </w:rPr>
-              <w:t>٧</w:t>
+              <w:t>٣</w:t>
             </w:r>
           </w:p>
         </w:tc>
@@ -1416,7 +976,7 @@
               <w:rPr>
                 <w:sz w:val="17"/>
               </w:rPr>
-              <w:t>ساعات وقيمة التطوع</w:t>
+              <w:t>الدراسات واستطلاعات الرأي</w:t>
             </w:r>
           </w:p>
         </w:tc>
@@ -1429,7 +989,7 @@
               <w:rPr>
                 <w:sz w:val="17"/>
               </w:rPr>
-              <w:t>ساعات وقيمة التطوع</w:t>
+              <w:t>عدد الدراسات</w:t>
             </w:r>
           </w:p>
         </w:tc>
@@ -1442,7 +1002,7 @@
               <w:rPr>
                 <w:sz w:val="17"/>
               </w:rPr>
-              <w:t>٣,٠٠٠ س (٢٠٢ ألف)</w:t>
+              <w:t>٦ دراسات</w:t>
             </w:r>
           </w:p>
         </w:tc>
@@ -1455,7 +1015,7 @@
               <w:rPr>
                 <w:sz w:val="17"/>
               </w:rPr>
-              <w:t>١,٥٠٠ س (١٠١ ألف)</w:t>
+              <w:t>٣ دراسات</w:t>
             </w:r>
           </w:p>
         </w:tc>
@@ -1468,7 +1028,7 @@
               <w:rPr>
                 <w:sz w:val="17"/>
               </w:rPr>
-              <w:t>٤ فرص تطوعية</w:t>
+              <w:t>٠ دراسة</w:t>
             </w:r>
           </w:p>
         </w:tc>
@@ -1481,7 +1041,7 @@
               <w:rPr>
                 <w:sz w:val="17"/>
               </w:rPr>
-              <w:t>غير مدققة</w:t>
+              <w:t>٠.٠٠٪</w:t>
             </w:r>
           </w:p>
         </w:tc>
@@ -1494,7 +1054,7 @@
               <w:rPr>
                 <w:sz w:val="17"/>
               </w:rPr>
-              <w:t>متعثر</w:t>
+              <w:t>لم يبدأ</w:t>
             </w:r>
           </w:p>
         </w:tc>
@@ -1510,7 +1070,7 @@
               <w:rPr>
                 <w:sz w:val="17"/>
               </w:rPr>
-              <w:t>٨</w:t>
+              <w:t>٤</w:t>
             </w:r>
           </w:p>
         </w:tc>
@@ -1524,7 +1084,7 @@
               <w:rPr>
                 <w:sz w:val="17"/>
               </w:rPr>
-              <w:t>تفعيل محفظة البرامج</w:t>
+              <w:t>ساعات وقيمة التطوع</w:t>
             </w:r>
           </w:p>
         </w:tc>
@@ -1538,7 +1098,7 @@
               <w:rPr>
                 <w:sz w:val="17"/>
               </w:rPr>
-              <w:t>عدد البرامج النشطة</w:t>
+              <w:t>ساعات وقيمة التطوع</w:t>
             </w:r>
           </w:p>
         </w:tc>
@@ -1552,7 +1112,7 @@
               <w:rPr>
                 <w:sz w:val="17"/>
               </w:rPr>
-              <w:t>١٠ برامج</w:t>
+              <w:t>٣,٠٠٠ س (٢٠٢ ألف)</w:t>
             </w:r>
           </w:p>
         </w:tc>
@@ -1566,7 +1126,7 @@
               <w:rPr>
                 <w:sz w:val="17"/>
               </w:rPr>
-              <w:t>١٠ برامج</w:t>
+              <w:t>١,٥٠٠ س (١٠١ ألف)</w:t>
             </w:r>
           </w:p>
         </w:tc>
@@ -1580,7 +1140,7 @@
               <w:rPr>
                 <w:sz w:val="17"/>
               </w:rPr>
-              <w:t>برنامج واحد فقط</w:t>
+              <w:t>٤ فرص تطوعية</w:t>
             </w:r>
           </w:p>
         </w:tc>
@@ -1594,7 +1154,7 @@
               <w:rPr>
                 <w:sz w:val="17"/>
               </w:rPr>
-              <w:t>١٠.٠٠٪</w:t>
+              <w:t>غير مدققة</w:t>
             </w:r>
           </w:p>
         </w:tc>
@@ -1623,7 +1183,7 @@
               <w:rPr>
                 <w:sz w:val="17"/>
               </w:rPr>
-              <w:t>٩</w:t>
+              <w:t>٥</w:t>
             </w:r>
           </w:p>
         </w:tc>
@@ -1730,7 +1290,7 @@
               <w:rPr>
                 <w:sz w:val="17"/>
               </w:rPr>
-              <w:t>١٠</w:t>
+              <w:t>٦</w:t>
             </w:r>
           </w:p>
         </w:tc>
@@ -1843,7 +1403,7 @@
               <w:rPr>
                 <w:sz w:val="17"/>
               </w:rPr>
-              <w:t>١١</w:t>
+              <w:t>٧</w:t>
             </w:r>
           </w:p>
         </w:tc>
@@ -1950,7 +1510,7 @@
               <w:rPr>
                 <w:sz w:val="17"/>
               </w:rPr>
-              <w:t>١٢</w:t>
+              <w:t>٨</w:t>
             </w:r>
           </w:p>
         </w:tc>
@@ -2063,7 +1623,7 @@
               <w:rPr>
                 <w:sz w:val="17"/>
               </w:rPr>
-              <w:t>١٣</w:t>
+              <w:t>٩</w:t>
             </w:r>
           </w:p>
         </w:tc>
@@ -2115,7 +1675,7 @@
               <w:rPr>
                 <w:sz w:val="17"/>
               </w:rPr>
-              <w:t>٥٠٪</w:t>
+              <w:t>بدء الملف</w:t>
             </w:r>
           </w:p>
         </w:tc>
@@ -2128,7 +1688,7 @@
               <w:rPr>
                 <w:sz w:val="17"/>
               </w:rPr>
-              <w:t>طلب استشاري</w:t>
+              <w:t>قيد الاستعانة باستشاري</w:t>
             </w:r>
           </w:p>
         </w:tc>
@@ -2141,7 +1701,7 @@
               <w:rPr>
                 <w:sz w:val="17"/>
               </w:rPr>
-              <w:t>٢٥.٠٠٪</w:t>
+              <w:t>جاري العمل</w:t>
             </w:r>
           </w:p>
         </w:tc>
@@ -2154,7 +1714,7 @@
               <w:rPr>
                 <w:sz w:val="17"/>
               </w:rPr>
-              <w:t>متأخر</w:t>
+              <w:t>قيد التنفيذ</w:t>
             </w:r>
           </w:p>
         </w:tc>
@@ -2170,7 +1730,7 @@
               <w:rPr>
                 <w:sz w:val="17"/>
               </w:rPr>
-              <w:t>١٤</w:t>
+              <w:t>١٠</w:t>
             </w:r>
           </w:p>
         </w:tc>

</xml_diff>

<commit_message>
Update تنويع مصادر الدخل الذاتي to 100% across all deliverables and fix PPTX Slide 4 table layout
</commit_message>
<xml_diff>
--- a/التقرير_الاحترافي_المطور/تقرير_جمعية_طبيبي_النصف_سنوي_٢٠٢٦_النسخة_التنفيذية.docx
+++ b/التقرير_الاحترافي_المطور/تقرير_جمعية_طبيبي_النصف_سنوي_٢٠٢٦_النسخة_التنفيذية.docx
@@ -1814,7 +1814,7 @@
               <w:rPr>
                 <w:sz w:val="17"/>
               </w:rPr>
-              <w:t>٦٦.٦٧٪</w:t>
+              <w:t>١٠٠.٠٠٪</w:t>
             </w:r>
           </w:p>
         </w:tc>
@@ -1828,7 +1828,7 @@
               <w:rPr>
                 <w:sz w:val="17"/>
               </w:rPr>
-              <w:t>قيد التنفيذ</w:t>
+              <w:t>مكتمل</w:t>
             </w:r>
           </w:p>
         </w:tc>

</xml_diff>

<commit_message>
Update معايير الحوكمة ومنصة نوى to 70% achievement rate and recalculate overall BSC score to 52.12%
</commit_message>
<xml_diff>
--- a/التقرير_الاحترافي_المطور/تقرير_جمعية_طبيبي_النصف_سنوي_٢٠٢٦_النسخة_التنفيذية.docx
+++ b/التقرير_الاحترافي_المطور/تقرير_جمعية_طبيبي_النصف_سنوي_٢٠٢٦_النسخة_التنفيذية.docx
@@ -1675,7 +1675,7 @@
               <w:rPr>
                 <w:sz w:val="17"/>
               </w:rPr>
-              <w:t>بدء الملف</w:t>
+              <w:t>٥٠٪</w:t>
             </w:r>
           </w:p>
         </w:tc>
@@ -1688,7 +1688,7 @@
               <w:rPr>
                 <w:sz w:val="17"/>
               </w:rPr>
-              <w:t>قيد الاستعانة باستشاري</w:t>
+              <w:t>استيفاء ٧٠٪ من المعايير</w:t>
             </w:r>
           </w:p>
         </w:tc>
@@ -1701,7 +1701,7 @@
               <w:rPr>
                 <w:sz w:val="17"/>
               </w:rPr>
-              <w:t>جاري العمل</w:t>
+              <w:t>٧٠.٠٠٪</w:t>
             </w:r>
           </w:p>
         </w:tc>
@@ -1714,7 +1714,7 @@
               <w:rPr>
                 <w:sz w:val="17"/>
               </w:rPr>
-              <w:t>قيد التنفيذ</w:t>
+              <w:t>متقدم ومتميز</w:t>
             </w:r>
           </w:p>
         </w:tc>

</xml_diff>

<commit_message>
Update all remaining mentions of beneficiaries target from 36,606 to 200 (100 H1) across dashboard, word, pptx, and web slides
</commit_message>
<xml_diff>
--- a/التقرير_الاحترافي_المطور/تقرير_جمعية_طبيبي_النصف_سنوي_٢٠٢٦_النسخة_التنفيذية.docx
+++ b/التقرير_الاحترافي_المطور/تقرير_جمعية_طبيبي_النصف_سنوي_٢٠٢٦_النسخة_التنفيذية.docx
@@ -584,7 +584,7 @@
           <w:color w:val="6B1D3A"/>
           <w:sz w:val="34"/>
         </w:rPr>
-        <w:t>ثالثاً: مصفوفة مطابقة الخطة الاستراتيجية بالمنجز الفعلي (١٤ مؤشراً معتمداً)</w:t>
+        <w:t>ثالثاً: مصفوفة مطابقة الخطة الاستراتيجية بالمنجز الفعلي (المصفوفة الاستراتيجية المعتمدة)</w:t>
       </w:r>
     </w:p>
     <w:tbl>
@@ -864,7 +864,7 @@
               <w:rPr>
                 <w:sz w:val="17"/>
               </w:rPr>
-              <w:t>الاستشارات الطبية والدوائية</w:t>
+              <w:t>عدد المستفيدين المخدومين</w:t>
             </w:r>
           </w:p>
         </w:tc>
@@ -878,7 +878,7 @@
               <w:rPr>
                 <w:sz w:val="17"/>
               </w:rPr>
-              <w:t>عدد الاستشارات</w:t>
+              <w:t>عدد المستفيدين (فرد)</w:t>
             </w:r>
           </w:p>
         </w:tc>
@@ -892,7 +892,7 @@
               <w:rPr>
                 <w:sz w:val="17"/>
               </w:rPr>
-              <w:t>١,٢٠٠</w:t>
+              <w:t>٢٠٠ مستفيد</w:t>
             </w:r>
           </w:p>
         </w:tc>
@@ -906,7 +906,7 @@
               <w:rPr>
                 <w:sz w:val="17"/>
               </w:rPr>
-              <w:t>٦٠٠</w:t>
+              <w:t>١٠٠ مستفيد</w:t>
             </w:r>
           </w:p>
         </w:tc>
@@ -920,7 +920,7 @@
               <w:rPr>
                 <w:sz w:val="17"/>
               </w:rPr>
-              <w:t>٠ استشارة</w:t>
+              <w:t>٧ مستفيدين</w:t>
             </w:r>
           </w:p>
         </w:tc>
@@ -934,7 +934,7 @@
               <w:rPr>
                 <w:sz w:val="17"/>
               </w:rPr>
-              <w:t>٠.٠٠٪</w:t>
+              <w:t>٧.٠٠٪</w:t>
             </w:r>
           </w:p>
         </w:tc>
@@ -948,7 +948,7 @@
               <w:rPr>
                 <w:sz w:val="17"/>
               </w:rPr>
-              <w:t>لم يبدأ</w:t>
+              <w:t>متأخر</w:t>
             </w:r>
           </w:p>
         </w:tc>
@@ -976,7 +976,7 @@
               <w:rPr>
                 <w:sz w:val="17"/>
               </w:rPr>
-              <w:t>الدراسات واستطلاعات الرأي</w:t>
+              <w:t>الاستشارات الطبية والدوائية</w:t>
             </w:r>
           </w:p>
         </w:tc>
@@ -989,7 +989,7 @@
               <w:rPr>
                 <w:sz w:val="17"/>
               </w:rPr>
-              <w:t>عدد الدراسات</w:t>
+              <w:t>عدد الاستشارات</w:t>
             </w:r>
           </w:p>
         </w:tc>
@@ -1002,7 +1002,7 @@
               <w:rPr>
                 <w:sz w:val="17"/>
               </w:rPr>
-              <w:t>٦ دراسات</w:t>
+              <w:t>١,٢٠٠</w:t>
             </w:r>
           </w:p>
         </w:tc>
@@ -1015,7 +1015,7 @@
               <w:rPr>
                 <w:sz w:val="17"/>
               </w:rPr>
-              <w:t>٣ دراسات</w:t>
+              <w:t>٦٠٠</w:t>
             </w:r>
           </w:p>
         </w:tc>
@@ -1028,7 +1028,7 @@
               <w:rPr>
                 <w:sz w:val="17"/>
               </w:rPr>
-              <w:t>٠ دراسة</w:t>
+              <w:t>٠ استشارة</w:t>
             </w:r>
           </w:p>
         </w:tc>
@@ -1084,7 +1084,7 @@
               <w:rPr>
                 <w:sz w:val="17"/>
               </w:rPr>
-              <w:t>ساعات وقيمة التطوع</w:t>
+              <w:t>الدراسات واستطلاعات الرأي</w:t>
             </w:r>
           </w:p>
         </w:tc>
@@ -1098,7 +1098,7 @@
               <w:rPr>
                 <w:sz w:val="17"/>
               </w:rPr>
-              <w:t>ساعات وقيمة التطوع</w:t>
+              <w:t>عدد الدراسات</w:t>
             </w:r>
           </w:p>
         </w:tc>
@@ -1112,7 +1112,7 @@
               <w:rPr>
                 <w:sz w:val="17"/>
               </w:rPr>
-              <w:t>٣,٠٠٠ س (٢٠٢ ألف)</w:t>
+              <w:t>٦ دراسات</w:t>
             </w:r>
           </w:p>
         </w:tc>
@@ -1126,7 +1126,7 @@
               <w:rPr>
                 <w:sz w:val="17"/>
               </w:rPr>
-              <w:t>١,٥٠٠ س (١٠١ ألف)</w:t>
+              <w:t>٣ دراسات</w:t>
             </w:r>
           </w:p>
         </w:tc>
@@ -1140,7 +1140,7 @@
               <w:rPr>
                 <w:sz w:val="17"/>
               </w:rPr>
-              <w:t>٤ فرص تطوعية</w:t>
+              <w:t>٠ دراسة</w:t>
             </w:r>
           </w:p>
         </w:tc>
@@ -1154,7 +1154,7 @@
               <w:rPr>
                 <w:sz w:val="17"/>
               </w:rPr>
-              <w:t>غير مدققة</w:t>
+              <w:t>٠.٠٠٪</w:t>
             </w:r>
           </w:p>
         </w:tc>
@@ -1168,7 +1168,7 @@
               <w:rPr>
                 <w:sz w:val="17"/>
               </w:rPr>
-              <w:t>متعثر</w:t>
+              <w:t>لم يبدأ</w:t>
             </w:r>
           </w:p>
         </w:tc>
@@ -1196,7 +1196,7 @@
               <w:rPr>
                 <w:sz w:val="17"/>
               </w:rPr>
-              <w:t>عقد الشراكات الصحية</w:t>
+              <w:t>ساعات وقيمة التطوع</w:t>
             </w:r>
           </w:p>
         </w:tc>
@@ -1209,7 +1209,7 @@
               <w:rPr>
                 <w:sz w:val="17"/>
               </w:rPr>
-              <w:t>عدد الشراكات</w:t>
+              <w:t>ساعات وقيمة التطوع</w:t>
             </w:r>
           </w:p>
         </w:tc>
@@ -1222,7 +1222,7 @@
               <w:rPr>
                 <w:sz w:val="17"/>
               </w:rPr>
-              <w:t>٩ شراكات</w:t>
+              <w:t>٣,٠٠٠ س (٢٠٢ ألف)</w:t>
             </w:r>
           </w:p>
         </w:tc>
@@ -1235,7 +1235,7 @@
               <w:rPr>
                 <w:sz w:val="17"/>
               </w:rPr>
-              <w:t>٩ شراكات</w:t>
+              <w:t>١,٥٠٠ س (١٠١ ألف)</w:t>
             </w:r>
           </w:p>
         </w:tc>
@@ -1248,7 +1248,7 @@
               <w:rPr>
                 <w:sz w:val="17"/>
               </w:rPr>
-              <w:t>٩ شراكات مفعلة</w:t>
+              <w:t>٤ فرص تطوعية</w:t>
             </w:r>
           </w:p>
         </w:tc>
@@ -1261,7 +1261,7 @@
               <w:rPr>
                 <w:sz w:val="17"/>
               </w:rPr>
-              <w:t>١٠٠.٠٠٪</w:t>
+              <w:t>غير مدققة</w:t>
             </w:r>
           </w:p>
         </w:tc>
@@ -1274,7 +1274,7 @@
               <w:rPr>
                 <w:sz w:val="17"/>
               </w:rPr>
-              <w:t>مكتمل</w:t>
+              <w:t>متعثر</w:t>
             </w:r>
           </w:p>
         </w:tc>
@@ -1304,7 +1304,7 @@
               <w:rPr>
                 <w:sz w:val="17"/>
               </w:rPr>
-              <w:t>توطين الوظائف والكادر</w:t>
+              <w:t>عقد الشراكات الصحية</w:t>
             </w:r>
           </w:p>
         </w:tc>
@@ -1318,7 +1318,7 @@
               <w:rPr>
                 <w:sz w:val="17"/>
               </w:rPr>
-              <w:t>نسبة التوطين (٪)</w:t>
+              <w:t>عدد الشراكات</w:t>
             </w:r>
           </w:p>
         </w:tc>
@@ -1332,7 +1332,7 @@
               <w:rPr>
                 <w:sz w:val="17"/>
               </w:rPr>
-              <w:t>١٠٠٪</w:t>
+              <w:t>٩ شراكات</w:t>
             </w:r>
           </w:p>
         </w:tc>
@@ -1346,7 +1346,7 @@
               <w:rPr>
                 <w:sz w:val="17"/>
               </w:rPr>
-              <w:t>١٠٠٪</w:t>
+              <w:t>٩ شراكات</w:t>
             </w:r>
           </w:p>
         </w:tc>
@@ -1360,7 +1360,7 @@
               <w:rPr>
                 <w:sz w:val="17"/>
               </w:rPr>
-              <w:t>١٠٠٪ (٣ موظفين)</w:t>
+              <w:t>٩ شراكات مفعلة</w:t>
             </w:r>
           </w:p>
         </w:tc>
@@ -1416,7 +1416,7 @@
               <w:rPr>
                 <w:sz w:val="17"/>
               </w:rPr>
-              <w:t>تدريب وتأهيل الكادر</w:t>
+              <w:t>توطين الوظائف والكادر</w:t>
             </w:r>
           </w:p>
         </w:tc>
@@ -1429,7 +1429,7 @@
               <w:rPr>
                 <w:sz w:val="17"/>
               </w:rPr>
-              <w:t>عدد الدورات</w:t>
+              <w:t>نسبة التوطين (٪)</w:t>
             </w:r>
           </w:p>
         </w:tc>
@@ -1442,7 +1442,7 @@
               <w:rPr>
                 <w:sz w:val="17"/>
               </w:rPr>
-              <w:t>٤ دورات</w:t>
+              <w:t>١٠٠٪</w:t>
             </w:r>
           </w:p>
         </w:tc>
@@ -1455,7 +1455,7 @@
               <w:rPr>
                 <w:sz w:val="17"/>
               </w:rPr>
-              <w:t>٢ دورة</w:t>
+              <w:t>١٠٠٪</w:t>
             </w:r>
           </w:p>
         </w:tc>
@@ -1468,7 +1468,7 @@
               <w:rPr>
                 <w:sz w:val="17"/>
               </w:rPr>
-              <w:t>٨ دورات</w:t>
+              <w:t>١٠٠٪ (٣ موظفين)</w:t>
             </w:r>
           </w:p>
         </w:tc>
@@ -1481,7 +1481,7 @@
               <w:rPr>
                 <w:sz w:val="17"/>
               </w:rPr>
-              <w:t>٤٠٠.٠٠٪</w:t>
+              <w:t>١٠٠.٠٠٪</w:t>
             </w:r>
           </w:p>
         </w:tc>
@@ -1494,7 +1494,7 @@
               <w:rPr>
                 <w:sz w:val="17"/>
               </w:rPr>
-              <w:t>متقدم ومكتمل</w:t>
+              <w:t>مكتمل</w:t>
             </w:r>
           </w:p>
         </w:tc>
@@ -1524,7 +1524,7 @@
               <w:rPr>
                 <w:sz w:val="17"/>
               </w:rPr>
-              <w:t>التحول الرقمي والمحاسبي</w:t>
+              <w:t>تدريب وتأهيل الكادر</w:t>
             </w:r>
           </w:p>
         </w:tc>
@@ -1538,7 +1538,7 @@
               <w:rPr>
                 <w:sz w:val="17"/>
               </w:rPr>
-              <w:t>تطبيق نظام سحابي</w:t>
+              <w:t>عدد الدورات</w:t>
             </w:r>
           </w:p>
         </w:tc>
@@ -1552,7 +1552,7 @@
               <w:rPr>
                 <w:sz w:val="17"/>
               </w:rPr>
-              <w:t>نظام قيود</w:t>
+              <w:t>٤ دورات</w:t>
             </w:r>
           </w:p>
         </w:tc>
@@ -1566,7 +1566,7 @@
               <w:rPr>
                 <w:sz w:val="17"/>
               </w:rPr>
-              <w:t>نظام قيود</w:t>
+              <w:t>٢ دورة</w:t>
             </w:r>
           </w:p>
         </w:tc>
@@ -1580,7 +1580,7 @@
               <w:rPr>
                 <w:sz w:val="17"/>
               </w:rPr>
-              <w:t>تم تشغيل قيود</w:t>
+              <w:t>٨ دورات</w:t>
             </w:r>
           </w:p>
         </w:tc>
@@ -1594,7 +1594,7 @@
               <w:rPr>
                 <w:sz w:val="17"/>
               </w:rPr>
-              <w:t>١٠٠.٠٠٪</w:t>
+              <w:t>٤٠٠.٠٠٪</w:t>
             </w:r>
           </w:p>
         </w:tc>
@@ -1608,7 +1608,7 @@
               <w:rPr>
                 <w:sz w:val="17"/>
               </w:rPr>
-              <w:t>مكتمل</w:t>
+              <w:t>متقدم ومكتمل</w:t>
             </w:r>
           </w:p>
         </w:tc>
@@ -1636,7 +1636,7 @@
               <w:rPr>
                 <w:sz w:val="17"/>
               </w:rPr>
-              <w:t>معايير الحوكمة ومنصة نوى</w:t>
+              <w:t>التحول الرقمي والمحاسبي</w:t>
             </w:r>
           </w:p>
         </w:tc>
@@ -1649,7 +1649,7 @@
               <w:rPr>
                 <w:sz w:val="17"/>
               </w:rPr>
-              <w:t>نسبة الامتثال</w:t>
+              <w:t>تطبيق نظام سحابي</w:t>
             </w:r>
           </w:p>
         </w:tc>
@@ -1662,7 +1662,7 @@
               <w:rPr>
                 <w:sz w:val="17"/>
               </w:rPr>
-              <w:t>١٠٠٪</w:t>
+              <w:t>نظام قيود</w:t>
             </w:r>
           </w:p>
         </w:tc>
@@ -1675,7 +1675,7 @@
               <w:rPr>
                 <w:sz w:val="17"/>
               </w:rPr>
-              <w:t>٥٠٪</w:t>
+              <w:t>نظام قيود</w:t>
             </w:r>
           </w:p>
         </w:tc>
@@ -1688,7 +1688,7 @@
               <w:rPr>
                 <w:sz w:val="17"/>
               </w:rPr>
-              <w:t>استيفاء ٧٠٪ من المعايير</w:t>
+              <w:t>تم تشغيل قيود</w:t>
             </w:r>
           </w:p>
         </w:tc>
@@ -1701,7 +1701,7 @@
               <w:rPr>
                 <w:sz w:val="17"/>
               </w:rPr>
-              <w:t>٧٠.٠٠٪</w:t>
+              <w:t>١٠٠.٠٠٪</w:t>
             </w:r>
           </w:p>
         </w:tc>
@@ -1714,7 +1714,7 @@
               <w:rPr>
                 <w:sz w:val="17"/>
               </w:rPr>
-              <w:t>متقدم ومتميز</w:t>
+              <w:t>مكتمل</w:t>
             </w:r>
           </w:p>
         </w:tc>
@@ -1744,7 +1744,7 @@
               <w:rPr>
                 <w:sz w:val="17"/>
               </w:rPr>
-              <w:t>تنويع مصادر الدخل الذاتي</w:t>
+              <w:t>معايير الحوكمة ومنصة نوى</w:t>
             </w:r>
           </w:p>
         </w:tc>
@@ -1758,7 +1758,7 @@
               <w:rPr>
                 <w:sz w:val="17"/>
               </w:rPr>
-              <w:t>عدد مصادر الدخل</w:t>
+              <w:t>نسبة الامتثال</w:t>
             </w:r>
           </w:p>
         </w:tc>
@@ -1772,7 +1772,7 @@
               <w:rPr>
                 <w:sz w:val="17"/>
               </w:rPr>
-              <w:t>٦ مصادر</w:t>
+              <w:t>١٠٠٪</w:t>
             </w:r>
           </w:p>
         </w:tc>
@@ -1786,7 +1786,7 @@
               <w:rPr>
                 <w:sz w:val="17"/>
               </w:rPr>
-              <w:t>٦ مصادر</w:t>
+              <w:t>٥٠٪</w:t>
             </w:r>
           </w:p>
         </w:tc>
@@ -1800,7 +1800,7 @@
               <w:rPr>
                 <w:sz w:val="17"/>
               </w:rPr>
-              <w:t>٦ مصادر نشطة</w:t>
+              <w:t>استيفاء ٧٠٪ من المعايير</w:t>
             </w:r>
           </w:p>
         </w:tc>
@@ -1814,6 +1814,113 @@
               <w:rPr>
                 <w:sz w:val="17"/>
               </w:rPr>
+              <w:t>٧٠.٠٠٪</w:t>
+            </w:r>
+          </w:p>
+        </w:tc>
+        <w:tc>
+          <w:tcPr>
+            <w:tcW w:type="dxa" w:w="1242"/>
+            <w:shd w:fill="F8F6F0"/>
+          </w:tcPr>
+          <w:p>
+            <w:r>
+              <w:rPr>
+                <w:sz w:val="17"/>
+              </w:rPr>
+              <w:t>متقدم ومتميز</w:t>
+            </w:r>
+          </w:p>
+        </w:tc>
+      </w:tr>
+      <w:tr>
+        <w:tc>
+          <w:tcPr>
+            <w:tcW w:type="dxa" w:w="1242"/>
+          </w:tcPr>
+          <w:p>
+            <w:r>
+              <w:rPr>
+                <w:sz w:val="17"/>
+              </w:rPr>
+              <w:t>١١</w:t>
+            </w:r>
+          </w:p>
+        </w:tc>
+        <w:tc>
+          <w:tcPr>
+            <w:tcW w:type="dxa" w:w="1242"/>
+          </w:tcPr>
+          <w:p>
+            <w:r>
+              <w:rPr>
+                <w:sz w:val="17"/>
+              </w:rPr>
+              <w:t>تنويع مصادر الدخل الذاتي</w:t>
+            </w:r>
+          </w:p>
+        </w:tc>
+        <w:tc>
+          <w:tcPr>
+            <w:tcW w:type="dxa" w:w="1242"/>
+          </w:tcPr>
+          <w:p>
+            <w:r>
+              <w:rPr>
+                <w:sz w:val="17"/>
+              </w:rPr>
+              <w:t>عدد مصادر الدخل</w:t>
+            </w:r>
+          </w:p>
+        </w:tc>
+        <w:tc>
+          <w:tcPr>
+            <w:tcW w:type="dxa" w:w="1242"/>
+          </w:tcPr>
+          <w:p>
+            <w:r>
+              <w:rPr>
+                <w:sz w:val="17"/>
+              </w:rPr>
+              <w:t>٦ مصادر</w:t>
+            </w:r>
+          </w:p>
+        </w:tc>
+        <w:tc>
+          <w:tcPr>
+            <w:tcW w:type="dxa" w:w="1242"/>
+          </w:tcPr>
+          <w:p>
+            <w:r>
+              <w:rPr>
+                <w:sz w:val="17"/>
+              </w:rPr>
+              <w:t>٦ مصادر</w:t>
+            </w:r>
+          </w:p>
+        </w:tc>
+        <w:tc>
+          <w:tcPr>
+            <w:tcW w:type="dxa" w:w="1242"/>
+          </w:tcPr>
+          <w:p>
+            <w:r>
+              <w:rPr>
+                <w:sz w:val="17"/>
+              </w:rPr>
+              <w:t>٦ مصادر نشطة</w:t>
+            </w:r>
+          </w:p>
+        </w:tc>
+        <w:tc>
+          <w:tcPr>
+            <w:tcW w:type="dxa" w:w="1242"/>
+          </w:tcPr>
+          <w:p>
+            <w:r>
+              <w:rPr>
+                <w:sz w:val="17"/>
+              </w:rPr>
               <w:t>١٠٠.٠٠٪</w:t>
             </w:r>
           </w:p>
@@ -1821,7 +1928,6 @@
         <w:tc>
           <w:tcPr>
             <w:tcW w:type="dxa" w:w="1242"/>
-            <w:shd w:fill="F8F6F0"/>
           </w:tcPr>
           <w:p>
             <w:r>

</xml_diff>